<commit_message>
docs: organize referrals around the complete coordination workflow
Signed-off-by: Everett Williams <everett@medplum.com>
</commit_message>
<xml_diff>
--- a/packages/docs/static/decision-guides/referrals.docx
+++ b/packages/docs/static/decision-guides/referrals.docx
@@ -11,18 +11,18 @@
           <wp:inline>
             <wp:extent cx="5943600" cy="1289649"/>
             <wp:effectExtent b="0" l="0" r="0" t="0"/>
-            <wp:docPr descr="Medplum" title="" id="21" name="Picture"/>
+            <wp:docPr descr="Medplum" title="" id="10" name="Picture"/>
             <a:graphic>
               <a:graphicData uri="http://schemas.openxmlformats.org/drawingml/2006/picture">
                 <pic:pic>
                   <pic:nvPicPr>
-                    <pic:cNvPr descr="medplum-wordmark-grape.png" id="22" name="Picture"/>
+                    <pic:cNvPr descr="medplum-wordmark-grape.png" id="11" name="Picture"/>
                     <pic:cNvPicPr>
                       <a:picLocks noChangeArrowheads="1" noChangeAspect="1"/>
                     </pic:cNvPicPr>
                   </pic:nvPicPr>
                   <pic:blipFill>
-                    <a:blip r:embed="rId20"/>
+                    <a:blip r:embed="rId9"/>
                     <a:stretch>
                       <a:fillRect/>
                     </a:stretch>
@@ -49,7 +49,7 @@
         </w:drawing>
       </w:r>
     </w:p>
-    <w:bookmarkStart w:id="41" w:name="referrals-decision-guide"/>
+    <w:bookmarkStart w:id="39" w:name="referrals-decision-guide"/>
     <w:p>
       <w:pPr>
         <w:pStyle w:val="Heading1"/>
@@ -64,44 +64,52 @@
       </w:pPr>
       <w:r>
         <w:rPr>
+          <w:i/>
           <w:iCs/>
-          <w:i/>
         </w:rPr>
         <w:t xml:space="preserve">Companion to the</w:t>
       </w:r>
       <w:r>
         <w:rPr>
+          <w:i/>
           <w:iCs/>
-          <w:i/>
         </w:rPr>
         <w:t xml:space="preserve"> </w:t>
       </w:r>
-      <w:hyperlink r:id="rId23">
+      <w:hyperlink r:id="rId12">
         <w:r>
           <w:rPr>
             <w:rStyle w:val="Hyperlink"/>
+            <w:i/>
             <w:iCs/>
-            <w:i/>
           </w:rPr>
-          <w:t xml:space="preserve">Referral Management</w:t>
+          <w:t xml:space="preserve">Referrals</w:t>
         </w:r>
       </w:hyperlink>
       <w:r>
         <w:rPr>
+          <w:i/>
           <w:iCs/>
-          <w:i/>
         </w:rPr>
         <w:t xml:space="preserve"> </w:t>
       </w:r>
       <w:r>
         <w:rPr>
+          <w:i/>
           <w:iCs/>
-          <w:i/>
         </w:rPr>
         <w:t xml:space="preserve">docs.</w:t>
       </w:r>
     </w:p>
-    <w:bookmarkStart w:id="24" w:name="section-1-use-case-participants"/>
+    <w:p>
+      <w:pPr>
+        <w:pStyle w:val="BodyText"/>
+      </w:pPr>
+      <w:r>
+        <w:t xml:space="preserve">A referral needs more than a send button. Use this guide with your clinical and operations teams to decide who owns each step, what the receiving team needs, and how you will know the loop is closed.</w:t>
+      </w:r>
+    </w:p>
+    <w:bookmarkStart w:id="13" w:name="section-1-use-case-participants"/>
     <w:p>
       <w:pPr>
         <w:pStyle w:val="Heading2"/>
@@ -116,43 +124,43 @@
       </w:pPr>
       <w:r>
         <w:rPr>
+          <w:b/>
           <w:bCs/>
-          <w:b/>
         </w:rPr>
         <w:t xml:space="preserve">1.1 Which side(s) of the referral lifecycle do you build for?</w:t>
       </w:r>
     </w:p>
     <w:p>
       <w:pPr>
+        <w:pStyle w:val="Compact"/>
         <w:numPr>
           <w:ilvl w:val="0"/>
           <w:numId w:val="1001"/>
         </w:numPr>
+      </w:pPr>
+      <w:r>
+        <w:t xml:space="preserve">Outbound only – you originate referrals to others</w:t>
+      </w:r>
+    </w:p>
+    <w:p>
+      <w:pPr>
         <w:pStyle w:val="Compact"/>
-      </w:pPr>
-      <w:r>
-        <w:t xml:space="preserve">Outbound only – you originate referrals to others</w:t>
-      </w:r>
-    </w:p>
-    <w:p>
-      <w:pPr>
         <w:numPr>
           <w:ilvl w:val="0"/>
           <w:numId w:val="1001"/>
         </w:numPr>
+      </w:pPr>
+      <w:r>
+        <w:t xml:space="preserve">Inbound only – you receive referrals from others</w:t>
+      </w:r>
+    </w:p>
+    <w:p>
+      <w:pPr>
         <w:pStyle w:val="Compact"/>
-      </w:pPr>
-      <w:r>
-        <w:t xml:space="preserve">Inbound only – you receive referrals from others</w:t>
-      </w:r>
-    </w:p>
-    <w:p>
-      <w:pPr>
         <w:numPr>
           <w:ilvl w:val="0"/>
           <w:numId w:val="1001"/>
         </w:numPr>
-        <w:pStyle w:val="Compact"/>
       </w:pPr>
       <w:r>
         <w:t xml:space="preserve">Both</w:t>
@@ -164,8 +172,8 @@
       </w:pPr>
       <w:r>
         <w:rPr>
+          <w:i/>
           <w:iCs/>
-          <w:i/>
         </w:rPr>
         <w:t xml:space="preserve">Why: determines which Section 3 deep dives apply.</w:t>
       </w:r>
@@ -176,43 +184,43 @@
       </w:pPr>
       <w:r>
         <w:rPr>
+          <w:b/>
           <w:bCs/>
-          <w:b/>
         </w:rPr>
         <w:t xml:space="preserve">1.2 Who interacts with referrals, and is the patient part of the workflow?</w:t>
       </w:r>
     </w:p>
     <w:p>
       <w:pPr>
+        <w:pStyle w:val="Compact"/>
         <w:numPr>
           <w:ilvl w:val="0"/>
           <w:numId w:val="1002"/>
         </w:numPr>
+      </w:pPr>
+      <w:r>
+        <w:t xml:space="preserve">Sending side: which roles author, edit, and send referrals (clinicians, MAs, coordinators, intake staff)?</w:t>
+      </w:r>
+    </w:p>
+    <w:p>
+      <w:pPr>
         <w:pStyle w:val="Compact"/>
-      </w:pPr>
-      <w:r>
-        <w:t xml:space="preserve">Sending side: which roles author, edit, and send referrals (clinicians, MAs, coordinators, intake staff)?</w:t>
-      </w:r>
-    </w:p>
-    <w:p>
-      <w:pPr>
         <w:numPr>
           <w:ilvl w:val="0"/>
           <w:numId w:val="1002"/>
         </w:numPr>
+      </w:pPr>
+      <w:r>
+        <w:t xml:space="preserve">Receiving side: which roles triage, accept, and work referrals on intake?</w:t>
+      </w:r>
+    </w:p>
+    <w:p>
+      <w:pPr>
         <w:pStyle w:val="Compact"/>
-      </w:pPr>
-      <w:r>
-        <w:t xml:space="preserve">Receiving side: which roles triage, accept, and work referrals on intake?</w:t>
-      </w:r>
-    </w:p>
-    <w:p>
-      <w:pPr>
         <w:numPr>
           <w:ilvl w:val="0"/>
           <w:numId w:val="1002"/>
         </w:numPr>
-        <w:pStyle w:val="Compact"/>
       </w:pPr>
       <w:r>
         <w:t xml:space="preserve">Patient: do patients see referrals, get notified, or take action (e.g. view in portal, self-schedule, decline)?</w:t>
@@ -224,8 +232,8 @@
       </w:pPr>
       <w:r>
         <w:rPr>
+          <w:i/>
           <w:iCs/>
-          <w:i/>
         </w:rPr>
         <w:t xml:space="preserve">Why: drives how forms are designed (3.2), who notes are written for (3.4), who owns the work (3.7), and whether patient-facing content is in scope.</w:t>
       </w:r>
@@ -236,55 +244,55 @@
       </w:pPr>
       <w:r>
         <w:rPr>
+          <w:b/>
           <w:bCs/>
-          <w:b/>
         </w:rPr>
         <w:t xml:space="preserve">1.3 Where do receiving providers live relative to your tenant?</w:t>
       </w:r>
     </w:p>
     <w:p>
       <w:pPr>
+        <w:pStyle w:val="Compact"/>
         <w:numPr>
           <w:ilvl w:val="0"/>
           <w:numId w:val="1003"/>
         </w:numPr>
+      </w:pPr>
+      <w:r>
+        <w:t xml:space="preserve">Inside your tenant only</w:t>
+      </w:r>
+    </w:p>
+    <w:p>
+      <w:pPr>
         <w:pStyle w:val="Compact"/>
-      </w:pPr>
-      <w:r>
-        <w:t xml:space="preserve">Inside your tenant only</w:t>
-      </w:r>
-    </w:p>
-    <w:p>
-      <w:pPr>
         <w:numPr>
           <w:ilvl w:val="0"/>
           <w:numId w:val="1003"/>
         </w:numPr>
+      </w:pPr>
+      <w:r>
+        <w:t xml:space="preserve">Partner tenants or organizations</w:t>
+      </w:r>
+    </w:p>
+    <w:p>
+      <w:pPr>
         <w:pStyle w:val="Compact"/>
-      </w:pPr>
-      <w:r>
-        <w:t xml:space="preserve">Partner tenants or organizations</w:t>
-      </w:r>
-    </w:p>
-    <w:p>
-      <w:pPr>
         <w:numPr>
           <w:ilvl w:val="0"/>
           <w:numId w:val="1003"/>
         </w:numPr>
+      </w:pPr>
+      <w:r>
+        <w:t xml:space="preserve">External organizations without FHIR connectivity</w:t>
+      </w:r>
+    </w:p>
+    <w:p>
+      <w:pPr>
         <w:pStyle w:val="Compact"/>
-      </w:pPr>
-      <w:r>
-        <w:t xml:space="preserve">External organizations without FHIR connectivity</w:t>
-      </w:r>
-    </w:p>
-    <w:p>
-      <w:pPr>
         <w:numPr>
           <w:ilvl w:val="0"/>
           <w:numId w:val="1003"/>
         </w:numPr>
-        <w:pStyle w:val="Compact"/>
       </w:pPr>
       <w:r>
         <w:t xml:space="preserve">Some combination</w:t>
@@ -296,8 +304,8 @@
       </w:pPr>
       <w:r>
         <w:rPr>
+          <w:i/>
           <w:iCs/>
-          <w:i/>
         </w:rPr>
         <w:t xml:space="preserve">Why: drives how recipients are stored and selected (3.3), and which outbound channels you support (3.5).</w:t>
       </w:r>
@@ -308,43 +316,43 @@
       </w:pPr>
       <w:r>
         <w:rPr>
+          <w:b/>
           <w:bCs/>
-          <w:b/>
         </w:rPr>
         <w:t xml:space="preserve">1.4 Is this a new build or replacing/extending something, and what other systems must it work with?</w:t>
       </w:r>
     </w:p>
     <w:p>
       <w:pPr>
+        <w:pStyle w:val="Compact"/>
         <w:numPr>
           <w:ilvl w:val="0"/>
           <w:numId w:val="1004"/>
         </w:numPr>
+      </w:pPr>
+      <w:r>
+        <w:t xml:space="preserve">If replacing: what system or workflow, and what gaps drove the change?</w:t>
+      </w:r>
+    </w:p>
+    <w:p>
+      <w:pPr>
         <w:pStyle w:val="Compact"/>
-      </w:pPr>
-      <w:r>
-        <w:t xml:space="preserve">If replacing: what system or workflow, and what gaps drove the change?</w:t>
-      </w:r>
-    </w:p>
-    <w:p>
-      <w:pPr>
         <w:numPr>
           <w:ilvl w:val="0"/>
           <w:numId w:val="1004"/>
         </w:numPr>
+      </w:pPr>
+      <w:r>
+        <w:t xml:space="preserve">If new: is referrals central to the product or additive?</w:t>
+      </w:r>
+    </w:p>
+    <w:p>
+      <w:pPr>
         <w:pStyle w:val="Compact"/>
-      </w:pPr>
-      <w:r>
-        <w:t xml:space="preserve">If new: is referrals central to the product or additive?</w:t>
-      </w:r>
-    </w:p>
-    <w:p>
-      <w:pPr>
         <w:numPr>
           <w:ilvl w:val="0"/>
           <w:numId w:val="1004"/>
         </w:numPr>
-        <w:pStyle w:val="Compact"/>
       </w:pPr>
       <w:r>
         <w:t xml:space="preserve">What other systems will referrals flow to or from (source EHR, downstream EHRs at receivers, billing, HIE, payer portals, include DirectMessage)?</w:t>
@@ -356,8 +364,8 @@
       </w:pPr>
       <w:r>
         <w:rPr>
+          <w:i/>
           <w:iCs/>
-          <w:i/>
         </w:rPr>
         <w:t xml:space="preserve">Why: surfaces migration needs and integration boundaries that affect outbound channels (3.5), inbound intake (3.6), and matching of patient and provider records across systems.</w:t>
       </w:r>
@@ -369,8 +377,8 @@
         </w:pict>
       </w:r>
     </w:p>
-    <w:bookmarkEnd w:id="24"/>
-    <w:bookmarkStart w:id="25" w:name="section-2-feature-scoping"/>
+    <w:bookmarkEnd w:id="13"/>
+    <w:bookmarkStart w:id="14" w:name="section-2-feature-scoping"/>
     <w:p>
       <w:pPr>
         <w:pStyle w:val="Heading2"/>
@@ -385,8 +393,8 @@
       </w:pPr>
       <w:r>
         <w:rPr>
+          <w:i/>
           <w:iCs/>
-          <w:i/>
         </w:rPr>
         <w:t xml:space="preserve">Go through each row together. For each cell under Yes / No / Nice-to-have / Not sure, mark the customer’s answer. The</w:t>
       </w:r>
@@ -395,8 +403,8 @@
       </w:r>
       <w:r>
         <w:rPr>
+          <w:b/>
           <w:bCs/>
-          <w:b/>
         </w:rPr>
         <w:t xml:space="preserve">§</w:t>
       </w:r>
@@ -405,8 +413,8 @@
       </w:r>
       <w:r>
         <w:rPr>
+          <w:i/>
           <w:iCs/>
-          <w:i/>
         </w:rPr>
         <w:t xml:space="preserve">column points to the deep-dive subsection that covers each feature.</w:t>
       </w:r>
@@ -415,9 +423,8 @@
       <w:tblPr>
         <w:tblStyle w:val="Table"/>
         <w:tblW w:w="9360" w:type="dxa"/>
+        <w:tblLayout w:type="fixed"/>
         <w:tblLook w:firstRow="1" w:lastRow="0" w:firstColumn="0" w:lastColumn="0" w:noHBand="0" w:noVBand="0" w:val="0020"/>
-        <w:jc w:val="start"/>
-        <w:tblLayout w:type="fixed"/>
       </w:tblPr>
       <w:tblGrid>
         <w:gridCol w:w="600"/>
@@ -431,7 +438,7 @@
       <w:tr>
         <w:trPr>
           <w:cantSplit/>
-          <w:tblHeader w:val="true"/>
+          <w:tblHeader w:val="on"/>
         </w:trPr>
         <w:tc>
           <w:tcPr/>
@@ -1402,8 +1409,8 @@
         </w:pict>
       </w:r>
     </w:p>
-    <w:bookmarkEnd w:id="25"/>
-    <w:bookmarkStart w:id="40" w:name="section-3-feature-deep-dives"/>
+    <w:bookmarkEnd w:id="14"/>
+    <w:bookmarkStart w:id="29" w:name="section-3-feature-deep-dives"/>
     <w:p>
       <w:pPr>
         <w:pStyle w:val="Heading2"/>
@@ -1418,8 +1425,8 @@
       </w:pPr>
       <w:r>
         <w:rPr>
+          <w:i/>
           <w:iCs/>
-          <w:i/>
         </w:rPr>
         <w:t xml:space="preserve">Cover each feature flagged Yes or Nice-to-have in Section 2. The goal is to land on a clear recommended approach by the end of each section.</w:t>
       </w:r>
@@ -1436,9 +1443,8 @@
       <w:tblPr>
         <w:tblStyle w:val="Table"/>
         <w:tblW w:w="9360" w:type="dxa"/>
+        <w:tblLayout w:type="fixed"/>
         <w:tblLook w:firstRow="1" w:lastRow="0" w:firstColumn="0" w:lastColumn="0" w:noHBand="0" w:noVBand="0" w:val="0020"/>
-        <w:jc w:val="start"/>
-        <w:tblLayout w:type="fixed"/>
       </w:tblPr>
       <w:tblGrid>
         <w:gridCol w:w="2949"/>
@@ -1448,7 +1454,7 @@
       <w:tr>
         <w:trPr>
           <w:cantSplit/>
-          <w:tblHeader w:val="true"/>
+          <w:tblHeader w:val="on"/>
         </w:trPr>
         <w:tc>
           <w:tcPr/>
@@ -1500,8 +1506,8 @@
             </w:pPr>
             <w:r>
               <w:rPr>
+                <w:b/>
                 <w:bCs/>
-                <w:b/>
               </w:rPr>
               <w:t xml:space="preserve">Referral Resource</w:t>
             </w:r>
@@ -1545,8 +1551,8 @@
             </w:pPr>
             <w:r>
               <w:rPr>
+                <w:b/>
                 <w:bCs/>
-                <w:b/>
               </w:rPr>
               <w:t xml:space="preserve">Sending Referrals</w:t>
             </w:r>
@@ -1590,8 +1596,8 @@
             </w:pPr>
             <w:r>
               <w:rPr>
+                <w:b/>
                 <w:bCs/>
-                <w:b/>
               </w:rPr>
               <w:t xml:space="preserve">Receiving Referrals</w:t>
             </w:r>
@@ -1635,8 +1641,8 @@
             </w:pPr>
             <w:r>
               <w:rPr>
+                <w:b/>
                 <w:bCs/>
-                <w:b/>
               </w:rPr>
               <w:t xml:space="preserve">Lifecycle &amp; Processing</w:t>
             </w:r>
@@ -1675,7 +1681,7 @@
         </w:pict>
       </w:r>
     </w:p>
-    <w:bookmarkStart w:id="27" w:name="referral-resource"/>
+    <w:bookmarkStart w:id="16" w:name="referral-resource"/>
     <w:p>
       <w:pPr>
         <w:pStyle w:val="Heading3"/>
@@ -1684,7 +1690,7 @@
         <w:t xml:space="preserve">Referral Resource</w:t>
       </w:r>
     </w:p>
-    <w:bookmarkStart w:id="26" w:name="Xb0bdbd08579c1f967880fdff649612da87f6791"/>
+    <w:bookmarkStart w:id="15" w:name="Xb0bdbd08579c1f967880fdff649612da87f6791"/>
     <w:p>
       <w:pPr>
         <w:pStyle w:val="Heading4"/>
@@ -1698,7 +1704,7 @@
         <w:pStyle w:val="FirstParagraph"/>
       </w:pPr>
       <w:r>
-        <w:t xml:space="preserve">Each referral is one</w:t>
+        <w:t xml:space="preserve">Each independently managed requested service uses a</w:t>
       </w:r>
       <w:r>
         <w:t xml:space="preserve"> </w:t>
@@ -1710,7 +1716,22 @@
         <w:t xml:space="preserve">ServiceRequest</w:t>
       </w:r>
       <w:r>
-        <w:t xml:space="preserve">. Decide how you classify it, how urgency is expressed, whether you expose a staff-facing reference number, and whether drafts exist before send.</w:t>
+        <w:t xml:space="preserve">; requests authorized together can share a</w:t>
+      </w:r>
+      <w:r>
+        <w:t xml:space="preserve"> </w:t>
+      </w:r>
+      <w:r>
+        <w:rPr>
+          <w:rStyle w:val="VerbatimChar"/>
+        </w:rPr>
+        <w:t xml:space="preserve">requisition</w:t>
+      </w:r>
+      <w:r>
+        <w:t xml:space="preserve"> </w:t>
+      </w:r>
+      <w:r>
+        <w:t xml:space="preserve">identifier. Decide how you classify it, how urgency is expressed, whether you expose a staff-facing reference number, and whether drafts exist before send.</w:t>
       </w:r>
     </w:p>
     <w:p>
@@ -1719,55 +1740,55 @@
       </w:pPr>
       <w:r>
         <w:rPr>
+          <w:b/>
           <w:bCs/>
-          <w:b/>
         </w:rPr>
         <w:t xml:space="preserve">Questions:</w:t>
       </w:r>
     </w:p>
     <w:p>
       <w:pPr>
+        <w:pStyle w:val="Compact"/>
         <w:numPr>
           <w:ilvl w:val="0"/>
           <w:numId w:val="1005"/>
         </w:numPr>
+      </w:pPr>
+      <w:r>
+        <w:t xml:space="preserve">How do you classify referrals (specialty, service, program), using standard codes, your own list, or both?</w:t>
+      </w:r>
+    </w:p>
+    <w:p>
+      <w:pPr>
         <w:pStyle w:val="Compact"/>
-      </w:pPr>
-      <w:r>
-        <w:t xml:space="preserve">How do you classify referrals (specialty, service, program), using standard codes, your own list, or both?</w:t>
-      </w:r>
-    </w:p>
-    <w:p>
-      <w:pPr>
         <w:numPr>
           <w:ilvl w:val="0"/>
           <w:numId w:val="1005"/>
         </w:numPr>
+      </w:pPr>
+      <w:r>
+        <w:t xml:space="preserve">What urgency options do users pick, and should they match triage and reporting?</w:t>
+      </w:r>
+    </w:p>
+    <w:p>
+      <w:pPr>
         <w:pStyle w:val="Compact"/>
-      </w:pPr>
-      <w:r>
-        <w:t xml:space="preserve">What urgency options do users pick, and should they match triage and reporting?</w:t>
-      </w:r>
-    </w:p>
-    <w:p>
-      <w:pPr>
         <w:numPr>
           <w:ilvl w:val="0"/>
           <w:numId w:val="1005"/>
         </w:numPr>
+      </w:pPr>
+      <w:r>
+        <w:t xml:space="preserve">Do you show a referral number or reference beyond the system id?</w:t>
+      </w:r>
+    </w:p>
+    <w:p>
+      <w:pPr>
         <w:pStyle w:val="Compact"/>
-      </w:pPr>
-      <w:r>
-        <w:t xml:space="preserve">Do you show a referral number or reference beyond the system id?</w:t>
-      </w:r>
-    </w:p>
-    <w:p>
-      <w:pPr>
         <w:numPr>
           <w:ilvl w:val="0"/>
           <w:numId w:val="1005"/>
         </w:numPr>
-        <w:pStyle w:val="Compact"/>
       </w:pPr>
       <w:r>
         <w:t xml:space="preserve">Is the referral final at send/commit, or do you need a draft first?</w:t>
@@ -1777,9 +1798,8 @@
       <w:tblPr>
         <w:tblStyle w:val="Table"/>
         <w:tblW w:w="9360" w:type="dxa"/>
+        <w:tblLayout w:type="fixed"/>
         <w:tblLook w:firstRow="1" w:lastRow="0" w:firstColumn="0" w:lastColumn="0" w:noHBand="0" w:noVBand="0" w:val="0020"/>
-        <w:jc w:val="start"/>
-        <w:tblLayout w:type="fixed"/>
       </w:tblPr>
       <w:tblGrid>
         <w:gridCol w:w="4128"/>
@@ -1788,7 +1808,7 @@
       <w:tr>
         <w:trPr>
           <w:cantSplit/>
-          <w:tblHeader w:val="true"/>
+          <w:tblHeader w:val="on"/>
         </w:trPr>
         <w:tc>
           <w:tcPr/>
@@ -1977,6 +1997,12 @@
               <w:jc w:val="left"/>
             </w:pPr>
             <w:r>
+              <w:t xml:space="preserve">Set</w:t>
+            </w:r>
+            <w:r>
+              <w:t xml:space="preserve"> </w:t>
+            </w:r>
+            <w:r>
               <w:rPr>
                 <w:rStyle w:val="VerbatimChar"/>
               </w:rPr>
@@ -1986,45 +2012,96 @@
               <w:t xml:space="preserve"> </w:t>
             </w:r>
             <w:r>
-              <w:t xml:space="preserve">when the referral is transmitted or committed.</w:t>
-            </w:r>
-          </w:p>
-        </w:tc>
-      </w:tr>
-      <w:tr>
-        <w:trPr>
-          <w:cantSplit/>
-        </w:trPr>
-        <w:tc>
-          <w:tcPr/>
-          <w:p>
-            <w:pPr>
-              <w:pStyle w:val="Compact"/>
-              <w:jc w:val="left"/>
-            </w:pPr>
-            <w:r>
-              <w:t xml:space="preserve">Draft before release (less common)</w:t>
-            </w:r>
-          </w:p>
-        </w:tc>
-        <w:tc>
-          <w:tcPr/>
-          <w:p>
-            <w:pPr>
-              <w:pStyle w:val="Compact"/>
-              <w:jc w:val="left"/>
-            </w:pPr>
+              <w:t xml:space="preserve">and</w:t>
+            </w:r>
+            <w:r>
+              <w:t xml:space="preserve"> </w:t>
+            </w:r>
             <w:r>
               <w:rPr>
                 <w:rStyle w:val="VerbatimChar"/>
               </w:rPr>
-              <w:t xml:space="preserve">intent = proposal</w:t>
-            </w:r>
-            <w:r>
-              <w:t xml:space="preserve"> </w:t>
-            </w:r>
-            <w:r>
-              <w:t xml:space="preserve">until release, or hold draft state outside FHIR until create – align with compliance and audit needs.</w:t>
+              <w:t xml:space="preserve">status = active</w:t>
+            </w:r>
+            <w:r>
+              <w:t xml:space="preserve"> </w:t>
+            </w:r>
+            <w:r>
+              <w:t xml:space="preserve">through the authorized release path. Sending is tracked separately from order status.</w:t>
+            </w:r>
+          </w:p>
+        </w:tc>
+      </w:tr>
+      <w:tr>
+        <w:trPr>
+          <w:cantSplit/>
+        </w:trPr>
+        <w:tc>
+          <w:tcPr/>
+          <w:p>
+            <w:pPr>
+              <w:pStyle w:val="Compact"/>
+              <w:jc w:val="left"/>
+            </w:pPr>
+            <w:r>
+              <w:t xml:space="preserve">Draft before release (less common)</w:t>
+            </w:r>
+          </w:p>
+        </w:tc>
+        <w:tc>
+          <w:tcPr/>
+          <w:p>
+            <w:pPr>
+              <w:pStyle w:val="Compact"/>
+              <w:jc w:val="left"/>
+            </w:pPr>
+            <w:r>
+              <w:t xml:space="preserve">Use</w:t>
+            </w:r>
+            <w:r>
+              <w:t xml:space="preserve"> </w:t>
+            </w:r>
+            <w:r>
+              <w:rPr>
+                <w:rStyle w:val="VerbatimChar"/>
+              </w:rPr>
+              <w:t xml:space="preserve">status = draft</w:t>
+            </w:r>
+            <w:r>
+              <w:t xml:space="preserve"> </w:t>
+            </w:r>
+            <w:r>
+              <w:t xml:space="preserve">with</w:t>
+            </w:r>
+            <w:r>
+              <w:t xml:space="preserve"> </w:t>
+            </w:r>
+            <w:r>
+              <w:rPr>
+                <w:rStyle w:val="VerbatimChar"/>
+              </w:rPr>
+              <w:t xml:space="preserve">intent = order</w:t>
+            </w:r>
+            <w:r>
+              <w:t xml:space="preserve"> </w:t>
+            </w:r>
+            <w:r>
+              <w:t xml:space="preserve">for an order being prepared. For a true proposal, retain it and create a separate authorized order with</w:t>
+            </w:r>
+            <w:r>
+              <w:t xml:space="preserve"> </w:t>
+            </w:r>
+            <w:r>
+              <w:rPr>
+                <w:rStyle w:val="VerbatimChar"/>
+              </w:rPr>
+              <w:t xml:space="preserve">basedOn</w:t>
+            </w:r>
+            <w:r>
+              <w:t xml:space="preserve"> </w:t>
+            </w:r>
+            <w:r>
+              <w:t xml:space="preserve">referencing the proposal.</w:t>
             </w:r>
           </w:p>
         </w:tc>
@@ -2037,9 +2114,9 @@
         </w:pict>
       </w:r>
     </w:p>
-    <w:bookmarkEnd w:id="26"/>
-    <w:bookmarkEnd w:id="27"/>
-    <w:bookmarkStart w:id="32" w:name="sending-referrals"/>
+    <w:bookmarkEnd w:id="15"/>
+    <w:bookmarkEnd w:id="16"/>
+    <w:bookmarkStart w:id="21" w:name="sending-referrals"/>
     <w:p>
       <w:pPr>
         <w:pStyle w:val="Heading3"/>
@@ -2048,7 +2125,7 @@
         <w:t xml:space="preserve">Sending Referrals</w:t>
       </w:r>
     </w:p>
-    <w:bookmarkStart w:id="28" w:name="X65c95a5af791f3aa643664800650da6ad6cf96b"/>
+    <w:bookmarkStart w:id="17" w:name="X65c95a5af791f3aa643664800650da6ad6cf96b"/>
     <w:p>
       <w:pPr>
         <w:pStyle w:val="Heading4"/>
@@ -2071,43 +2148,43 @@
       </w:pPr>
       <w:r>
         <w:rPr>
+          <w:b/>
           <w:bCs/>
-          <w:b/>
         </w:rPr>
         <w:t xml:space="preserve">Questions:</w:t>
       </w:r>
     </w:p>
     <w:p>
       <w:pPr>
+        <w:pStyle w:val="Compact"/>
         <w:numPr>
           <w:ilvl w:val="0"/>
           <w:numId w:val="1006"/>
         </w:numPr>
+      </w:pPr>
+      <w:r>
+        <w:t xml:space="preserve">Do you use one referral intake flow for everyone, or different flows by specialty, service, or program?</w:t>
+      </w:r>
+    </w:p>
+    <w:p>
+      <w:pPr>
         <w:pStyle w:val="Compact"/>
-      </w:pPr>
-      <w:r>
-        <w:t xml:space="preserve">Do you use one referral intake flow for everyone, or different flows by specialty, service, or program?</w:t>
-      </w:r>
-    </w:p>
-    <w:p>
-      <w:pPr>
         <w:numPr>
           <w:ilvl w:val="0"/>
           <w:numId w:val="1006"/>
         </w:numPr>
+      </w:pPr>
+      <w:r>
+        <w:t xml:space="preserve">Which fields must be chosen from lists or structured inputs (e.g. specialty, recipient, urgency), which allow free text, and what is required before the referral can be sent?</w:t>
+      </w:r>
+    </w:p>
+    <w:p>
+      <w:pPr>
         <w:pStyle w:val="Compact"/>
-      </w:pPr>
-      <w:r>
-        <w:t xml:space="preserve">Which fields must be chosen from lists or structured inputs (e.g. specialty, recipient, urgency), which allow free text, and what is required before the referral can be sent?</w:t>
-      </w:r>
-    </w:p>
-    <w:p>
-      <w:pPr>
         <w:numPr>
           <w:ilvl w:val="0"/>
           <w:numId w:val="1006"/>
         </w:numPr>
-        <w:pStyle w:val="Compact"/>
       </w:pPr>
       <w:r>
         <w:t xml:space="preserve">Must every referral tie to the visit where it was created, or can referrals start without a linked visit (e.g. intake, triage, outreach)?</w:t>
@@ -2117,18 +2194,17 @@
       <w:tblPr>
         <w:tblStyle w:val="Table"/>
         <w:tblW w:w="9360" w:type="dxa"/>
+        <w:tblLayout w:type="fixed"/>
         <w:tblLook w:firstRow="1" w:lastRow="0" w:firstColumn="0" w:lastColumn="0" w:noHBand="0" w:noVBand="0" w:val="0020"/>
-        <w:jc w:val="start"/>
-        <w:tblLayout w:type="fixed"/>
       </w:tblPr>
       <w:tblGrid>
-        <w:gridCol w:w="4544"/>
-        <w:gridCol w:w="4816"/>
+        <w:gridCol w:w="4433"/>
+        <w:gridCol w:w="4927"/>
       </w:tblGrid>
       <w:tr>
         <w:trPr>
           <w:cantSplit/>
-          <w:tblHeader w:val="true"/>
+          <w:tblHeader w:val="on"/>
         </w:trPr>
         <w:tc>
           <w:tcPr/>
@@ -2179,7 +2255,36 @@
               <w:jc w:val="left"/>
             </w:pPr>
             <w:r>
-              <w:t xml:space="preserve">One Questionnaire; Bot maps to one consistent</w:t>
+              <w:t xml:space="preserve">Use one Questionnaire and retain its QuestionnaireResponse. Choose one extraction strategy for the form: SDC template extraction or a Bot mapping to ServiceRequest.</w:t>
+            </w:r>
+          </w:p>
+        </w:tc>
+      </w:tr>
+      <w:tr>
+        <w:trPr>
+          <w:cantSplit/>
+        </w:trPr>
+        <w:tc>
+          <w:tcPr/>
+          <w:p>
+            <w:pPr>
+              <w:pStyle w:val="Compact"/>
+              <w:jc w:val="left"/>
+            </w:pPr>
+            <w:r>
+              <w:t xml:space="preserve">Specialty forms (e.g., variation based on specialty, service, etc.) or supplemental forms (specific extra information needed based on receiving clinic preferences)</w:t>
+            </w:r>
+          </w:p>
+        </w:tc>
+        <w:tc>
+          <w:tcPr/>
+          <w:p>
+            <w:pPr>
+              <w:pStyle w:val="Compact"/>
+              <w:jc w:val="left"/>
+            </w:pPr>
+            <w:r>
+              <w:t xml:space="preserve">Multiple Questionnaires; shared core fields + specialty-specific items (specialty forms) or additional Questionnaires specific to receiving clinics (supplemental forms); map each to</w:t>
             </w:r>
             <w:r>
               <w:t xml:space="preserve"> </w:t>
@@ -2191,50 +2296,6 @@
               <w:t xml:space="preserve">ServiceRequest</w:t>
             </w:r>
             <w:r>
-              <w:t xml:space="preserve"> </w:t>
-            </w:r>
-            <w:r>
-              <w:t xml:space="preserve">shape.</w:t>
-            </w:r>
-          </w:p>
-        </w:tc>
-      </w:tr>
-      <w:tr>
-        <w:trPr>
-          <w:cantSplit/>
-        </w:trPr>
-        <w:tc>
-          <w:tcPr/>
-          <w:p>
-            <w:pPr>
-              <w:pStyle w:val="Compact"/>
-              <w:jc w:val="left"/>
-            </w:pPr>
-            <w:r>
-              <w:t xml:space="preserve">Specialty forms (e.g., variation based on specialty, service, etc.) or supplemental forms (specific extra information needed based on receiving clinic preferences)</w:t>
-            </w:r>
-          </w:p>
-        </w:tc>
-        <w:tc>
-          <w:tcPr/>
-          <w:p>
-            <w:pPr>
-              <w:pStyle w:val="Compact"/>
-              <w:jc w:val="left"/>
-            </w:pPr>
-            <w:r>
-              <w:t xml:space="preserve">Multiple Questionnaires; shared core fields + specialty-specific items (specialty forms) or additional Questionnaires specific to receiving clinics (supplemental forms); map each to</w:t>
-            </w:r>
-            <w:r>
-              <w:t xml:space="preserve"> </w:t>
-            </w:r>
-            <w:r>
-              <w:rPr>
-                <w:rStyle w:val="VerbatimChar"/>
-              </w:rPr>
-              <w:t xml:space="preserve">ServiceRequest</w:t>
-            </w:r>
-            <w:r>
               <w:t xml:space="preserve">.</w:t>
             </w:r>
           </w:p>
@@ -2351,8 +2412,8 @@
         </w:pict>
       </w:r>
     </w:p>
-    <w:bookmarkEnd w:id="28"/>
-    <w:bookmarkStart w:id="29" w:name="recipient-directory-model"/>
+    <w:bookmarkEnd w:id="17"/>
+    <w:bookmarkStart w:id="18" w:name="recipient-directory-model"/>
     <w:p>
       <w:pPr>
         <w:pStyle w:val="Heading4"/>
@@ -2373,8 +2434,8 @@
       </w:r>
       <w:r>
         <w:rPr>
+          <w:i/>
           <w:iCs/>
-          <w:i/>
         </w:rPr>
         <w:t xml:space="preserve">to</w:t>
       </w:r>
@@ -2391,8 +2452,8 @@
       </w:pPr>
       <w:r>
         <w:rPr>
+          <w:b/>
           <w:bCs/>
-          <w:b/>
         </w:rPr>
         <w:t xml:space="preserve">⚠ One-way door:</w:t>
       </w:r>
@@ -2409,55 +2470,54 @@
       </w:pPr>
       <w:r>
         <w:rPr>
+          <w:b/>
           <w:bCs/>
-          <w:b/>
         </w:rPr>
         <w:t xml:space="preserve">Questions:</w:t>
       </w:r>
     </w:p>
     <w:p>
       <w:pPr>
+        <w:pStyle w:val="Compact"/>
         <w:numPr>
           <w:ilvl w:val="0"/>
           <w:numId w:val="1007"/>
         </w:numPr>
+      </w:pPr>
+      <w:r>
+        <w:t xml:space="preserve">Can a referral go to a specific clinician, to a site, department, or queue, or either, depending on referral type?</w:t>
+      </w:r>
+    </w:p>
+    <w:p>
+      <w:pPr>
         <w:pStyle w:val="Compact"/>
-      </w:pPr>
-      <w:r>
-        <w:t xml:space="preserve">Can a referral go to a specific clinician, to a site, department, or queue, or either, depending on referral type?</w:t>
-      </w:r>
-    </w:p>
-    <w:p>
-      <w:pPr>
         <w:numPr>
           <w:ilvl w:val="0"/>
           <w:numId w:val="1007"/>
         </w:numPr>
+      </w:pPr>
+      <w:r>
+        <w:t xml:space="preserve">Is your recipient directory edited and stored in Medplum, synced from another system, or mixed?</w:t>
+      </w:r>
+    </w:p>
+    <w:p>
+      <w:pPr>
         <w:pStyle w:val="Compact"/>
-      </w:pPr>
-      <w:r>
-        <w:t xml:space="preserve">Is your recipient directory edited and stored in Medplum, synced from another system, or mixed?</w:t>
-      </w:r>
-    </w:p>
-    <w:p>
-      <w:pPr>
         <w:numPr>
           <w:ilvl w:val="0"/>
           <w:numId w:val="1007"/>
         </w:numPr>
-        <w:pStyle w:val="Compact"/>
-      </w:pPr>
-      <w:r>
-        <w:t xml:space="preserve">Should the recipient picker show or filter by in-network status for the patient’s coverage – and where does that network status come from (synced payer provider directory, internal preferred-provider list, or a real-time eligibility query)?</w:t>
+      </w:pPr>
+      <w:r>
+        <w:t xml:space="preserve">Should the recipient picker show or filter by in-network status for the patient’s coverage – and where does that network status come from (synced payer provider directory, internal preferred-provider list, or payer-specific eligibility evidence)?</w:t>
       </w:r>
     </w:p>
     <w:tbl>
       <w:tblPr>
         <w:tblStyle w:val="Table"/>
         <w:tblW w:w="9360" w:type="dxa"/>
+        <w:tblLayout w:type="fixed"/>
         <w:tblLook w:firstRow="1" w:lastRow="0" w:firstColumn="0" w:lastColumn="0" w:noHBand="0" w:noVBand="0" w:val="0020"/>
-        <w:jc w:val="start"/>
-        <w:tblLayout w:type="fixed"/>
       </w:tblPr>
       <w:tblGrid>
         <w:gridCol w:w="3289"/>
@@ -2466,7 +2526,7 @@
       <w:tr>
         <w:trPr>
           <w:cantSplit/>
-          <w:tblHeader w:val="true"/>
+          <w:tblHeader w:val="on"/>
         </w:trPr>
         <w:tc>
           <w:tcPr/>
@@ -2517,7 +2577,22 @@
               <w:jc w:val="left"/>
             </w:pPr>
             <w:r>
-              <w:t xml:space="preserve">performer → Practitioner with display for UX.</w:t>
+              <w:t xml:space="preserve">Use</w:t>
+            </w:r>
+            <w:r>
+              <w:t xml:space="preserve"> </w:t>
+            </w:r>
+            <w:r>
+              <w:rPr>
+                <w:rStyle w:val="VerbatimChar"/>
+              </w:rPr>
+              <w:t xml:space="preserve">performer</w:t>
+            </w:r>
+            <w:r>
+              <w:t xml:space="preserve"> </w:t>
+            </w:r>
+            <w:r>
+              <w:t xml:space="preserve">→ PractitionerRole when the practice/service context matters, or Practitioner for the individual alone.</w:t>
             </w:r>
           </w:p>
         </w:tc>
@@ -2575,7 +2650,7 @@
               <w:jc w:val="left"/>
             </w:pPr>
             <w:r>
-              <w:t xml:space="preserve">Maintain Practitioner / Organization / HealthcareService; forms use references or search-backed pickers.</w:t>
+              <w:t xml:space="preserve">Maintain Practitioner, PractitionerRole, Organization, and HealthcareService; use Location for physical sites and reference-based recipient pickers.</w:t>
             </w:r>
           </w:p>
         </w:tc>
@@ -2633,7 +2708,7 @@
               <w:jc w:val="left"/>
             </w:pPr>
             <w:r>
-              <w:t xml:space="preserve">Filter or label recipients by in-network status. Approaches include: (1) internal preferred-provider list on Practitioner / Organization / HealthcareService, segmented per payer via OrganizationAffiliation; (2) per-patient CoverageEligibilityRequest at selection; (3) synced DaVinci PDEX Plan-Net</w:t>
+              <w:t xml:space="preserve">Use authoritative payer directory or contract data for the provider, service, location, and effective date. Record unknown/stale status explicitly. A preferred-provider list or eligibility response alone does not establish network participation.</w:t>
             </w:r>
           </w:p>
         </w:tc>
@@ -2646,8 +2721,8 @@
         </w:pict>
       </w:r>
     </w:p>
-    <w:bookmarkEnd w:id="29"/>
-    <w:bookmarkStart w:id="30" w:name="X46f28c5ff97a158951ae0082988a3c4fcc387b3"/>
+    <w:bookmarkEnd w:id="18"/>
+    <w:bookmarkStart w:id="19" w:name="X46f28c5ff97a158951ae0082988a3c4fcc387b3"/>
     <w:p>
       <w:pPr>
         <w:pStyle w:val="Heading4"/>
@@ -2670,31 +2745,31 @@
       </w:pPr>
       <w:r>
         <w:rPr>
+          <w:b/>
           <w:bCs/>
-          <w:b/>
         </w:rPr>
         <w:t xml:space="preserve">Questions:</w:t>
       </w:r>
     </w:p>
     <w:p>
       <w:pPr>
+        <w:pStyle w:val="Compact"/>
         <w:numPr>
           <w:ilvl w:val="0"/>
           <w:numId w:val="1008"/>
         </w:numPr>
+      </w:pPr>
+      <w:r>
+        <w:t xml:space="preserve">What clinical material must travel with the referral (reason for referral, problems or diagnoses, key meds and allergies, recent labs or imaging, coverage), and what should be filled in automatically versus selected or edited by the sender before send?</w:t>
+      </w:r>
+    </w:p>
+    <w:p>
+      <w:pPr>
         <w:pStyle w:val="Compact"/>
-      </w:pPr>
-      <w:r>
-        <w:t xml:space="preserve">What clinical material must travel with the referral (reason for referral, problems or diagnoses, key meds and allergies, recent labs or imaging, coverage), and what should be filled in automatically versus selected or edited by the sender before send?</w:t>
-      </w:r>
-    </w:p>
-    <w:p>
-      <w:pPr>
         <w:numPr>
           <w:ilvl w:val="0"/>
           <w:numId w:val="1008"/>
         </w:numPr>
-        <w:pStyle w:val="Compact"/>
       </w:pPr>
       <w:r>
         <w:t xml:space="preserve">Should internal staff-only notes appear on the referral, or only content intended for the receiving provider and the patient?</w:t>
@@ -2704,9 +2779,8 @@
       <w:tblPr>
         <w:tblStyle w:val="Table"/>
         <w:tblW w:w="9360" w:type="dxa"/>
+        <w:tblLayout w:type="fixed"/>
         <w:tblLook w:firstRow="1" w:lastRow="0" w:firstColumn="0" w:lastColumn="0" w:noHBand="0" w:noVBand="0" w:val="0020"/>
-        <w:jc w:val="start"/>
-        <w:tblLayout w:type="fixed"/>
       </w:tblPr>
       <w:tblGrid>
         <w:gridCol w:w="3935"/>
@@ -2715,7 +2789,7 @@
       <w:tr>
         <w:trPr>
           <w:cantSplit/>
-          <w:tblHeader w:val="true"/>
+          <w:tblHeader w:val="on"/>
         </w:trPr>
         <w:tc>
           <w:tcPr/>
@@ -2765,6 +2839,12 @@
               <w:pStyle w:val="Compact"/>
               <w:jc w:val="left"/>
             </w:pPr>
+            <w:r>
+              <w:t xml:space="preserve">Use</w:t>
+            </w:r>
+            <w:r>
+              <w:t xml:space="preserve"> </w:t>
+            </w:r>
             <w:r>
               <w:rPr>
                 <w:rStyle w:val="VerbatimChar"/>
@@ -2775,7 +2855,7 @@
               <w:t xml:space="preserve"> </w:t>
             </w:r>
             <w:r>
-              <w:t xml:space="preserve">for receiving provider;</w:t>
+              <w:t xml:space="preserve">for shared clinical narrative and</w:t>
             </w:r>
             <w:r>
               <w:t xml:space="preserve"> </w:t>
@@ -2790,7 +2870,7 @@
               <w:t xml:space="preserve"> </w:t>
             </w:r>
             <w:r>
-              <w:t xml:space="preserve">for patient-facing instructions.</w:t>
+              <w:t xml:space="preserve">for patient-facing instructions. These fields do not enforce different audiences; keep internal notes in separately protected resources and exclude them from the package.</w:t>
             </w:r>
           </w:p>
         </w:tc>
@@ -2819,7 +2899,7 @@
               <w:jc w:val="left"/>
             </w:pPr>
             <w:r>
-              <w:t xml:space="preserve">Minimal</w:t>
+              <w:t xml:space="preserve">Link the clinical reason through</w:t>
             </w:r>
             <w:r>
               <w:t xml:space="preserve"> </w:t>
@@ -2834,7 +2914,7 @@
               <w:t xml:space="preserve"> </w:t>
             </w:r>
             <w:r>
-              <w:t xml:space="preserve">+ short</w:t>
+              <w:t xml:space="preserve">or</w:t>
             </w:r>
             <w:r>
               <w:t xml:space="preserve"> </w:t>
@@ -2843,13 +2923,10 @@
               <w:rPr>
                 <w:rStyle w:val="VerbatimChar"/>
               </w:rPr>
-              <w:t xml:space="preserve">note</w:t>
-            </w:r>
-            <w:r>
-              <w:t xml:space="preserve"> </w:t>
-            </w:r>
-            <w:r>
-              <w:t xml:space="preserve">vs broader</w:t>
+              <w:t xml:space="preserve">reasonCode</w:t>
+            </w:r>
+            <w:r>
+              <w:t xml:space="preserve">; use</w:t>
             </w:r>
             <w:r>
               <w:t xml:space="preserve"> </w:t>
@@ -2864,7 +2941,570 @@
               <w:t xml:space="preserve"> </w:t>
             </w:r>
             <w:r>
+              <w:t xml:space="preserve">for selected evidence. Store files in Binary and link them through DocumentReference attachment URLs, without inline base64.</w:t>
+            </w:r>
+          </w:p>
+        </w:tc>
+      </w:tr>
+      <w:tr>
+        <w:trPr>
+          <w:cantSplit/>
+        </w:trPr>
+        <w:tc>
+          <w:tcPr/>
+          <w:p>
+            <w:pPr>
+              <w:pStyle w:val="Compact"/>
+              <w:jc w:val="left"/>
+            </w:pPr>
+            <w:r>
+              <w:t xml:space="preserve">Context at send</w:t>
+            </w:r>
+          </w:p>
+        </w:tc>
+        <w:tc>
+          <w:tcPr/>
+          <w:p>
+            <w:pPr>
+              <w:pStyle w:val="Compact"/>
+              <w:jc w:val="left"/>
+            </w:pPr>
+            <w:r>
+              <w:t xml:space="preserve">Let the sender review selected chart context. Retain the actual transmitted document or payload and its source versions so later chart edits do not change the send history.</w:t>
+            </w:r>
+          </w:p>
+        </w:tc>
+      </w:tr>
+    </w:tbl>
+    <w:p>
+      <w:r>
+        <w:pict>
+          <v:rect style="width:0;height:1.5pt" o:hralign="center" o:hrstd="t" o:hr="t"/>
+        </w:pict>
+      </w:r>
+    </w:p>
+    <w:bookmarkEnd w:id="19"/>
+    <w:bookmarkStart w:id="20" w:name="Xf9322d90849e80499a5638125a4467cb3581eda"/>
+    <w:p>
+      <w:pPr>
+        <w:pStyle w:val="Heading4"/>
+      </w:pPr>
+      <w:r>
+        <w:t xml:space="preserve">3.5 Outbound Transmission – Channels &amp; Payload Format</w:t>
+      </w:r>
+    </w:p>
+    <w:p>
+      <w:pPr>
+        <w:pStyle w:val="FirstParagraph"/>
+      </w:pPr>
+      <w:r>
+        <w:t xml:space="preserve">Decide how referrals leave your product – whether recipients get structured exchange versus documents – and what you produce for each sending path.</w:t>
+      </w:r>
+    </w:p>
+    <w:p>
+      <w:pPr>
+        <w:pStyle w:val="BodyText"/>
+      </w:pPr>
+      <w:r>
+        <w:rPr>
+          <w:b/>
+          <w:bCs/>
+        </w:rPr>
+        <w:t xml:space="preserve">Questions:</w:t>
+      </w:r>
+    </w:p>
+    <w:p>
+      <w:pPr>
+        <w:pStyle w:val="Compact"/>
+        <w:numPr>
+          <w:ilvl w:val="0"/>
+          <w:numId w:val="1009"/>
+        </w:numPr>
+      </w:pPr>
+      <w:r>
+        <w:t xml:space="preserve">Do any recipients accept referrals through structured exchange with your system, or only as documents (e.g. PDF or care-summary packages)?</w:t>
+      </w:r>
+    </w:p>
+    <w:p>
+      <w:pPr>
+        <w:pStyle w:val="Compact"/>
+        <w:numPr>
+          <w:ilvl w:val="0"/>
+          <w:numId w:val="1009"/>
+        </w:numPr>
+      </w:pPr>
+      <w:r>
+        <w:t xml:space="preserve">What outbound channels do you plan to use? (e.g., secure email, fax, API?)</w:t>
+      </w:r>
+    </w:p>
+    <w:p>
+      <w:pPr>
+        <w:pStyle w:val="Compact"/>
+        <w:numPr>
+          <w:ilvl w:val="0"/>
+          <w:numId w:val="1009"/>
+        </w:numPr>
+      </w:pPr>
+      <w:r>
+        <w:t xml:space="preserve">For each outbound channel you plan to use, what do you actually send or generate – structured data export, PDF, care-summary document, or a mix?</w:t>
+      </w:r>
+    </w:p>
+    <w:p>
+      <w:pPr>
+        <w:pStyle w:val="Compact"/>
+        <w:numPr>
+          <w:ilvl w:val="0"/>
+          <w:numId w:val="1009"/>
+        </w:numPr>
+      </w:pPr>
+      <w:r>
+        <w:t xml:space="preserve">Is the outbound channel the same for every recipient (e.g. always fax) or does it vary per recipient – and if it varies, where does that preference live (recipient directory, referral type, picked at send time)?</w:t>
+      </w:r>
+    </w:p>
+    <w:p>
+      <w:pPr>
+        <w:pStyle w:val="Compact"/>
+        <w:numPr>
+          <w:ilvl w:val="0"/>
+          <w:numId w:val="1009"/>
+        </w:numPr>
+      </w:pPr>
+      <w:r>
+        <w:t xml:space="preserve">For each channel, do you need to confirm delivery, retry on failure, and show send history to staff – and what counts as</w:t>
+      </w:r>
+      <w:r>
+        <w:t xml:space="preserve"> </w:t>
+      </w:r>
+      <w:r>
+        <w:t xml:space="preserve">“successfully sent”</w:t>
+      </w:r>
+      <w:r>
+        <w:t xml:space="preserve">?</w:t>
+      </w:r>
+    </w:p>
+    <w:tbl>
+      <w:tblPr>
+        <w:tblStyle w:val="Table"/>
+        <w:tblW w:w="9360" w:type="dxa"/>
+        <w:tblLayout w:type="fixed"/>
+        <w:tblLook w:firstRow="1" w:lastRow="0" w:firstColumn="0" w:lastColumn="0" w:noHBand="0" w:noVBand="0" w:val="0020"/>
+      </w:tblPr>
+      <w:tblGrid>
+        <w:gridCol w:w="4369"/>
+        <w:gridCol w:w="4991"/>
+      </w:tblGrid>
+      <w:tr>
+        <w:trPr>
+          <w:cantSplit/>
+          <w:tblHeader w:val="on"/>
+        </w:trPr>
+        <w:tc>
+          <w:tcPr/>
+          <w:p>
+            <w:pPr>
+              <w:pStyle w:val="Compact"/>
+              <w:jc w:val="left"/>
+            </w:pPr>
+            <w:r>
+              <w:t xml:space="preserve">Situation</w:t>
+            </w:r>
+          </w:p>
+        </w:tc>
+        <w:tc>
+          <w:tcPr/>
+          <w:p>
+            <w:pPr>
+              <w:pStyle w:val="Compact"/>
+              <w:jc w:val="left"/>
+            </w:pPr>
+            <w:r>
+              <w:t xml:space="preserve">Approach</w:t>
+            </w:r>
+          </w:p>
+        </w:tc>
+      </w:tr>
+      <w:tr>
+        <w:trPr>
+          <w:cantSplit/>
+        </w:trPr>
+        <w:tc>
+          <w:tcPr/>
+          <w:p>
+            <w:pPr>
+              <w:pStyle w:val="Compact"/>
+              <w:jc w:val="left"/>
+            </w:pPr>
+            <w:r>
+              <w:t xml:space="preserve">FHIR-capable peer</w:t>
+            </w:r>
+          </w:p>
+        </w:tc>
+        <w:tc>
+          <w:tcPr/>
+          <w:p>
+            <w:pPr>
+              <w:pStyle w:val="Compact"/>
+              <w:jc w:val="left"/>
+            </w:pPr>
+            <w:r>
+              <w:t xml:space="preserve">Send or expose</w:t>
+            </w:r>
+            <w:r>
+              <w:t xml:space="preserve"> </w:t>
+            </w:r>
+            <w:r>
+              <w:rPr>
+                <w:rStyle w:val="VerbatimChar"/>
+              </w:rPr>
+              <w:t xml:space="preserve">ServiceRequest</w:t>
+            </w:r>
+            <w:r>
+              <w:t xml:space="preserve"> </w:t>
+            </w:r>
+            <w:r>
+              <w:t xml:space="preserve">and related resources via API; record transmission with</w:t>
+            </w:r>
+            <w:r>
+              <w:t xml:space="preserve"> </w:t>
+            </w:r>
+            <w:r>
+              <w:rPr>
+                <w:rStyle w:val="VerbatimChar"/>
+              </w:rPr>
+              <w:t xml:space="preserve">Communication</w:t>
+            </w:r>
+            <w:r>
+              <w:t xml:space="preserve"> </w:t>
+            </w:r>
+            <w:r>
+              <w:t xml:space="preserve">when useful for audit.</w:t>
+            </w:r>
+          </w:p>
+        </w:tc>
+      </w:tr>
+      <w:tr>
+        <w:trPr>
+          <w:cantSplit/>
+        </w:trPr>
+        <w:tc>
+          <w:tcPr/>
+          <w:p>
+            <w:pPr>
+              <w:pStyle w:val="Compact"/>
+              <w:jc w:val="left"/>
+            </w:pPr>
+            <w:r>
+              <w:t xml:space="preserve">No FHIR API (e.g., secure email, fax channels)</w:t>
+            </w:r>
+          </w:p>
+        </w:tc>
+        <w:tc>
+          <w:tcPr/>
+          <w:p>
+            <w:pPr>
+              <w:pStyle w:val="Compact"/>
+              <w:jc w:val="left"/>
+            </w:pPr>
+            <w:r>
+              <w:t xml:space="preserve">Generate a reviewed PDF, or use a validated C-CDA generator matching the exchange contract. Store the result as DocumentReference/Binary and link the sent package from Communication.</w:t>
+            </w:r>
+          </w:p>
+        </w:tc>
+      </w:tr>
+      <w:tr>
+        <w:trPr>
+          <w:cantSplit/>
+        </w:trPr>
+        <w:tc>
+          <w:tcPr/>
+          <w:p>
+            <w:pPr>
+              <w:pStyle w:val="Compact"/>
+              <w:jc w:val="left"/>
+            </w:pPr>
+            <w:r>
+              <w:t xml:space="preserve">More than one channel</w:t>
+            </w:r>
+          </w:p>
+        </w:tc>
+        <w:tc>
+          <w:tcPr/>
+          <w:p>
+            <w:pPr>
+              <w:pStyle w:val="Compact"/>
+              <w:jc w:val="left"/>
+            </w:pPr>
+            <w:r>
+              <w:t xml:space="preserve">Keep one</w:t>
+            </w:r>
+            <w:r>
+              <w:t xml:space="preserve"> </w:t>
+            </w:r>
+            <w:r>
+              <w:rPr>
+                <w:rStyle w:val="VerbatimChar"/>
+              </w:rPr>
+              <w:t xml:space="preserve">ServiceRequest</w:t>
+            </w:r>
+            <w:r>
+              <w:t xml:space="preserve"> </w:t>
+            </w:r>
+            <w:r>
+              <w:t xml:space="preserve">as source of truth; run separate send paths per channel without divergent clinical content.</w:t>
+            </w:r>
+          </w:p>
+        </w:tc>
+      </w:tr>
+    </w:tbl>
+    <w:p>
+      <w:r>
+        <w:pict>
+          <v:rect style="width:0;height:1.5pt" o:hralign="center" o:hrstd="t" o:hr="t"/>
+        </w:pict>
+      </w:r>
+    </w:p>
+    <w:bookmarkEnd w:id="20"/>
+    <w:bookmarkEnd w:id="21"/>
+    <w:bookmarkStart w:id="23" w:name="receiving-referrals"/>
+    <w:p>
+      <w:pPr>
+        <w:pStyle w:val="Heading3"/>
+      </w:pPr>
+      <w:r>
+        <w:t xml:space="preserve">Receiving Referrals</w:t>
+      </w:r>
+    </w:p>
+    <w:bookmarkStart w:id="22" w:name="inbound-intake-channels-ingestion"/>
+    <w:p>
+      <w:pPr>
+        <w:pStyle w:val="Heading4"/>
+      </w:pPr>
+      <w:r>
+        <w:t xml:space="preserve">3.6 Inbound Intake – Channels &amp; Ingestion</w:t>
+      </w:r>
+    </w:p>
+    <w:p>
+      <w:pPr>
+        <w:pStyle w:val="FirstParagraph"/>
+      </w:pPr>
+      <w:r>
+        <w:t xml:space="preserve">Decide how inbound referrals get created, reviewed, and matched to patients.</w:t>
+      </w:r>
+    </w:p>
+    <w:p>
+      <w:pPr>
+        <w:pStyle w:val="BodyText"/>
+      </w:pPr>
+      <w:r>
+        <w:rPr>
+          <w:b/>
+          <w:bCs/>
+        </w:rPr>
+        <w:t xml:space="preserve">Questions:</w:t>
+      </w:r>
+    </w:p>
+    <w:p>
+      <w:pPr>
+        <w:pStyle w:val="Compact"/>
+        <w:numPr>
+          <w:ilvl w:val="0"/>
+          <w:numId w:val="1010"/>
+        </w:numPr>
+      </w:pPr>
+      <w:r>
+        <w:t xml:space="preserve">Which channels feed referrals into your product (e.g. automated exchange with a partner, fax or scanned documents, imported files or care-summary packages, typed in by staff)?</w:t>
+      </w:r>
+    </w:p>
+    <w:p>
+      <w:pPr>
+        <w:pStyle w:val="Compact"/>
+        <w:numPr>
+          <w:ilvl w:val="0"/>
+          <w:numId w:val="1010"/>
+        </w:numPr>
+      </w:pPr>
+      <w:r>
+        <w:t xml:space="preserve">For each channel, does a referral become active in your system automatically, or only after staff review or cleanup?</w:t>
+      </w:r>
+    </w:p>
+    <w:p>
+      <w:pPr>
+        <w:pStyle w:val="Compact"/>
+        <w:numPr>
+          <w:ilvl w:val="0"/>
+          <w:numId w:val="1010"/>
+        </w:numPr>
+      </w:pPr>
+      <w:r>
+        <w:t xml:space="preserve">When inbound patient information is incomplete or inconsistent, how do you find or confirm the correct patient record?</w:t>
+      </w:r>
+    </w:p>
+    <w:p>
+      <w:pPr>
+        <w:pStyle w:val="Compact"/>
+        <w:numPr>
+          <w:ilvl w:val="0"/>
+          <w:numId w:val="1010"/>
+        </w:numPr>
+      </w:pPr>
+      <w:r>
+        <w:t xml:space="preserve">After accepting (or declining) a new inbound referral, do you need to send an acknowledgment or response back to the originator – and through what path?</w:t>
+      </w:r>
+    </w:p>
+    <w:p>
+      <w:pPr>
+        <w:pStyle w:val="Compact"/>
+        <w:numPr>
+          <w:ilvl w:val="0"/>
+          <w:numId w:val="1010"/>
+        </w:numPr>
+      </w:pPr>
+      <w:r>
+        <w:t xml:space="preserve">When the same referral arrives more than once (e.g. fax + secure inbox), how do you detect and handle duplicates?</w:t>
+      </w:r>
+    </w:p>
+    <w:tbl>
+      <w:tblPr>
+        <w:tblStyle w:val="Table"/>
+        <w:tblW w:w="9360" w:type="dxa"/>
+        <w:tblLayout w:type="fixed"/>
+        <w:tblLook w:firstRow="1" w:lastRow="0" w:firstColumn="0" w:lastColumn="0" w:noHBand="0" w:noVBand="0" w:val="0020"/>
+      </w:tblPr>
+      <w:tblGrid>
+        <w:gridCol w:w="4506"/>
+        <w:gridCol w:w="4854"/>
+      </w:tblGrid>
+      <w:tr>
+        <w:trPr>
+          <w:cantSplit/>
+          <w:tblHeader w:val="on"/>
+        </w:trPr>
+        <w:tc>
+          <w:tcPr/>
+          <w:p>
+            <w:pPr>
+              <w:pStyle w:val="Compact"/>
+              <w:jc w:val="left"/>
+            </w:pPr>
+            <w:r>
+              <w:t xml:space="preserve">Situation</w:t>
+            </w:r>
+          </w:p>
+        </w:tc>
+        <w:tc>
+          <w:tcPr/>
+          <w:p>
+            <w:pPr>
+              <w:pStyle w:val="Compact"/>
+              <w:jc w:val="left"/>
+            </w:pPr>
+            <w:r>
+              <w:t xml:space="preserve">Approach</w:t>
+            </w:r>
+          </w:p>
+        </w:tc>
+      </w:tr>
+      <w:tr>
+        <w:trPr>
+          <w:cantSplit/>
+        </w:trPr>
+        <w:tc>
+          <w:tcPr/>
+          <w:p>
+            <w:pPr>
+              <w:pStyle w:val="Compact"/>
+              <w:jc w:val="left"/>
+            </w:pPr>
+            <w:r>
+              <w:t xml:space="preserve">Structured FHIR inbound</w:t>
+            </w:r>
+          </w:p>
+        </w:tc>
+        <w:tc>
+          <w:tcPr/>
+          <w:p>
+            <w:pPr>
+              <w:pStyle w:val="Compact"/>
+              <w:jc w:val="left"/>
+            </w:pPr>
+            <w:r>
+              <w:t xml:space="preserve">Validate ServiceRequest and related resources, resolve patient identity and local references, and preserve source identifiers. Track receiving review and acceptance with a Task.</w:t>
+            </w:r>
+          </w:p>
+        </w:tc>
+      </w:tr>
+      <w:tr>
+        <w:trPr>
+          <w:cantSplit/>
+        </w:trPr>
+        <w:tc>
+          <w:tcPr/>
+          <w:p>
+            <w:pPr>
+              <w:pStyle w:val="Compact"/>
+              <w:jc w:val="left"/>
+            </w:pPr>
+            <w:r>
+              <w:t xml:space="preserve">Structured documents or payloads you can parse (e.g. C-CDA XML, FHIR Bundles)</w:t>
+            </w:r>
+          </w:p>
+        </w:tc>
+        <w:tc>
+          <w:tcPr/>
+          <w:p>
+            <w:pPr>
+              <w:pStyle w:val="Compact"/>
+              <w:jc w:val="left"/>
+            </w:pPr>
+            <w:r>
+              <w:t xml:space="preserve">Bot or integration</w:t>
+            </w:r>
+            <w:r>
+              <w:t xml:space="preserve"> </w:t>
+            </w:r>
+            <w:r>
+              <w:rPr>
+                <w:b/>
+                <w:bCs/>
+              </w:rPr>
+              <w:t xml:space="preserve">parses</w:t>
+            </w:r>
+            <w:r>
+              <w:t xml:space="preserve"> </w:t>
+            </w:r>
+            <w:r>
               <w:t xml:space="preserve">and</w:t>
+            </w:r>
+            <w:r>
+              <w:t xml:space="preserve"> </w:t>
+            </w:r>
+            <w:r>
+              <w:rPr>
+                <w:b/>
+                <w:bCs/>
+              </w:rPr>
+              <w:t xml:space="preserve">maps</w:t>
+            </w:r>
+            <w:r>
+              <w:t xml:space="preserve"> </w:t>
+            </w:r>
+            <w:r>
+              <w:t xml:space="preserve">fields →</w:t>
+            </w:r>
+            <w:r>
+              <w:t xml:space="preserve"> </w:t>
+            </w:r>
+            <w:r>
+              <w:rPr>
+                <w:rStyle w:val="VerbatimChar"/>
+              </w:rPr>
+              <w:t xml:space="preserve">ServiceRequest</w:t>
+            </w:r>
+            <w:r>
+              <w:t xml:space="preserve"> </w:t>
+            </w:r>
+            <w:r>
+              <w:t xml:space="preserve">(+ related resources); retain source as</w:t>
             </w:r>
             <w:r>
               <w:t xml:space="preserve"> </w:t>
@@ -2879,36 +3519,93 @@
               <w:t xml:space="preserve"> </w:t>
             </w:r>
             <w:r>
-              <w:t xml:space="preserve">attachments for labs, imaging, PDFs.</w:t>
-            </w:r>
-          </w:p>
-        </w:tc>
-      </w:tr>
-      <w:tr>
-        <w:trPr>
-          <w:cantSplit/>
-        </w:trPr>
-        <w:tc>
-          <w:tcPr/>
-          <w:p>
-            <w:pPr>
-              <w:pStyle w:val="Compact"/>
-              <w:jc w:val="left"/>
-            </w:pPr>
-            <w:r>
-              <w:t xml:space="preserve">Context at send</w:t>
-            </w:r>
-          </w:p>
-        </w:tc>
-        <w:tc>
-          <w:tcPr/>
-          <w:p>
-            <w:pPr>
-              <w:pStyle w:val="Compact"/>
-              <w:jc w:val="left"/>
-            </w:pPr>
-            <w:r>
-              <w:t xml:space="preserve">Auto-populate from chart where policy allows; let clinicians add or remove items before send.</w:t>
+              <w:t xml:space="preserve">/</w:t>
+            </w:r>
+            <w:r>
+              <w:t xml:space="preserve"> </w:t>
+            </w:r>
+            <w:r>
+              <w:rPr>
+                <w:rStyle w:val="VerbatimChar"/>
+              </w:rPr>
+              <w:t xml:space="preserve">Binary</w:t>
+            </w:r>
+            <w:r>
+              <w:t xml:space="preserve">. Native structured interchange does</w:t>
+            </w:r>
+            <w:r>
+              <w:t xml:space="preserve"> </w:t>
+            </w:r>
+            <w:r>
+              <w:rPr>
+                <w:b/>
+                <w:bCs/>
+              </w:rPr>
+              <w:t xml:space="preserve">not</w:t>
+            </w:r>
+            <w:r>
+              <w:t xml:space="preserve"> </w:t>
+            </w:r>
+            <w:r>
+              <w:t xml:space="preserve">require OCR; image-only or bitmap PDF renditions may.</w:t>
+            </w:r>
+          </w:p>
+        </w:tc>
+      </w:tr>
+      <w:tr>
+        <w:trPr>
+          <w:cantSplit/>
+        </w:trPr>
+        <w:tc>
+          <w:tcPr/>
+          <w:p>
+            <w:pPr>
+              <w:pStyle w:val="Compact"/>
+              <w:jc w:val="left"/>
+            </w:pPr>
+            <w:r>
+              <w:t xml:space="preserve">Fax, scanned, or image-like documents</w:t>
+            </w:r>
+          </w:p>
+        </w:tc>
+        <w:tc>
+          <w:tcPr/>
+          <w:p>
+            <w:pPr>
+              <w:pStyle w:val="Compact"/>
+              <w:jc w:val="left"/>
+            </w:pPr>
+            <w:r>
+              <w:t xml:space="preserve">Retain the Binary and DocumentReference; extract fields with OCR and review uncertain identity or clinical content. Use a restricted intake Task until the patient is confirmed, then create or reconcile the ServiceRequest.</w:t>
+            </w:r>
+          </w:p>
+        </w:tc>
+      </w:tr>
+      <w:tr>
+        <w:trPr>
+          <w:cantSplit/>
+        </w:trPr>
+        <w:tc>
+          <w:tcPr/>
+          <w:p>
+            <w:pPr>
+              <w:pStyle w:val="Compact"/>
+              <w:jc w:val="left"/>
+            </w:pPr>
+            <w:r>
+              <w:t xml:space="preserve">Patient identity</w:t>
+            </w:r>
+          </w:p>
+        </w:tc>
+        <w:tc>
+          <w:tcPr/>
+          <w:p>
+            <w:pPr>
+              <w:pStyle w:val="Compact"/>
+              <w:jc w:val="left"/>
+            </w:pPr>
+            <w:r>
+              <w:t xml:space="preserve">Match trusted Patient identifiers with their namespaces and route ambiguity for review. Deduplicate referrals separately using the source referral identifier and conditional create.</w:t>
             </w:r>
           </w:p>
         </w:tc>
@@ -2921,14 +3618,24 @@
         </w:pict>
       </w:r>
     </w:p>
-    <w:bookmarkEnd w:id="30"/>
-    <w:bookmarkStart w:id="31" w:name="Xf9322d90849e80499a5638125a4467cb3581eda"/>
+    <w:bookmarkEnd w:id="22"/>
+    <w:bookmarkEnd w:id="23"/>
+    <w:bookmarkStart w:id="28" w:name="lifecycle-processing"/>
+    <w:p>
+      <w:pPr>
+        <w:pStyle w:val="Heading3"/>
+      </w:pPr>
+      <w:r>
+        <w:t xml:space="preserve">Lifecycle &amp; Processing</w:t>
+      </w:r>
+    </w:p>
+    <w:bookmarkStart w:id="25" w:name="X631cc1c4d2323319b81d9dad87cfb8959152316"/>
     <w:p>
       <w:pPr>
         <w:pStyle w:val="Heading4"/>
       </w:pPr>
       <w:r>
-        <w:t xml:space="preserve">3.5 Outbound Transmission – Channels &amp; Payload Format</w:t>
+        <w:t xml:space="preserve">3.7 Working the Referral – Assignment, Authorization, Scheduling</w:t>
       </w:r>
     </w:p>
     <w:p>
@@ -2936,7 +3643,7 @@
         <w:pStyle w:val="FirstParagraph"/>
       </w:pPr>
       <w:r>
-        <w:t xml:space="preserve">Decide how referrals leave your product – whether recipients get structured exchange versus documents – and what you produce for each sending path.</w:t>
+        <w:t xml:space="preserve">After a referral is created or accepted, decide how it gets to the right person, what authorization and coverage steps gate the work, and how it turns into an actual visit or service that ties back to the referral.</w:t>
       </w:r>
     </w:p>
     <w:p>
@@ -2945,103 +3652,123 @@
       </w:pPr>
       <w:r>
         <w:rPr>
+          <w:i/>
+          <w:iCs/>
+        </w:rPr>
+        <w:t xml:space="preserve">Note: Scheduling is covered in the</w:t>
+      </w:r>
+      <w:r>
+        <w:rPr>
+          <w:i/>
+          <w:iCs/>
+        </w:rPr>
+        <w:t xml:space="preserve"> </w:t>
+      </w:r>
+      <w:hyperlink r:id="rId24">
+        <w:r>
+          <w:rPr>
+            <w:rStyle w:val="Hyperlink"/>
+            <w:i/>
+            <w:iCs/>
+          </w:rPr>
+          <w:t xml:space="preserve">Scheduling Decision Guide</w:t>
+        </w:r>
+      </w:hyperlink>
+      <w:r>
+        <w:rPr>
+          <w:i/>
+          <w:iCs/>
+        </w:rPr>
+        <w:t xml:space="preserve">. This section stays at the level needed to align scheduling and authorization steps with the referral lifecycle.</w:t>
+      </w:r>
+    </w:p>
+    <w:p>
+      <w:pPr>
+        <w:pStyle w:val="BodyText"/>
+      </w:pPr>
+      <w:r>
+        <w:rPr>
+          <w:b/>
           <w:bCs/>
-          <w:b/>
         </w:rPr>
         <w:t xml:space="preserve">Questions:</w:t>
       </w:r>
     </w:p>
     <w:p>
       <w:pPr>
+        <w:pStyle w:val="Compact"/>
         <w:numPr>
           <w:ilvl w:val="0"/>
-          <w:numId w:val="1009"/>
+          <w:numId w:val="1011"/>
         </w:numPr>
+      </w:pPr>
+      <w:r>
+        <w:t xml:space="preserve">Who picks up a new referral first – an intake pool, a department queue, or an assigned coordinator (+ how does assignment logic work) – and how is ownership tracked and reassigned over time?</w:t>
+      </w:r>
+    </w:p>
+    <w:p>
+      <w:pPr>
         <w:pStyle w:val="Compact"/>
-      </w:pPr>
-      <w:r>
-        <w:t xml:space="preserve">Do any recipients accept referrals through structured exchange with your system, or only as documents (e.g. PDF or care-summary packages)?</w:t>
-      </w:r>
-    </w:p>
-    <w:p>
-      <w:pPr>
         <w:numPr>
           <w:ilvl w:val="0"/>
-          <w:numId w:val="1009"/>
+          <w:numId w:val="1011"/>
         </w:numPr>
+      </w:pPr>
+      <w:r>
+        <w:t xml:space="preserve">Does the referral need to confirm in-network status or covered benefits for the patient’s plan before scheduling – and is that check separate from prior auth, or rolled into the same eligibility request?</w:t>
+      </w:r>
+    </w:p>
+    <w:p>
+      <w:pPr>
         <w:pStyle w:val="Compact"/>
-      </w:pPr>
-      <w:r>
-        <w:t xml:space="preserve">What outbound channels do you plan to use? (e.g., secure email, fax, API?)</w:t>
-      </w:r>
-    </w:p>
-    <w:p>
-      <w:pPr>
         <w:numPr>
           <w:ilvl w:val="0"/>
-          <w:numId w:val="1009"/>
+          <w:numId w:val="1011"/>
         </w:numPr>
+      </w:pPr>
+      <w:r>
+        <w:t xml:space="preserve">Does the referral need to clear an authorization or coverage check before scheduling, and how do you track that authorization through to approval or denial?</w:t>
+      </w:r>
+    </w:p>
+    <w:p>
+      <w:pPr>
         <w:pStyle w:val="Compact"/>
-      </w:pPr>
-      <w:r>
-        <w:t xml:space="preserve">For each outbound channel you plan to use, what do you actually send or generate – structured data export, PDF, care-summary document, or a mix?</w:t>
-      </w:r>
-    </w:p>
-    <w:p>
-      <w:pPr>
         <w:numPr>
           <w:ilvl w:val="0"/>
-          <w:numId w:val="1009"/>
+          <w:numId w:val="1011"/>
         </w:numPr>
+      </w:pPr>
+      <w:r>
+        <w:t xml:space="preserve">When the referral becomes an actual visit (appointment, procedure, completed encounter), how do you tie that visit back to the originating referral?</w:t>
+      </w:r>
+    </w:p>
+    <w:p>
+      <w:pPr>
         <w:pStyle w:val="Compact"/>
-      </w:pPr>
-      <w:r>
-        <w:t xml:space="preserve">Is the outbound channel the same for every recipient (e.g. always fax) or does it vary per recipient – and if it varies, where does that preference live (recipient directory, referral type, picked at send time)?</w:t>
-      </w:r>
-    </w:p>
-    <w:p>
-      <w:pPr>
         <w:numPr>
           <w:ilvl w:val="0"/>
-          <w:numId w:val="1009"/>
+          <w:numId w:val="1011"/>
         </w:numPr>
-        <w:pStyle w:val="Compact"/>
-      </w:pPr>
-      <w:r>
-        <w:t xml:space="preserve">For each channel, do you need to confirm delivery, retry on failure, and show send history to staff – and what counts as</w:t>
-      </w:r>
-      <w:r>
-        <w:t xml:space="preserve"> </w:t>
-      </w:r>
-      <w:r>
-        <w:t xml:space="preserve">“</w:t>
-      </w:r>
-      <w:r>
-        <w:t xml:space="preserve">successfully sent</w:t>
-      </w:r>
-      <w:r>
-        <w:t xml:space="preserve">”</w:t>
-      </w:r>
-      <w:r>
-        <w:t xml:space="preserve">?</w:t>
+      </w:pPr>
+      <w:r>
+        <w:t xml:space="preserve">Do you track aging or service-level expectations on open referrals (e.g. days since received, days pending an action), and how do staff find work that is overdue?</w:t>
       </w:r>
     </w:p>
     <w:tbl>
       <w:tblPr>
         <w:tblStyle w:val="Table"/>
         <w:tblW w:w="9360" w:type="dxa"/>
+        <w:tblLayout w:type="fixed"/>
         <w:tblLook w:firstRow="1" w:lastRow="0" w:firstColumn="0" w:lastColumn="0" w:noHBand="0" w:noVBand="0" w:val="0020"/>
-        <w:jc w:val="start"/>
-        <w:tblLayout w:type="fixed"/>
       </w:tblPr>
       <w:tblGrid>
-        <w:gridCol w:w="4569"/>
-        <w:gridCol w:w="4791"/>
+        <w:gridCol w:w="1754"/>
+        <w:gridCol w:w="7606"/>
       </w:tblGrid>
       <w:tr>
         <w:trPr>
           <w:cantSplit/>
-          <w:tblHeader w:val="true"/>
+          <w:tblHeader w:val="on"/>
         </w:trPr>
         <w:tc>
           <w:tcPr/>
@@ -3080,19 +3807,19 @@
               <w:jc w:val="left"/>
             </w:pPr>
             <w:r>
-              <w:t xml:space="preserve">FHIR-capable peer</w:t>
-            </w:r>
-          </w:p>
-        </w:tc>
-        <w:tc>
-          <w:tcPr/>
-          <w:p>
-            <w:pPr>
-              <w:pStyle w:val="Compact"/>
-              <w:jc w:val="left"/>
-            </w:pPr>
-            <w:r>
-              <w:t xml:space="preserve">Send or expose</w:t>
+              <w:t xml:space="preserve">Ownership and assignment</w:t>
+            </w:r>
+          </w:p>
+        </w:tc>
+        <w:tc>
+          <w:tcPr/>
+          <w:p>
+            <w:pPr>
+              <w:pStyle w:val="Compact"/>
+              <w:jc w:val="left"/>
+            </w:pPr>
+            <w:r>
+              <w:t xml:space="preserve">Set</w:t>
             </w:r>
             <w:r>
               <w:t xml:space="preserve"> </w:t>
@@ -3101,13 +3828,13 @@
               <w:rPr>
                 <w:rStyle w:val="VerbatimChar"/>
               </w:rPr>
-              <w:t xml:space="preserve">ServiceRequest</w:t>
-            </w:r>
-            <w:r>
-              <w:t xml:space="preserve"> </w:t>
-            </w:r>
-            <w:r>
-              <w:t xml:space="preserve">and related resources via API; record transmission with</w:t>
+              <w:t xml:space="preserve">Task.for</w:t>
+            </w:r>
+            <w:r>
+              <w:t xml:space="preserve"> </w:t>
+            </w:r>
+            <w:r>
+              <w:t xml:space="preserve">to the patient and</w:t>
             </w:r>
             <w:r>
               <w:t xml:space="preserve"> </w:t>
@@ -3116,42 +3843,13 @@
               <w:rPr>
                 <w:rStyle w:val="VerbatimChar"/>
               </w:rPr>
-              <w:t xml:space="preserve">Communication</w:t>
-            </w:r>
-            <w:r>
-              <w:t xml:space="preserve"> </w:t>
-            </w:r>
-            <w:r>
-              <w:t xml:space="preserve">when useful for audit.</w:t>
-            </w:r>
-          </w:p>
-        </w:tc>
-      </w:tr>
-      <w:tr>
-        <w:trPr>
-          <w:cantSplit/>
-        </w:trPr>
-        <w:tc>
-          <w:tcPr/>
-          <w:p>
-            <w:pPr>
-              <w:pStyle w:val="Compact"/>
-              <w:jc w:val="left"/>
-            </w:pPr>
-            <w:r>
-              <w:t xml:space="preserve">No FHIR API (e.g., secure email, fax channels)</w:t>
-            </w:r>
-          </w:p>
-        </w:tc>
-        <w:tc>
-          <w:tcPr/>
-          <w:p>
-            <w:pPr>
-              <w:pStyle w:val="Compact"/>
-              <w:jc w:val="left"/>
-            </w:pPr>
-            <w:r>
-              <w:t xml:space="preserve">Bot-generated PDF or C-CDA; attach or link via</w:t>
+              <w:t xml:space="preserve">focus</w:t>
+            </w:r>
+            <w:r>
+              <w:t xml:space="preserve"> </w:t>
+            </w:r>
+            <w:r>
+              <w:t xml:space="preserve">to the ServiceRequest. Use</w:t>
             </w:r>
             <w:r>
               <w:t xml:space="preserve"> </w:t>
@@ -3160,13 +3858,13 @@
               <w:rPr>
                 <w:rStyle w:val="VerbatimChar"/>
               </w:rPr>
-              <w:t xml:space="preserve">DocumentReference</w:t>
-            </w:r>
-            <w:r>
-              <w:t xml:space="preserve"> </w:t>
-            </w:r>
-            <w:r>
-              <w:t xml:space="preserve">/ Binary; log outbound</w:t>
+              <w:t xml:space="preserve">owner</w:t>
+            </w:r>
+            <w:r>
+              <w:t xml:space="preserve"> </w:t>
+            </w:r>
+            <w:r>
+              <w:t xml:space="preserve">for the accountable person/group and</w:t>
             </w:r>
             <w:r>
               <w:t xml:space="preserve"> </w:t>
@@ -3175,39 +3873,42 @@
               <w:rPr>
                 <w:rStyle w:val="VerbatimChar"/>
               </w:rPr>
-              <w:t xml:space="preserve">Communication</w:t>
-            </w:r>
-            <w:r>
-              <w:t xml:space="preserve">.</w:t>
-            </w:r>
-          </w:p>
-        </w:tc>
-      </w:tr>
-      <w:tr>
-        <w:trPr>
-          <w:cantSplit/>
-        </w:trPr>
-        <w:tc>
-          <w:tcPr/>
-          <w:p>
-            <w:pPr>
-              <w:pStyle w:val="Compact"/>
-              <w:jc w:val="left"/>
-            </w:pPr>
-            <w:r>
-              <w:t xml:space="preserve">More than one channel</w:t>
-            </w:r>
-          </w:p>
-        </w:tc>
-        <w:tc>
-          <w:tcPr/>
-          <w:p>
-            <w:pPr>
-              <w:pStyle w:val="Compact"/>
-              <w:jc w:val="left"/>
-            </w:pPr>
-            <w:r>
-              <w:t xml:space="preserve">Keep one</w:t>
+              <w:t xml:space="preserve">performerType</w:t>
+            </w:r>
+            <w:r>
+              <w:t xml:space="preserve"> </w:t>
+            </w:r>
+            <w:r>
+              <w:t xml:space="preserve">for required roles; claim and reassign with version checks.</w:t>
+            </w:r>
+          </w:p>
+        </w:tc>
+      </w:tr>
+      <w:tr>
+        <w:trPr>
+          <w:cantSplit/>
+        </w:trPr>
+        <w:tc>
+          <w:tcPr/>
+          <w:p>
+            <w:pPr>
+              <w:pStyle w:val="Compact"/>
+              <w:jc w:val="left"/>
+            </w:pPr>
+            <w:r>
+              <w:t xml:space="preserve">Check in-network status / covered benefits</w:t>
+            </w:r>
+          </w:p>
+        </w:tc>
+        <w:tc>
+          <w:tcPr/>
+          <w:p>
+            <w:pPr>
+              <w:pStyle w:val="Compact"/>
+              <w:jc w:val="left"/>
+            </w:pPr>
+            <w:r>
+              <w:t xml:space="preserve">Use CoverageEligibilityRequest with</w:t>
             </w:r>
             <w:r>
               <w:t xml:space="preserve"> </w:t>
@@ -3216,192 +3917,42 @@
               <w:rPr>
                 <w:rStyle w:val="VerbatimChar"/>
               </w:rPr>
-              <w:t xml:space="preserve">ServiceRequest</w:t>
-            </w:r>
-            <w:r>
-              <w:t xml:space="preserve"> </w:t>
-            </w:r>
-            <w:r>
-              <w:t xml:space="preserve">as source of truth; run separate send paths per channel without divergent clinical content.</w:t>
-            </w:r>
-          </w:p>
-        </w:tc>
-      </w:tr>
-    </w:tbl>
-    <w:p>
-      <w:r>
-        <w:pict>
-          <v:rect style="width:0;height:1.5pt" o:hralign="center" o:hrstd="t" o:hr="t"/>
-        </w:pict>
-      </w:r>
-    </w:p>
-    <w:bookmarkEnd w:id="31"/>
-    <w:bookmarkEnd w:id="32"/>
-    <w:bookmarkStart w:id="34" w:name="receiving-referrals"/>
-    <w:p>
-      <w:pPr>
-        <w:pStyle w:val="Heading3"/>
-      </w:pPr>
-      <w:r>
-        <w:t xml:space="preserve">Receiving Referrals</w:t>
-      </w:r>
-    </w:p>
-    <w:bookmarkStart w:id="33" w:name="inbound-intake-channels-ingestion"/>
-    <w:p>
-      <w:pPr>
-        <w:pStyle w:val="Heading4"/>
-      </w:pPr>
-      <w:r>
-        <w:t xml:space="preserve">3.6 Inbound Intake – Channels &amp; Ingestion</w:t>
-      </w:r>
-    </w:p>
-    <w:p>
-      <w:pPr>
-        <w:pStyle w:val="FirstParagraph"/>
-      </w:pPr>
-      <w:r>
-        <w:t xml:space="preserve">Decide how inbound referrals get created, reviewed, and matched to patients.</w:t>
-      </w:r>
-    </w:p>
-    <w:p>
-      <w:pPr>
-        <w:pStyle w:val="BodyText"/>
-      </w:pPr>
-      <w:r>
-        <w:rPr>
-          <w:bCs/>
-          <w:b/>
-        </w:rPr>
-        <w:t xml:space="preserve">Questions:</w:t>
-      </w:r>
-    </w:p>
-    <w:p>
-      <w:pPr>
-        <w:numPr>
-          <w:ilvl w:val="0"/>
-          <w:numId w:val="1010"/>
-        </w:numPr>
-        <w:pStyle w:val="Compact"/>
-      </w:pPr>
-      <w:r>
-        <w:t xml:space="preserve">Which channels feed referrals into your product (e.g. automated exchange with a partner, fax or scanned documents, imported files or care-summary packages, typed in by staff)?</w:t>
-      </w:r>
-    </w:p>
-    <w:p>
-      <w:pPr>
-        <w:numPr>
-          <w:ilvl w:val="0"/>
-          <w:numId w:val="1010"/>
-        </w:numPr>
-        <w:pStyle w:val="Compact"/>
-      </w:pPr>
-      <w:r>
-        <w:t xml:space="preserve">For each channel, does a referral become active in your system automatically, or only after staff review or cleanup?</w:t>
-      </w:r>
-    </w:p>
-    <w:p>
-      <w:pPr>
-        <w:numPr>
-          <w:ilvl w:val="0"/>
-          <w:numId w:val="1010"/>
-        </w:numPr>
-        <w:pStyle w:val="Compact"/>
-      </w:pPr>
-      <w:r>
-        <w:t xml:space="preserve">When inbound patient information is incomplete or inconsistent, how do you find or confirm the correct patient record?</w:t>
-      </w:r>
-    </w:p>
-    <w:p>
-      <w:pPr>
-        <w:numPr>
-          <w:ilvl w:val="0"/>
-          <w:numId w:val="1010"/>
-        </w:numPr>
-        <w:pStyle w:val="Compact"/>
-      </w:pPr>
-      <w:r>
-        <w:t xml:space="preserve">After accepting (or declining) a new inbound referral, do you need to send an acknowledgment or response back to the originator – and through what path?</w:t>
-      </w:r>
-    </w:p>
-    <w:p>
-      <w:pPr>
-        <w:numPr>
-          <w:ilvl w:val="0"/>
-          <w:numId w:val="1010"/>
-        </w:numPr>
-        <w:pStyle w:val="Compact"/>
-      </w:pPr>
-      <w:r>
-        <w:t xml:space="preserve">When the same referral arrives more than once (e.g. fax + secure inbox), how do you detect and handle duplicates?</w:t>
-      </w:r>
-    </w:p>
-    <w:tbl>
-      <w:tblPr>
-        <w:tblStyle w:val="Table"/>
-        <w:tblW w:w="9360" w:type="dxa"/>
-        <w:tblLook w:firstRow="1" w:lastRow="0" w:firstColumn="0" w:lastColumn="0" w:noHBand="0" w:noVBand="0" w:val="0020"/>
-        <w:jc w:val="start"/>
-        <w:tblLayout w:type="fixed"/>
-      </w:tblPr>
-      <w:tblGrid>
-        <w:gridCol w:w="4531"/>
-        <w:gridCol w:w="4829"/>
-      </w:tblGrid>
-      <w:tr>
-        <w:trPr>
-          <w:cantSplit/>
-          <w:tblHeader w:val="true"/>
-        </w:trPr>
-        <w:tc>
-          <w:tcPr/>
-          <w:p>
-            <w:pPr>
-              <w:pStyle w:val="Compact"/>
-              <w:jc w:val="left"/>
-            </w:pPr>
-            <w:r>
-              <w:t xml:space="preserve">Situation</w:t>
-            </w:r>
-          </w:p>
-        </w:tc>
-        <w:tc>
-          <w:tcPr/>
-          <w:p>
-            <w:pPr>
-              <w:pStyle w:val="Compact"/>
-              <w:jc w:val="left"/>
-            </w:pPr>
-            <w:r>
-              <w:t xml:space="preserve">Approach</w:t>
-            </w:r>
-          </w:p>
-        </w:tc>
-      </w:tr>
-      <w:tr>
-        <w:trPr>
-          <w:cantSplit/>
-        </w:trPr>
-        <w:tc>
-          <w:tcPr/>
-          <w:p>
-            <w:pPr>
-              <w:pStyle w:val="Compact"/>
-              <w:jc w:val="left"/>
-            </w:pPr>
-            <w:r>
-              <w:t xml:space="preserve">Structured FHIR inbound</w:t>
-            </w:r>
-          </w:p>
-        </w:tc>
-        <w:tc>
-          <w:tcPr/>
-          <w:p>
-            <w:pPr>
-              <w:pStyle w:val="Compact"/>
-              <w:jc w:val="left"/>
-            </w:pPr>
-            <w:r>
-              <w:t xml:space="preserve">Validate and persist</w:t>
+              <w:t xml:space="preserve">purpose: benefits</w:t>
+            </w:r>
+            <w:r>
+              <w:t xml:space="preserve"> </w:t>
+            </w:r>
+            <w:r>
+              <w:t xml:space="preserve">where supported. Evaluate network participation against authoritative payer data for the selected provider/service; do not assume a universal eligibility or clearinghouse response.</w:t>
+            </w:r>
+          </w:p>
+        </w:tc>
+      </w:tr>
+      <w:tr>
+        <w:trPr>
+          <w:cantSplit/>
+        </w:trPr>
+        <w:tc>
+          <w:tcPr/>
+          <w:p>
+            <w:pPr>
+              <w:pStyle w:val="Compact"/>
+              <w:jc w:val="left"/>
+            </w:pPr>
+            <w:r>
+              <w:t xml:space="preserve">Check whether prior auth is required</w:t>
+            </w:r>
+          </w:p>
+        </w:tc>
+        <w:tc>
+          <w:tcPr/>
+          <w:p>
+            <w:pPr>
+              <w:pStyle w:val="Compact"/>
+              <w:jc w:val="left"/>
+            </w:pPr>
+            <w:r>
+              <w:t xml:space="preserve">Use CoverageEligibilityRequest with</w:t>
             </w:r>
             <w:r>
               <w:t xml:space="preserve"> </w:t>
@@ -3410,74 +3961,13 @@
               <w:rPr>
                 <w:rStyle w:val="VerbatimChar"/>
               </w:rPr>
-              <w:t xml:space="preserve">ServiceRequest</w:t>
-            </w:r>
-            <w:r>
-              <w:t xml:space="preserve"> </w:t>
-            </w:r>
-            <w:r>
-              <w:t xml:space="preserve">(+ related resources); acknowledge per your protocol.</w:t>
-            </w:r>
-          </w:p>
-        </w:tc>
-      </w:tr>
-      <w:tr>
-        <w:trPr>
-          <w:cantSplit/>
-        </w:trPr>
-        <w:tc>
-          <w:tcPr/>
-          <w:p>
-            <w:pPr>
-              <w:pStyle w:val="Compact"/>
-              <w:jc w:val="left"/>
-            </w:pPr>
-            <w:r>
-              <w:t xml:space="preserve">Structured documents or payloads you can parse (e.g. C-CDA XML, FHIR Bundles)</w:t>
-            </w:r>
-          </w:p>
-        </w:tc>
-        <w:tc>
-          <w:tcPr/>
-          <w:p>
-            <w:pPr>
-              <w:pStyle w:val="Compact"/>
-              <w:jc w:val="left"/>
-            </w:pPr>
-            <w:r>
-              <w:t xml:space="preserve">Bot or integration</w:t>
-            </w:r>
-            <w:r>
-              <w:t xml:space="preserve"> </w:t>
-            </w:r>
-            <w:r>
-              <w:rPr>
-                <w:bCs/>
-                <w:b/>
-              </w:rPr>
-              <w:t xml:space="preserve">parses</w:t>
-            </w:r>
-            <w:r>
-              <w:t xml:space="preserve"> </w:t>
-            </w:r>
-            <w:r>
-              <w:t xml:space="preserve">and</w:t>
-            </w:r>
-            <w:r>
-              <w:t xml:space="preserve"> </w:t>
-            </w:r>
-            <w:r>
-              <w:rPr>
-                <w:bCs/>
-                <w:b/>
-              </w:rPr>
-              <w:t xml:space="preserve">maps</w:t>
-            </w:r>
-            <w:r>
-              <w:t xml:space="preserve"> </w:t>
-            </w:r>
-            <w:r>
-              <w:t xml:space="preserve">fields →</w:t>
+              <w:t xml:space="preserve">purpose: auth-requirements</w:t>
+            </w:r>
+            <w:r>
+              <w:t xml:space="preserve"> </w:t>
+            </w:r>
+            <w:r>
+              <w:t xml:space="preserve">where supported. Interpret</w:t>
             </w:r>
             <w:r>
               <w:t xml:space="preserve"> </w:t>
@@ -3486,13 +3976,42 @@
               <w:rPr>
                 <w:rStyle w:val="VerbatimChar"/>
               </w:rPr>
-              <w:t xml:space="preserve">ServiceRequest</w:t>
-            </w:r>
-            <w:r>
-              <w:t xml:space="preserve"> </w:t>
-            </w:r>
-            <w:r>
-              <w:t xml:space="preserve">(+ related resources); retain source as</w:t>
+              <w:t xml:space="preserve">CoverageEligibilityResponse.insurance.item.authorizationRequired</w:t>
+            </w:r>
+            <w:r>
+              <w:t xml:space="preserve"> </w:t>
+            </w:r>
+            <w:r>
+              <w:t xml:space="preserve">and supporting requirements under the payer contract.</w:t>
+            </w:r>
+          </w:p>
+        </w:tc>
+      </w:tr>
+      <w:tr>
+        <w:trPr>
+          <w:cantSplit/>
+        </w:trPr>
+        <w:tc>
+          <w:tcPr/>
+          <w:p>
+            <w:pPr>
+              <w:pStyle w:val="Compact"/>
+              <w:jc w:val="left"/>
+            </w:pPr>
+            <w:r>
+              <w:t xml:space="preserve">Submit a prior auth request</w:t>
+            </w:r>
+          </w:p>
+        </w:tc>
+        <w:tc>
+          <w:tcPr/>
+          <w:p>
+            <w:pPr>
+              <w:pStyle w:val="Compact"/>
+              <w:jc w:val="left"/>
+            </w:pPr>
+            <w:r>
+              <w:t xml:space="preserve">Use Claim with</w:t>
             </w:r>
             <w:r>
               <w:t xml:space="preserve"> </w:t>
@@ -3501,13 +4020,42 @@
               <w:rPr>
                 <w:rStyle w:val="VerbatimChar"/>
               </w:rPr>
-              <w:t xml:space="preserve">DocumentReference</w:t>
-            </w:r>
-            <w:r>
-              <w:t xml:space="preserve"> </w:t>
-            </w:r>
-            <w:r>
-              <w:t xml:space="preserve">/</w:t>
+              <w:t xml:space="preserve">use: preauthorization</w:t>
+            </w:r>
+            <w:r>
+              <w:t xml:space="preserve"> </w:t>
+            </w:r>
+            <w:r>
+              <w:t xml:space="preserve">and interpret ClaimResponse under the chosen payer API, implementation guide, or EDI mapping. Configure that integration explicitly; transport success does not mean approval.</w:t>
+            </w:r>
+          </w:p>
+        </w:tc>
+      </w:tr>
+      <w:tr>
+        <w:trPr>
+          <w:cantSplit/>
+        </w:trPr>
+        <w:tc>
+          <w:tcPr/>
+          <w:p>
+            <w:pPr>
+              <w:pStyle w:val="Compact"/>
+              <w:jc w:val="left"/>
+            </w:pPr>
+            <w:r>
+              <w:t xml:space="preserve">Gate scheduling on authorization</w:t>
+            </w:r>
+          </w:p>
+        </w:tc>
+        <w:tc>
+          <w:tcPr/>
+          <w:p>
+            <w:pPr>
+              <w:pStyle w:val="Compact"/>
+              <w:jc w:val="left"/>
+            </w:pPr>
+            <w:r>
+              <w:t xml:space="preserve">Keep the Task on hold with an authorization-pending business stage until the required approval evidence is present and valid for the service/date.</w:t>
             </w:r>
             <w:r>
               <w:t xml:space="preserve"> </w:t>
@@ -3516,467 +4064,13 @@
               <w:rPr>
                 <w:rStyle w:val="VerbatimChar"/>
               </w:rPr>
-              <w:t xml:space="preserve">Binary</w:t>
-            </w:r>
-            <w:r>
-              <w:t xml:space="preserve">. Native structured interchange does</w:t>
-            </w:r>
-            <w:r>
-              <w:t xml:space="preserve"> </w:t>
-            </w:r>
-            <w:r>
-              <w:rPr>
-                <w:bCs/>
-                <w:b/>
-              </w:rPr>
-              <w:t xml:space="preserve">not</w:t>
-            </w:r>
-            <w:r>
-              <w:t xml:space="preserve"> </w:t>
-            </w:r>
-            <w:r>
-              <w:t xml:space="preserve">require OCR; image-only or bitmap PDF renditions may.</w:t>
-            </w:r>
-          </w:p>
-        </w:tc>
-      </w:tr>
-      <w:tr>
-        <w:trPr>
-          <w:cantSplit/>
-        </w:trPr>
-        <w:tc>
-          <w:tcPr/>
-          <w:p>
-            <w:pPr>
-              <w:pStyle w:val="Compact"/>
-              <w:jc w:val="left"/>
-            </w:pPr>
-            <w:r>
-              <w:t xml:space="preserve">Fax, scanned, or image-like documents</w:t>
-            </w:r>
-          </w:p>
-        </w:tc>
-        <w:tc>
-          <w:tcPr/>
-          <w:p>
-            <w:pPr>
-              <w:pStyle w:val="Compact"/>
-              <w:jc w:val="left"/>
-            </w:pPr>
-            <w:r>
-              <w:rPr>
-                <w:bCs/>
-                <w:b/>
-              </w:rPr>
-              <w:t xml:space="preserve">OCR</w:t>
-            </w:r>
-            <w:r>
-              <w:t xml:space="preserve"> </w:t>
-            </w:r>
-            <w:r>
-              <w:t xml:space="preserve">(often plus layout/template rules) → abstract fields → map to</w:t>
-            </w:r>
-            <w:r>
-              <w:t xml:space="preserve"> </w:t>
-            </w:r>
-            <w:r>
-              <w:rPr>
-                <w:rStyle w:val="VerbatimChar"/>
-              </w:rPr>
-              <w:t xml:space="preserve">ServiceRequest</w:t>
-            </w:r>
-            <w:r>
-              <w:t xml:space="preserve"> </w:t>
-            </w:r>
-            <w:r>
-              <w:t xml:space="preserve">+ source</w:t>
-            </w:r>
-            <w:r>
-              <w:t xml:space="preserve"> </w:t>
-            </w:r>
-            <w:r>
-              <w:rPr>
-                <w:rStyle w:val="VerbatimChar"/>
-              </w:rPr>
-              <w:t xml:space="preserve">DocumentReference</w:t>
-            </w:r>
-            <w:r>
-              <w:t xml:space="preserve">; human review when confidence is low.</w:t>
-            </w:r>
-          </w:p>
-        </w:tc>
-      </w:tr>
-      <w:tr>
-        <w:trPr>
-          <w:cantSplit/>
-        </w:trPr>
-        <w:tc>
-          <w:tcPr/>
-          <w:p>
-            <w:pPr>
-              <w:pStyle w:val="Compact"/>
-              <w:jc w:val="left"/>
-            </w:pPr>
-            <w:r>
-              <w:t xml:space="preserve">Patient identity</w:t>
-            </w:r>
-          </w:p>
-        </w:tc>
-        <w:tc>
-          <w:tcPr/>
-          <w:p>
-            <w:pPr>
-              <w:pStyle w:val="Compact"/>
-              <w:jc w:val="left"/>
-            </w:pPr>
-            <w:r>
-              <w:t xml:space="preserve">Match against existing</w:t>
-            </w:r>
-            <w:r>
-              <w:t xml:space="preserve"> </w:t>
-            </w:r>
-            <w:r>
-              <w:rPr>
-                <w:rStyle w:val="VerbatimChar"/>
-              </w:rPr>
-              <w:t xml:space="preserve">Patient</w:t>
-            </w:r>
-            <w:r>
-              <w:t xml:space="preserve"> </w:t>
-            </w:r>
-            <w:r>
-              <w:t xml:space="preserve">records using your identifiers and fallback workflow when match is unclear.</w:t>
-            </w:r>
-          </w:p>
-        </w:tc>
-      </w:tr>
-    </w:tbl>
-    <w:p>
-      <w:r>
-        <w:pict>
-          <v:rect style="width:0;height:1.5pt" o:hralign="center" o:hrstd="t" o:hr="t"/>
-        </w:pict>
-      </w:r>
-    </w:p>
-    <w:bookmarkEnd w:id="33"/>
-    <w:bookmarkEnd w:id="34"/>
-    <w:bookmarkStart w:id="39" w:name="lifecycle-processing"/>
-    <w:p>
-      <w:pPr>
-        <w:pStyle w:val="Heading3"/>
-      </w:pPr>
-      <w:r>
-        <w:t xml:space="preserve">Lifecycle &amp; Processing</w:t>
-      </w:r>
-    </w:p>
-    <w:bookmarkStart w:id="36" w:name="X631cc1c4d2323319b81d9dad87cfb8959152316"/>
-    <w:p>
-      <w:pPr>
-        <w:pStyle w:val="Heading4"/>
-      </w:pPr>
-      <w:r>
-        <w:t xml:space="preserve">3.7 Working the Referral – Assignment, Authorization, Scheduling</w:t>
-      </w:r>
-    </w:p>
-    <w:p>
-      <w:pPr>
-        <w:pStyle w:val="FirstParagraph"/>
-      </w:pPr>
-      <w:r>
-        <w:t xml:space="preserve">After a referral is created or accepted, decide how it gets to the right person, what authorization and coverage steps gate the work, and how it turns into an actual visit or service that ties back to the referral.</w:t>
-      </w:r>
-    </w:p>
-    <w:p>
-      <w:pPr>
-        <w:pStyle w:val="BodyText"/>
-      </w:pPr>
-      <w:r>
-        <w:rPr>
-          <w:iCs/>
-          <w:i/>
-        </w:rPr>
-        <w:t xml:space="preserve">Note: Scheduling is covered in the</w:t>
-      </w:r>
-      <w:r>
-        <w:rPr>
-          <w:iCs/>
-          <w:i/>
-        </w:rPr>
-        <w:t xml:space="preserve"> </w:t>
-      </w:r>
-      <w:hyperlink r:id="rId35">
-        <w:r>
-          <w:rPr>
-            <w:rStyle w:val="Hyperlink"/>
-            <w:iCs/>
-            <w:i/>
-          </w:rPr>
-          <w:t xml:space="preserve">Scheduling Decision Guide</w:t>
-        </w:r>
-      </w:hyperlink>
-      <w:r>
-        <w:rPr>
-          <w:iCs/>
-          <w:i/>
-        </w:rPr>
-        <w:t xml:space="preserve">. This section stays at the level needed to align scheduling and authorization steps with the referral lifecycle.</w:t>
-      </w:r>
-    </w:p>
-    <w:p>
-      <w:pPr>
-        <w:pStyle w:val="BodyText"/>
-      </w:pPr>
-      <w:r>
-        <w:rPr>
-          <w:bCs/>
-          <w:b/>
-        </w:rPr>
-        <w:t xml:space="preserve">Questions:</w:t>
-      </w:r>
-    </w:p>
-    <w:p>
-      <w:pPr>
-        <w:numPr>
-          <w:ilvl w:val="0"/>
-          <w:numId w:val="1011"/>
-        </w:numPr>
-        <w:pStyle w:val="Compact"/>
-      </w:pPr>
-      <w:r>
-        <w:t xml:space="preserve">Who picks up a new referral first – an intake pool, a department queue, or an assigned coordinator (+ how does assignment logic work) – and how is ownership tracked and reassigned over time?</w:t>
-      </w:r>
-    </w:p>
-    <w:p>
-      <w:pPr>
-        <w:numPr>
-          <w:ilvl w:val="0"/>
-          <w:numId w:val="1011"/>
-        </w:numPr>
-        <w:pStyle w:val="Compact"/>
-      </w:pPr>
-      <w:r>
-        <w:t xml:space="preserve">Does the referral need to confirm in-network status or covered benefits for the patient’s plan before scheduling – and is that check separate from prior auth, or rolled into the same eligibility request?</w:t>
-      </w:r>
-    </w:p>
-    <w:p>
-      <w:pPr>
-        <w:numPr>
-          <w:ilvl w:val="0"/>
-          <w:numId w:val="1011"/>
-        </w:numPr>
-        <w:pStyle w:val="Compact"/>
-      </w:pPr>
-      <w:r>
-        <w:t xml:space="preserve">Does the referral need to clear an authorization or coverage check before scheduling, and how do you track that authorization through to approval or denial?</w:t>
-      </w:r>
-    </w:p>
-    <w:p>
-      <w:pPr>
-        <w:numPr>
-          <w:ilvl w:val="0"/>
-          <w:numId w:val="1011"/>
-        </w:numPr>
-        <w:pStyle w:val="Compact"/>
-      </w:pPr>
-      <w:r>
-        <w:t xml:space="preserve">When the referral becomes an actual visit (appointment, procedure, completed encounter), how do you tie that visit back to the originating referral?</w:t>
-      </w:r>
-    </w:p>
-    <w:p>
-      <w:pPr>
-        <w:numPr>
-          <w:ilvl w:val="0"/>
-          <w:numId w:val="1011"/>
-        </w:numPr>
-        <w:pStyle w:val="Compact"/>
-      </w:pPr>
-      <w:r>
-        <w:t xml:space="preserve">Do you track aging or service-level expectations on open referrals (e.g. days since received, days pending an action), and how do staff find work that is overdue?</w:t>
-      </w:r>
-    </w:p>
-    <w:tbl>
-      <w:tblPr>
-        <w:tblStyle w:val="Table"/>
-        <w:tblW w:w="9360" w:type="dxa"/>
-        <w:tblLook w:firstRow="1" w:lastRow="0" w:firstColumn="0" w:lastColumn="0" w:noHBand="0" w:noVBand="0" w:val="0020"/>
-        <w:jc w:val="start"/>
-        <w:tblLayout w:type="fixed"/>
-      </w:tblPr>
-      <w:tblGrid>
-        <w:gridCol w:w="4317"/>
-        <w:gridCol w:w="5043"/>
-      </w:tblGrid>
-      <w:tr>
-        <w:trPr>
-          <w:cantSplit/>
-          <w:tblHeader w:val="true"/>
-        </w:trPr>
-        <w:tc>
-          <w:tcPr/>
-          <w:p>
-            <w:pPr>
-              <w:pStyle w:val="Compact"/>
-              <w:jc w:val="left"/>
-            </w:pPr>
-            <w:r>
-              <w:t xml:space="preserve">Situation</w:t>
-            </w:r>
-          </w:p>
-        </w:tc>
-        <w:tc>
-          <w:tcPr/>
-          <w:p>
-            <w:pPr>
-              <w:pStyle w:val="Compact"/>
-              <w:jc w:val="left"/>
-            </w:pPr>
-            <w:r>
-              <w:t xml:space="preserve">Approach</w:t>
-            </w:r>
-          </w:p>
-        </w:tc>
-      </w:tr>
-      <w:tr>
-        <w:trPr>
-          <w:cantSplit/>
-        </w:trPr>
-        <w:tc>
-          <w:tcPr/>
-          <w:p>
-            <w:pPr>
-              <w:pStyle w:val="Compact"/>
-              <w:jc w:val="left"/>
-            </w:pPr>
-            <w:r>
-              <w:t xml:space="preserve">Ownership and assignment</w:t>
-            </w:r>
-          </w:p>
-        </w:tc>
-        <w:tc>
-          <w:tcPr/>
-          <w:p>
-            <w:pPr>
-              <w:pStyle w:val="Compact"/>
-              <w:jc w:val="left"/>
-            </w:pPr>
-            <w:r>
-              <w:t xml:space="preserve">Task.owner (and Task.requester for the originator); pool ownership via Organization / HealthcareService; reassignments preserve audit.</w:t>
-            </w:r>
-          </w:p>
-        </w:tc>
-      </w:tr>
-      <w:tr>
-        <w:trPr>
-          <w:cantSplit/>
-        </w:trPr>
-        <w:tc>
-          <w:tcPr/>
-          <w:p>
-            <w:pPr>
-              <w:pStyle w:val="Compact"/>
-              <w:jc w:val="left"/>
-            </w:pPr>
-            <w:r>
-              <w:t xml:space="preserve">Check in-network status / covered benefits</w:t>
-            </w:r>
-          </w:p>
-        </w:tc>
-        <w:tc>
-          <w:tcPr/>
-          <w:p>
-            <w:pPr>
-              <w:pStyle w:val="Compact"/>
-              <w:jc w:val="left"/>
-            </w:pPr>
-            <w:r>
-              <w:t xml:space="preserve">CoverageEligibilityRequest with purpose: benefits; response returns network participation (X12 271 EB-12: Y/N/U/W) and benefit details. Same clearinghouse path as prior auth. Run at recipient selection (3.3) or as a pre-schedule gate.</w:t>
-            </w:r>
-          </w:p>
-        </w:tc>
-      </w:tr>
-      <w:tr>
-        <w:trPr>
-          <w:cantSplit/>
-        </w:trPr>
-        <w:tc>
-          <w:tcPr/>
-          <w:p>
-            <w:pPr>
-              <w:pStyle w:val="Compact"/>
-              <w:jc w:val="left"/>
-            </w:pPr>
-            <w:r>
-              <w:t xml:space="preserve">Check whether prior auth is required</w:t>
-            </w:r>
-          </w:p>
-        </w:tc>
-        <w:tc>
-          <w:tcPr/>
-          <w:p>
-            <w:pPr>
-              <w:pStyle w:val="Compact"/>
-              <w:jc w:val="left"/>
-            </w:pPr>
-            <w:r>
-              <w:t xml:space="preserve">CoverageEligibilityRequest with purpose: auth-requirements; response indicates authorizationRequired and any supporting documentation needed.</w:t>
-            </w:r>
-          </w:p>
-        </w:tc>
-      </w:tr>
-      <w:tr>
-        <w:trPr>
-          <w:cantSplit/>
-        </w:trPr>
-        <w:tc>
-          <w:tcPr/>
-          <w:p>
-            <w:pPr>
-              <w:pStyle w:val="Compact"/>
-              <w:jc w:val="left"/>
-            </w:pPr>
-            <w:r>
-              <w:t xml:space="preserve">Submit a prior auth request</w:t>
-            </w:r>
-          </w:p>
-        </w:tc>
-        <w:tc>
-          <w:tcPr/>
-          <w:p>
-            <w:pPr>
-              <w:pStyle w:val="Compact"/>
-              <w:jc w:val="left"/>
-            </w:pPr>
-            <w:r>
-              <w:t xml:space="preserve">Claim with use: preauthorization (distinct from claim for completed services); ClaimResponse carries the payer’s decision. Bots typically convert FHIR ↔ X12 EDI for transmission via clearinghouses (Availity, Change Healthcare, Waystar, etc.).</w:t>
-            </w:r>
-          </w:p>
-        </w:tc>
-      </w:tr>
-      <w:tr>
-        <w:trPr>
-          <w:cantSplit/>
-        </w:trPr>
-        <w:tc>
-          <w:tcPr/>
-          <w:p>
-            <w:pPr>
-              <w:pStyle w:val="Compact"/>
-              <w:jc w:val="left"/>
-            </w:pPr>
-            <w:r>
-              <w:t xml:space="preserve">Gate scheduling on authorization</w:t>
-            </w:r>
-          </w:p>
-        </w:tc>
-        <w:tc>
-          <w:tcPr/>
-          <w:p>
-            <w:pPr>
-              <w:pStyle w:val="Compact"/>
-              <w:jc w:val="left"/>
-            </w:pPr>
-            <w:r>
-              <w:t xml:space="preserve">Hold the referral in an auth-pending Task.businessStatus until ClaimResponse returns approval; then transition to a scheduling-ready state.</w:t>
+              <w:t xml:space="preserve">ClaimResponse.outcome: complete</w:t>
+            </w:r>
+            <w:r>
+              <w:t xml:space="preserve"> </w:t>
+            </w:r>
+            <w:r>
+              <w:t xml:space="preserve">alone does not prove approval.</w:t>
             </w:r>
           </w:p>
         </w:tc>
@@ -4010,7 +4104,7 @@
             <w:r>
               <w:t xml:space="preserve"> </w:t>
             </w:r>
-            <w:hyperlink r:id="rId35">
+            <w:hyperlink r:id="rId24">
               <w:r>
                 <w:rPr>
                   <w:rStyle w:val="Hyperlink"/>
@@ -4048,7 +4142,37 @@
               <w:jc w:val="left"/>
             </w:pPr>
             <w:r>
-              <w:t xml:space="preserve">Search and dashboards over Task.lastModified / authoredOn; Subscriptions or scheduled Bots surface overdue items.</w:t>
+              <w:t xml:space="preserve">Use Task history or explicit transitions for time in stage;</w:t>
+            </w:r>
+            <w:r>
+              <w:t xml:space="preserve"> </w:t>
+            </w:r>
+            <w:r>
+              <w:rPr>
+                <w:rStyle w:val="VerbatimChar"/>
+              </w:rPr>
+              <w:t xml:space="preserve">lastModified</w:t>
+            </w:r>
+            <w:r>
+              <w:t xml:space="preserve"> </w:t>
+            </w:r>
+            <w:r>
+              <w:t xml:space="preserve">may reflect unrelated edits. Use the Medplum</w:t>
+            </w:r>
+            <w:r>
+              <w:t xml:space="preserve"> </w:t>
+            </w:r>
+            <w:r>
+              <w:rPr>
+                <w:rStyle w:val="VerbatimChar"/>
+              </w:rPr>
+              <w:t xml:space="preserve">restriction.period</w:t>
+            </w:r>
+            <w:r>
+              <w:t xml:space="preserve"> </w:t>
+            </w:r>
+            <w:r>
+              <w:t xml:space="preserve">planned-date convention for deadlines, with range-aware search and a defined pause policy.</w:t>
             </w:r>
           </w:p>
         </w:tc>
@@ -4061,8 +4185,8 @@
         </w:pict>
       </w:r>
     </w:p>
-    <w:bookmarkEnd w:id="36"/>
-    <w:bookmarkStart w:id="37" w:name="lifecycle-businessstatus-codesystem"/>
+    <w:bookmarkEnd w:id="25"/>
+    <w:bookmarkStart w:id="26" w:name="lifecycle-businessstatus-codesystem"/>
     <w:p>
       <w:pPr>
         <w:pStyle w:val="Heading4"/>
@@ -4085,43 +4209,43 @@
       </w:pPr>
       <w:r>
         <w:rPr>
+          <w:b/>
           <w:bCs/>
-          <w:b/>
         </w:rPr>
         <w:t xml:space="preserve">Questions:</w:t>
       </w:r>
     </w:p>
     <w:p>
       <w:pPr>
+        <w:pStyle w:val="Compact"/>
         <w:numPr>
           <w:ilvl w:val="0"/>
           <w:numId w:val="1012"/>
         </w:numPr>
+      </w:pPr>
+      <w:r>
+        <w:t xml:space="preserve">Which milestones matter enough to show and operate on (e.g. sent, accepted, scheduled, completed, cancelled)?</w:t>
+      </w:r>
+    </w:p>
+    <w:p>
+      <w:pPr>
         <w:pStyle w:val="Compact"/>
-      </w:pPr>
-      <w:r>
-        <w:t xml:space="preserve">Which milestones matter enough to show and operate on (e.g. sent, accepted, scheduled, completed, cancelled)?</w:t>
-      </w:r>
-    </w:p>
-    <w:p>
-      <w:pPr>
         <w:numPr>
           <w:ilvl w:val="0"/>
           <w:numId w:val="1012"/>
         </w:numPr>
+      </w:pPr>
+      <w:r>
+        <w:t xml:space="preserve">How do you standardize labels for those milestones so reports, queues, and integrations all use the same meanings?</w:t>
+      </w:r>
+    </w:p>
+    <w:p>
+      <w:pPr>
         <w:pStyle w:val="Compact"/>
-      </w:pPr>
-      <w:r>
-        <w:t xml:space="preserve">How do you standardize labels for those milestones so reports, queues, and integrations all use the same meanings?</w:t>
-      </w:r>
-    </w:p>
-    <w:p>
-      <w:pPr>
         <w:numPr>
           <w:ilvl w:val="0"/>
           <w:numId w:val="1012"/>
         </w:numPr>
-        <w:pStyle w:val="Compact"/>
       </w:pPr>
       <w:r>
         <w:t xml:space="preserve">If a referral is cancelled or the recipient changes, do you revise the existing referral or create a new one?</w:t>
@@ -4131,9 +4255,8 @@
       <w:tblPr>
         <w:tblStyle w:val="Table"/>
         <w:tblW w:w="9360" w:type="dxa"/>
+        <w:tblLayout w:type="fixed"/>
         <w:tblLook w:firstRow="1" w:lastRow="0" w:firstColumn="0" w:lastColumn="0" w:noHBand="0" w:noVBand="0" w:val="0020"/>
-        <w:jc w:val="start"/>
-        <w:tblLayout w:type="fixed"/>
       </w:tblPr>
       <w:tblGrid>
         <w:gridCol w:w="2987"/>
@@ -4142,7 +4265,7 @@
       <w:tr>
         <w:trPr>
           <w:cantSplit/>
-          <w:tblHeader w:val="true"/>
+          <w:tblHeader w:val="on"/>
         </w:trPr>
         <w:tc>
           <w:tcPr/>
@@ -4193,7 +4316,22 @@
               <w:jc w:val="left"/>
             </w:pPr>
             <w:r>
-              <w:t xml:space="preserve">Few</w:t>
+              <w:t xml:space="preserve">Use R4</w:t>
+            </w:r>
+            <w:r>
+              <w:t xml:space="preserve"> </w:t>
+            </w:r>
+            <w:r>
+              <w:rPr>
+                <w:rStyle w:val="VerbatimChar"/>
+              </w:rPr>
+              <w:t xml:space="preserve">Task.status</w:t>
+            </w:r>
+            <w:r>
+              <w:t xml:space="preserve"> </w:t>
+            </w:r>
+            <w:r>
+              <w:t xml:space="preserve">for lifecycle and governed local</w:t>
             </w:r>
             <w:r>
               <w:t xml:space="preserve"> </w:t>
@@ -4208,7 +4346,65 @@
               <w:t xml:space="preserve"> </w:t>
             </w:r>
             <w:r>
-              <w:t xml:space="preserve">codes; move</w:t>
+              <w:t xml:space="preserve">codes for workflow stages. Define the scope and completion evidence of each Task.</w:t>
+            </w:r>
+          </w:p>
+        </w:tc>
+      </w:tr>
+      <w:tr>
+        <w:trPr>
+          <w:cantSplit/>
+        </w:trPr>
+        <w:tc>
+          <w:tcPr/>
+          <w:p>
+            <w:pPr>
+              <w:pStyle w:val="Compact"/>
+              <w:jc w:val="left"/>
+            </w:pPr>
+            <w:r>
+              <w:t xml:space="preserve">External signals</w:t>
+            </w:r>
+          </w:p>
+        </w:tc>
+        <w:tc>
+          <w:tcPr/>
+          <w:p>
+            <w:pPr>
+              <w:pStyle w:val="Compact"/>
+              <w:jc w:val="left"/>
+            </w:pPr>
+            <w:r>
+              <w:t xml:space="preserve">Correlate and deduplicate callbacks before updating work. Delivery, receiving-team acceptance, service completion, and returned-result review are separate events.</w:t>
+            </w:r>
+          </w:p>
+        </w:tc>
+      </w:tr>
+      <w:tr>
+        <w:trPr>
+          <w:cantSplit/>
+        </w:trPr>
+        <w:tc>
+          <w:tcPr/>
+          <w:p>
+            <w:pPr>
+              <w:pStyle w:val="Compact"/>
+              <w:jc w:val="left"/>
+            </w:pPr>
+            <w:r>
+              <w:t xml:space="preserve">Cancel / reroute</w:t>
+            </w:r>
+          </w:p>
+        </w:tc>
+        <w:tc>
+          <w:tcPr/>
+          <w:p>
+            <w:pPr>
+              <w:pStyle w:val="Compact"/>
+              <w:jc w:val="left"/>
+            </w:pPr>
+            <w:r>
+              <w:t xml:space="preserve">For an unchanged clinical order, the authorized workflow can update</w:t>
             </w:r>
             <w:r>
               <w:t xml:space="preserve"> </w:t>
@@ -4217,42 +4413,13 @@
               <w:rPr>
                 <w:rStyle w:val="VerbatimChar"/>
               </w:rPr>
-              <w:t xml:space="preserve">Task.status</w:t>
-            </w:r>
-            <w:r>
-              <w:t xml:space="preserve"> </w:t>
-            </w:r>
-            <w:r>
-              <w:t xml:space="preserve">with clear transitions.</w:t>
-            </w:r>
-          </w:p>
-        </w:tc>
-      </w:tr>
-      <w:tr>
-        <w:trPr>
-          <w:cantSplit/>
-        </w:trPr>
-        <w:tc>
-          <w:tcPr/>
-          <w:p>
-            <w:pPr>
-              <w:pStyle w:val="Compact"/>
-              <w:jc w:val="left"/>
-            </w:pPr>
-            <w:r>
-              <w:t xml:space="preserve">External signals</w:t>
-            </w:r>
-          </w:p>
-        </w:tc>
-        <w:tc>
-          <w:tcPr/>
-          <w:p>
-            <w:pPr>
-              <w:pStyle w:val="Compact"/>
-              <w:jc w:val="left"/>
-            </w:pPr>
-            <w:r>
-              <w:t xml:space="preserve">Bots or subscriptions update</w:t>
+              <w:t xml:space="preserve">performer</w:t>
+            </w:r>
+            <w:r>
+              <w:t xml:space="preserve"> </w:t>
+            </w:r>
+            <w:r>
+              <w:t xml:space="preserve">and resolve old Tasks. For a replacement order, use a new ServiceRequest with</w:t>
             </w:r>
             <w:r>
               <w:t xml:space="preserve"> </w:t>
@@ -4261,72 +4428,13 @@
               <w:rPr>
                 <w:rStyle w:val="VerbatimChar"/>
               </w:rPr>
-              <w:t xml:space="preserve">businessStatus</w:t>
-            </w:r>
-            <w:r>
-              <w:t xml:space="preserve"> </w:t>
-            </w:r>
-            <w:r>
-              <w:t xml:space="preserve">when external systems report acceptance or completion.</w:t>
-            </w:r>
-          </w:p>
-        </w:tc>
-      </w:tr>
-      <w:tr>
-        <w:trPr>
-          <w:cantSplit/>
-        </w:trPr>
-        <w:tc>
-          <w:tcPr/>
-          <w:p>
-            <w:pPr>
-              <w:pStyle w:val="Compact"/>
-              <w:jc w:val="left"/>
-            </w:pPr>
-            <w:r>
-              <w:t xml:space="preserve">Cancel / reroute</w:t>
-            </w:r>
-          </w:p>
-        </w:tc>
-        <w:tc>
-          <w:tcPr/>
-          <w:p>
-            <w:pPr>
-              <w:pStyle w:val="Compact"/>
-              <w:jc w:val="left"/>
-            </w:pPr>
-            <w:r>
-              <w:t xml:space="preserve">Terminal or superseded</w:t>
-            </w:r>
-            <w:r>
-              <w:t xml:space="preserve"> </w:t>
-            </w:r>
-            <w:r>
-              <w:rPr>
-                <w:rStyle w:val="VerbatimChar"/>
-              </w:rPr>
-              <w:t xml:space="preserve">Task</w:t>
-            </w:r>
-            <w:r>
-              <w:t xml:space="preserve"> </w:t>
-            </w:r>
-            <w:r>
-              <w:t xml:space="preserve">with reason; consistent rule for updating</w:t>
-            </w:r>
-            <w:r>
-              <w:t xml:space="preserve"> </w:t>
-            </w:r>
-            <w:r>
-              <w:rPr>
-                <w:rStyle w:val="VerbatimChar"/>
-              </w:rPr>
-              <w:t xml:space="preserve">ServiceRequest.performer</w:t>
-            </w:r>
-            <w:r>
-              <w:t xml:space="preserve"> </w:t>
-            </w:r>
-            <w:r>
-              <w:t xml:space="preserve">vs new referral.</w:t>
+              <w:t xml:space="preserve">replaces</w:t>
+            </w:r>
+            <w:r>
+              <w:t xml:space="preserve"> </w:t>
+            </w:r>
+            <w:r>
+              <w:t xml:space="preserve">and end the old request appropriately. Preserve transmission history.</w:t>
             </w:r>
           </w:p>
         </w:tc>
@@ -4339,8 +4447,8 @@
         </w:pict>
       </w:r>
     </w:p>
-    <w:bookmarkEnd w:id="37"/>
-    <w:bookmarkStart w:id="38" w:name="results-closure-round-trip"/>
+    <w:bookmarkEnd w:id="26"/>
+    <w:bookmarkStart w:id="27" w:name="results-closure-round-trip"/>
     <w:p>
       <w:pPr>
         <w:pStyle w:val="Heading4"/>
@@ -4363,43 +4471,43 @@
       </w:pPr>
       <w:r>
         <w:rPr>
+          <w:b/>
           <w:bCs/>
-          <w:b/>
         </w:rPr>
         <w:t xml:space="preserve">Questions:</w:t>
       </w:r>
     </w:p>
     <w:p>
       <w:pPr>
+        <w:pStyle w:val="Compact"/>
         <w:numPr>
           <w:ilvl w:val="0"/>
           <w:numId w:val="1013"/>
         </w:numPr>
+      </w:pPr>
+      <w:r>
+        <w:t xml:space="preserve">After the referral goes out, what do you expect back – structured results (e.g. labs or imaging), a consult or visit summary, documents or letters, several of those, or nothing beyond tracking the referral itself?</w:t>
+      </w:r>
+    </w:p>
+    <w:p>
+      <w:pPr>
         <w:pStyle w:val="Compact"/>
-      </w:pPr>
-      <w:r>
-        <w:t xml:space="preserve">After the referral goes out, what do you expect back – structured results (e.g. labs or imaging), a consult or visit summary, documents or letters, several of those, or nothing beyond tracking the referral itself?</w:t>
-      </w:r>
-    </w:p>
-    <w:p>
-      <w:pPr>
         <w:numPr>
           <w:ilvl w:val="0"/>
           <w:numId w:val="1013"/>
         </w:numPr>
+      </w:pPr>
+      <w:r>
+        <w:t xml:space="preserve">When results or documents arrive, how do you attach them to the correct referral – including when human confirmation is needed?</w:t>
+      </w:r>
+    </w:p>
+    <w:p>
+      <w:pPr>
         <w:pStyle w:val="Compact"/>
-      </w:pPr>
-      <w:r>
-        <w:t xml:space="preserve">When results or documents arrive, how do you attach them to the correct referral – including when human confirmation is needed?</w:t>
-      </w:r>
-    </w:p>
-    <w:p>
-      <w:pPr>
         <w:numPr>
           <w:ilvl w:val="0"/>
           <w:numId w:val="1013"/>
         </w:numPr>
-        <w:pStyle w:val="Compact"/>
       </w:pPr>
       <w:r>
         <w:t xml:space="preserve">What marks the referral complete for your operations – the referring organization, the receiving one, both, or different definitions for each?</w:t>
@@ -4409,18 +4517,17 @@
       <w:tblPr>
         <w:tblStyle w:val="Table"/>
         <w:tblW w:w="9360" w:type="dxa"/>
+        <w:tblLayout w:type="fixed"/>
         <w:tblLook w:firstRow="1" w:lastRow="0" w:firstColumn="0" w:lastColumn="0" w:noHBand="0" w:noVBand="0" w:val="0020"/>
-        <w:jc w:val="start"/>
-        <w:tblLayout w:type="fixed"/>
       </w:tblPr>
       <w:tblGrid>
-        <w:gridCol w:w="3808"/>
-        <w:gridCol w:w="5552"/>
+        <w:gridCol w:w="3696"/>
+        <w:gridCol w:w="5664"/>
       </w:tblGrid>
       <w:tr>
         <w:trPr>
           <w:cantSplit/>
-          <w:tblHeader w:val="true"/>
+          <w:tblHeader w:val="on"/>
         </w:trPr>
         <w:tc>
           <w:tcPr/>
@@ -4604,74 +4711,22 @@
               <w:jc w:val="left"/>
             </w:pPr>
             <w:r>
+              <w:t xml:space="preserve">Use</w:t>
+            </w:r>
+            <w:r>
+              <w:t xml:space="preserve"> </w:t>
+            </w:r>
+            <w:r>
               <w:rPr>
                 <w:rStyle w:val="VerbatimChar"/>
               </w:rPr>
-              <w:t xml:space="preserve">DocumentReference</w:t>
-            </w:r>
-            <w:r>
-              <w:t xml:space="preserve"> </w:t>
-            </w:r>
-            <w:r>
-              <w:t xml:space="preserve">with context pointing at the referral.</w:t>
-            </w:r>
-          </w:p>
-        </w:tc>
-      </w:tr>
-      <w:tr>
-        <w:trPr>
-          <w:cantSplit/>
-        </w:trPr>
-        <w:tc>
-          <w:tcPr/>
-          <w:p>
-            <w:pPr>
-              <w:pStyle w:val="Compact"/>
-              <w:jc w:val="left"/>
-            </w:pPr>
-            <w:r>
-              <w:t xml:space="preserve">Linking</w:t>
-            </w:r>
-          </w:p>
-        </w:tc>
-        <w:tc>
-          <w:tcPr/>
-          <w:p>
-            <w:pPr>
-              <w:pStyle w:val="Compact"/>
-              <w:jc w:val="left"/>
-            </w:pPr>
-            <w:r>
-              <w:t xml:space="preserve">Manual selection or automated match using identifiers you control – define when human confirmation is required.</w:t>
-            </w:r>
-          </w:p>
-        </w:tc>
-      </w:tr>
-      <w:tr>
-        <w:trPr>
-          <w:cantSplit/>
-        </w:trPr>
-        <w:tc>
-          <w:tcPr/>
-          <w:p>
-            <w:pPr>
-              <w:pStyle w:val="Compact"/>
-              <w:jc w:val="left"/>
-            </w:pPr>
-            <w:r>
-              <w:t xml:space="preserve">Closure</w:t>
-            </w:r>
-          </w:p>
-        </w:tc>
-        <w:tc>
-          <w:tcPr/>
-          <w:p>
-            <w:pPr>
-              <w:pStyle w:val="Compact"/>
-              <w:jc w:val="left"/>
-            </w:pPr>
-            <w:r>
-              <w:t xml:space="preserve">Terminal</w:t>
+              <w:t xml:space="preserve">DocumentReference.context.related</w:t>
+            </w:r>
+            <w:r>
+              <w:t xml:space="preserve"> </w:t>
+            </w:r>
+            <w:r>
+              <w:t xml:space="preserve">→ ServiceRequest and an attachment URL → Binary.</w:t>
             </w:r>
             <w:r>
               <w:t xml:space="preserve"> </w:t>
@@ -4680,23 +4735,254 @@
               <w:rPr>
                 <w:rStyle w:val="VerbatimChar"/>
               </w:rPr>
-              <w:t xml:space="preserve">businessStatus</w:t>
-            </w:r>
-            <w:r>
-              <w:t xml:space="preserve"> </w:t>
-            </w:r>
-            <w:r>
-              <w:t xml:space="preserve">or equivalent completion signal aligned with 3.8.</w:t>
+              <w:t xml:space="preserve">context.encounter</w:t>
+            </w:r>
+            <w:r>
+              <w:t xml:space="preserve"> </w:t>
+            </w:r>
+            <w:r>
+              <w:t xml:space="preserve">is for Encounter or EpisodeOfCare.</w:t>
+            </w:r>
+          </w:p>
+        </w:tc>
+      </w:tr>
+      <w:tr>
+        <w:trPr>
+          <w:cantSplit/>
+        </w:trPr>
+        <w:tc>
+          <w:tcPr/>
+          <w:p>
+            <w:pPr>
+              <w:pStyle w:val="Compact"/>
+              <w:jc w:val="left"/>
+            </w:pPr>
+            <w:r>
+              <w:t xml:space="preserve">Linking</w:t>
+            </w:r>
+          </w:p>
+        </w:tc>
+        <w:tc>
+          <w:tcPr/>
+          <w:p>
+            <w:pPr>
+              <w:pStyle w:val="Compact"/>
+              <w:jc w:val="left"/>
+            </w:pPr>
+            <w:r>
+              <w:t xml:space="preserve">Manual selection or automated match using identifiers you control – define when human confirmation is required.</w:t>
+            </w:r>
+          </w:p>
+        </w:tc>
+      </w:tr>
+      <w:tr>
+        <w:trPr>
+          <w:cantSplit/>
+        </w:trPr>
+        <w:tc>
+          <w:tcPr/>
+          <w:p>
+            <w:pPr>
+              <w:pStyle w:val="Compact"/>
+              <w:jc w:val="left"/>
+            </w:pPr>
+            <w:r>
+              <w:t xml:space="preserve">Closure</w:t>
+            </w:r>
+          </w:p>
+        </w:tc>
+        <w:tc>
+          <w:tcPr/>
+          <w:p>
+            <w:pPr>
+              <w:pStyle w:val="Compact"/>
+              <w:jc w:val="left"/>
+            </w:pPr>
+            <w:r>
+              <w:t xml:space="preserve">End each Task with the appropriate</w:t>
+            </w:r>
+            <w:r>
+              <w:t xml:space="preserve"> </w:t>
+            </w:r>
+            <w:r>
+              <w:rPr>
+                <w:rStyle w:val="VerbatimChar"/>
+              </w:rPr>
+              <w:t xml:space="preserve">status</w:t>
+            </w:r>
+            <w:r>
+              <w:t xml:space="preserve"> </w:t>
+            </w:r>
+            <w:r>
+              <w:t xml:space="preserve">and disposition. Reconcile ServiceRequest completion from service evidence through the responsible authority. For closed-loop care, separately require returned-result review and assignment of follow-up.</w:t>
             </w:r>
           </w:p>
         </w:tc>
       </w:tr>
     </w:tbl>
+    <w:bookmarkEnd w:id="27"/>
+    <w:bookmarkEnd w:id="28"/>
+    <w:bookmarkEnd w:id="29"/>
+    <w:bookmarkStart w:id="38" w:name="implementation-guides"/>
+    <w:p>
+      <w:pPr>
+        <w:pStyle w:val="Heading2"/>
+      </w:pPr>
+      <w:r>
+        <w:t xml:space="preserve">Implementation Guides</w:t>
+      </w:r>
+    </w:p>
+    <w:p>
+      <w:pPr>
+        <w:pStyle w:val="FirstParagraph"/>
+      </w:pPr>
+      <w:r>
+        <w:t xml:space="preserve">Use the decisions above to choose the next implementation guide:</w:t>
+      </w:r>
+    </w:p>
+    <w:p>
+      <w:pPr>
+        <w:pStyle w:val="Compact"/>
+        <w:numPr>
+          <w:ilvl w:val="0"/>
+          <w:numId w:val="1014"/>
+        </w:numPr>
+      </w:pPr>
+      <w:hyperlink r:id="rId30">
+        <w:r>
+          <w:rPr>
+            <w:rStyle w:val="Hyperlink"/>
+          </w:rPr>
+          <w:t xml:space="preserve">Creating and Capturing Referrals</w:t>
+        </w:r>
+      </w:hyperlink>
+    </w:p>
+    <w:p>
+      <w:pPr>
+        <w:pStyle w:val="Compact"/>
+        <w:numPr>
+          <w:ilvl w:val="0"/>
+          <w:numId w:val="1014"/>
+        </w:numPr>
+      </w:pPr>
+      <w:hyperlink r:id="rId31">
+        <w:r>
+          <w:rPr>
+            <w:rStyle w:val="Hyperlink"/>
+          </w:rPr>
+          <w:t xml:space="preserve">Recipients and Referral Packages</w:t>
+        </w:r>
+      </w:hyperlink>
+    </w:p>
+    <w:p>
+      <w:pPr>
+        <w:pStyle w:val="Compact"/>
+        <w:numPr>
+          <w:ilvl w:val="0"/>
+          <w:numId w:val="1014"/>
+        </w:numPr>
+      </w:pPr>
+      <w:hyperlink r:id="rId32">
+        <w:r>
+          <w:rPr>
+            <w:rStyle w:val="Hyperlink"/>
+          </w:rPr>
+          <w:t xml:space="preserve">Sending Referrals and Tracking Delivery</w:t>
+        </w:r>
+      </w:hyperlink>
+    </w:p>
+    <w:p>
+      <w:pPr>
+        <w:pStyle w:val="Compact"/>
+        <w:numPr>
+          <w:ilvl w:val="0"/>
+          <w:numId w:val="1014"/>
+        </w:numPr>
+      </w:pPr>
+      <w:hyperlink r:id="rId33">
+        <w:r>
+          <w:rPr>
+            <w:rStyle w:val="Hyperlink"/>
+          </w:rPr>
+          <w:t xml:space="preserve">Receiving and Triaging Referrals</w:t>
+        </w:r>
+      </w:hyperlink>
+    </w:p>
+    <w:p>
+      <w:pPr>
+        <w:pStyle w:val="Compact"/>
+        <w:numPr>
+          <w:ilvl w:val="0"/>
+          <w:numId w:val="1014"/>
+        </w:numPr>
+      </w:pPr>
+      <w:hyperlink r:id="rId34">
+        <w:r>
+          <w:rPr>
+            <w:rStyle w:val="Hyperlink"/>
+          </w:rPr>
+          <w:t xml:space="preserve">Processing and Coordinating Referrals</w:t>
+        </w:r>
+      </w:hyperlink>
+    </w:p>
+    <w:p>
+      <w:pPr>
+        <w:pStyle w:val="Compact"/>
+        <w:numPr>
+          <w:ilvl w:val="0"/>
+          <w:numId w:val="1014"/>
+        </w:numPr>
+      </w:pPr>
+      <w:hyperlink r:id="rId35">
+        <w:r>
+          <w:rPr>
+            <w:rStyle w:val="Hyperlink"/>
+          </w:rPr>
+          <w:t xml:space="preserve">Results and Closing the Loop</w:t>
+        </w:r>
+      </w:hyperlink>
+    </w:p>
+    <w:p>
+      <w:pPr>
+        <w:pStyle w:val="Compact"/>
+        <w:numPr>
+          <w:ilvl w:val="0"/>
+          <w:numId w:val="1014"/>
+        </w:numPr>
+      </w:pPr>
+      <w:hyperlink r:id="rId36">
+        <w:r>
+          <w:rPr>
+            <w:rStyle w:val="Hyperlink"/>
+          </w:rPr>
+          <w:t xml:space="preserve">Worked Referral Example</w:t>
+        </w:r>
+      </w:hyperlink>
+    </w:p>
+    <w:p>
+      <w:pPr>
+        <w:pStyle w:val="FirstParagraph"/>
+      </w:pPr>
+      <w:r>
+        <w:t xml:space="preserve">For assignment, delegation, and longitudinal workflows shared across the practice, use the</w:t>
+      </w:r>
+      <w:r>
+        <w:t xml:space="preserve"> </w:t>
+      </w:r>
+      <w:hyperlink r:id="rId37">
+        <w:r>
+          <w:rPr>
+            <w:rStyle w:val="Hyperlink"/>
+          </w:rPr>
+          <w:t xml:space="preserve">Care Coordination Decision Guide</w:t>
+        </w:r>
+      </w:hyperlink>
+      <w:r>
+        <w:t xml:space="preserve">.</w:t>
+      </w:r>
+    </w:p>
     <w:bookmarkEnd w:id="38"/>
     <w:bookmarkEnd w:id="39"/>
-    <w:bookmarkEnd w:id="40"/>
-    <w:bookmarkEnd w:id="41"/>
-    <w:p/>
     <w:sectPr>
       <w:pgSz w:h="15840" w:w="12240"/>
       <w:pgMar w:bottom="1440" w:footer="720" w:gutter="0" w:header="720" w:left="1440" w:right="1440" w:top="1440"/>
@@ -4734,14 +5020,14 @@
 <file path=word/numbering.xml><?xml version="1.0" encoding="utf-8"?>
 <w:numbering xmlns:w="http://schemas.openxmlformats.org/wordprocessingml/2006/main">
   <w:abstractNum w:abstractNumId="990">
-    <w:nsid w:val="A990"/>
+    <w:nsid w:val="0000A990"/>
     <w:multiLevelType w:val="multilevel"/>
     <w:lvl w:ilvl="0">
       <w:numFmt w:val="bullet"/>
       <w:lvlText w:val=" "/>
       <w:lvlJc w:val="left"/>
       <w:pPr>
-        <w:ind w:left="720" w:hanging="480"/>
+        <w:ind w:left="720" w:hanging="360"/>
       </w:pPr>
     </w:lvl>
     <w:lvl w:ilvl="1">
@@ -4749,7 +5035,7 @@
       <w:lvlText w:val=" "/>
       <w:lvlJc w:val="left"/>
       <w:pPr>
-        <w:ind w:left="1440" w:hanging="480"/>
+        <w:ind w:left="1440" w:hanging="360"/>
       </w:pPr>
     </w:lvl>
     <w:lvl w:ilvl="2">
@@ -4757,7 +5043,7 @@
       <w:lvlText w:val=" "/>
       <w:lvlJc w:val="left"/>
       <w:pPr>
-        <w:ind w:left="2160" w:hanging="480"/>
+        <w:ind w:left="2160" w:hanging="360"/>
       </w:pPr>
     </w:lvl>
     <w:lvl w:ilvl="3">
@@ -4765,7 +5051,7 @@
       <w:lvlText w:val=" "/>
       <w:lvlJc w:val="left"/>
       <w:pPr>
-        <w:ind w:left="2880" w:hanging="480"/>
+        <w:ind w:left="2880" w:hanging="360"/>
       </w:pPr>
     </w:lvl>
     <w:lvl w:ilvl="4">
@@ -4773,7 +5059,7 @@
       <w:lvlText w:val=" "/>
       <w:lvlJc w:val="left"/>
       <w:pPr>
-        <w:ind w:left="3600" w:hanging="480"/>
+        <w:ind w:left="3600" w:hanging="360"/>
       </w:pPr>
     </w:lvl>
     <w:lvl w:ilvl="5">
@@ -4781,7 +5067,7 @@
       <w:lvlText w:val=" "/>
       <w:lvlJc w:val="left"/>
       <w:pPr>
-        <w:ind w:left="4320" w:hanging="480"/>
+        <w:ind w:left="4320" w:hanging="360"/>
       </w:pPr>
     </w:lvl>
     <w:lvl w:ilvl="6">
@@ -4789,7 +5075,7 @@
       <w:lvlText w:val=" "/>
       <w:lvlJc w:val="left"/>
       <w:pPr>
-        <w:ind w:left="5040" w:hanging="480"/>
+        <w:ind w:left="5040" w:hanging="360"/>
       </w:pPr>
     </w:lvl>
     <w:lvl w:ilvl="7">
@@ -4797,7 +5083,7 @@
       <w:lvlText w:val=" "/>
       <w:lvlJc w:val="left"/>
       <w:pPr>
-        <w:ind w:left="5760" w:hanging="480"/>
+        <w:ind w:left="5760" w:hanging="360"/>
       </w:pPr>
     </w:lvl>
     <w:lvl w:ilvl="8">
@@ -4805,84 +5091,111 @@
       <w:lvlText w:val=" "/>
       <w:lvlJc w:val="left"/>
       <w:pPr>
-        <w:ind w:left="6480" w:hanging="480"/>
+        <w:ind w:left="6480" w:hanging="360"/>
       </w:pPr>
     </w:lvl>
   </w:abstractNum>
   <w:abstractNum w:abstractNumId="991">
-    <w:nsid w:val="A991"/>
+    <w:nsid w:val="0000A991"/>
     <w:multiLevelType w:val="multilevel"/>
     <w:lvl w:ilvl="0">
       <w:numFmt w:val="bullet"/>
-      <w:lvlText w:val="•"/>
+      <w:lvlText w:val=""/>
       <w:lvlJc w:val="left"/>
       <w:pPr>
-        <w:ind w:left="720" w:hanging="480"/>
-      </w:pPr>
+        <w:ind w:left="720" w:hanging="360"/>
+      </w:pPr>
+      <w:rPr>
+        <w:rFonts w:ascii="Symbol" w:hAnsi="Symbol" w:cs="Symbol" w:hint="default"/>
+      </w:rPr>
     </w:lvl>
     <w:lvl w:ilvl="1">
       <w:numFmt w:val="bullet"/>
-      <w:lvlText w:val="–"/>
+      <w:lvlText w:val="o"/>
       <w:lvlJc w:val="left"/>
       <w:pPr>
-        <w:ind w:left="1440" w:hanging="480"/>
-      </w:pPr>
+        <w:ind w:left="1440" w:hanging="360"/>
+      </w:pPr>
+      <w:rPr>
+        <w:rFonts w:ascii="Courier New" w:hAnsi="Courier New" w:cs="Courier New" w:hint="default"/>
+      </w:rPr>
     </w:lvl>
     <w:lvl w:ilvl="2">
       <w:numFmt w:val="bullet"/>
-      <w:lvlText w:val="•"/>
+      <w:lvlText w:val=""/>
       <w:lvlJc w:val="left"/>
       <w:pPr>
-        <w:ind w:left="2160" w:hanging="480"/>
-      </w:pPr>
+        <w:ind w:left="2160" w:hanging="360"/>
+      </w:pPr>
+      <w:rPr>
+        <w:rFonts w:ascii="Wingdings" w:hAnsi="Wingdings" w:cs="Wingdings" w:hint="default"/>
+      </w:rPr>
     </w:lvl>
     <w:lvl w:ilvl="3">
       <w:numFmt w:val="bullet"/>
-      <w:lvlText w:val="–"/>
+      <w:lvlText w:val=""/>
       <w:lvlJc w:val="left"/>
       <w:pPr>
-        <w:ind w:left="2880" w:hanging="480"/>
-      </w:pPr>
+        <w:ind w:left="2880" w:hanging="360"/>
+      </w:pPr>
+      <w:rPr>
+        <w:rFonts w:ascii="Symbol" w:hAnsi="Symbol" w:cs="Symbol" w:hint="default"/>
+      </w:rPr>
     </w:lvl>
     <w:lvl w:ilvl="4">
       <w:numFmt w:val="bullet"/>
-      <w:lvlText w:val="•"/>
+      <w:lvlText w:val="o"/>
       <w:lvlJc w:val="left"/>
       <w:pPr>
-        <w:ind w:left="3600" w:hanging="480"/>
-      </w:pPr>
+        <w:ind w:left="3600" w:hanging="360"/>
+      </w:pPr>
+      <w:rPr>
+        <w:rFonts w:ascii="Courier New" w:hAnsi="Courier New" w:cs="Courier New" w:hint="default"/>
+      </w:rPr>
     </w:lvl>
     <w:lvl w:ilvl="5">
       <w:numFmt w:val="bullet"/>
-      <w:lvlText w:val="–"/>
+      <w:lvlText w:val=""/>
       <w:lvlJc w:val="left"/>
       <w:pPr>
-        <w:ind w:left="4320" w:hanging="480"/>
-      </w:pPr>
+        <w:ind w:left="4320" w:hanging="360"/>
+      </w:pPr>
+      <w:rPr>
+        <w:rFonts w:ascii="Wingdings" w:hAnsi="Wingdings" w:cs="Wingdings" w:hint="default"/>
+      </w:rPr>
     </w:lvl>
     <w:lvl w:ilvl="6">
       <w:numFmt w:val="bullet"/>
-      <w:lvlText w:val="•"/>
+      <w:lvlText w:val=""/>
       <w:lvlJc w:val="left"/>
       <w:pPr>
-        <w:ind w:left="5040" w:hanging="480"/>
-      </w:pPr>
+        <w:ind w:left="5040" w:hanging="360"/>
+      </w:pPr>
+      <w:rPr>
+        <w:rFonts w:ascii="Symbol" w:hAnsi="Symbol" w:cs="Symbol" w:hint="default"/>
+      </w:rPr>
     </w:lvl>
     <w:lvl w:ilvl="7">
       <w:numFmt w:val="bullet"/>
-      <w:lvlText w:val="–"/>
+      <w:lvlText w:val="o"/>
       <w:lvlJc w:val="left"/>
       <w:pPr>
-        <w:ind w:left="5760" w:hanging="480"/>
-      </w:pPr>
+        <w:ind w:left="5760" w:hanging="360"/>
+      </w:pPr>
+      <w:rPr>
+        <w:rFonts w:ascii="Courier New" w:hAnsi="Courier New" w:cs="Courier New" w:hint="default"/>
+      </w:rPr>
     </w:lvl>
     <w:lvl w:ilvl="8">
       <w:numFmt w:val="bullet"/>
-      <w:lvlText w:val="•"/>
+      <w:lvlText w:val=""/>
       <w:lvlJc w:val="left"/>
       <w:pPr>
-        <w:ind w:left="6480" w:hanging="480"/>
-      </w:pPr>
+        <w:ind w:left="6480" w:hanging="360"/>
+      </w:pPr>
+      <w:rPr>
+        <w:rFonts w:ascii="Wingdings" w:hAnsi="Wingdings" w:cs="Wingdings" w:hint="default"/>
+      </w:rPr>
     </w:lvl>
   </w:abstractNum>
   <w:num w:numId="1000">
@@ -4927,6 +5240,9 @@
   <w:num w:numId="1013">
     <w:abstractNumId w:val="991"/>
   </w:num>
+  <w:num w:numId="1014">
+    <w:abstractNumId w:val="991"/>
+  </w:num>
 </w:numbering>
 </file>
 
@@ -5606,8 +5922,8 @@
     <w:name w:val="KeywordTok"/>
     <w:basedOn w:val="VerbatimChar"/>
     <w:rPr>
+      <w:b/>
       <w:color w:val="007020"/>
-      <w:b/>
     </w:rPr>
   </w:style>
   <w:style w:type="character" w:customStyle="1" w:styleId="DataTypeTok">
@@ -5684,42 +6000,42 @@
     <w:name w:val="ImportTok"/>
     <w:basedOn w:val="VerbatimChar"/>
     <w:rPr>
+      <w:b/>
       <w:color w:val="008000"/>
-      <w:b/>
     </w:rPr>
   </w:style>
   <w:style w:type="character" w:customStyle="1" w:styleId="CommentTok">
     <w:name w:val="CommentTok"/>
     <w:basedOn w:val="VerbatimChar"/>
     <w:rPr>
+      <w:i/>
       <w:color w:val="60a0b0"/>
-      <w:i/>
     </w:rPr>
   </w:style>
   <w:style w:type="character" w:customStyle="1" w:styleId="DocumentationTok">
     <w:name w:val="DocumentationTok"/>
     <w:basedOn w:val="VerbatimChar"/>
     <w:rPr>
+      <w:i/>
       <w:color w:val="ba2121"/>
-      <w:i/>
     </w:rPr>
   </w:style>
   <w:style w:type="character" w:customStyle="1" w:styleId="AnnotationTok">
     <w:name w:val="AnnotationTok"/>
     <w:basedOn w:val="VerbatimChar"/>
     <w:rPr>
-      <w:color w:val="60a0b0"/>
       <w:b/>
       <w:i/>
+      <w:color w:val="60a0b0"/>
     </w:rPr>
   </w:style>
   <w:style w:type="character" w:customStyle="1" w:styleId="CommentVarTok">
     <w:name w:val="CommentVarTok"/>
     <w:basedOn w:val="VerbatimChar"/>
     <w:rPr>
-      <w:color w:val="60a0b0"/>
       <w:b/>
       <w:i/>
+      <w:color w:val="60a0b0"/>
     </w:rPr>
   </w:style>
   <w:style w:type="character" w:customStyle="1" w:styleId="OtherTok">
@@ -5747,8 +6063,8 @@
     <w:name w:val="ControlFlowTok"/>
     <w:basedOn w:val="VerbatimChar"/>
     <w:rPr>
+      <w:b/>
       <w:color w:val="007020"/>
-      <w:b/>
     </w:rPr>
   </w:style>
   <w:style w:type="character" w:customStyle="1" w:styleId="OperatorTok">
@@ -5793,34 +6109,34 @@
     <w:name w:val="InformationTok"/>
     <w:basedOn w:val="VerbatimChar"/>
     <w:rPr>
-      <w:color w:val="60a0b0"/>
       <w:b/>
       <w:i/>
+      <w:color w:val="60a0b0"/>
     </w:rPr>
   </w:style>
   <w:style w:type="character" w:customStyle="1" w:styleId="WarningTok">
     <w:name w:val="WarningTok"/>
     <w:basedOn w:val="VerbatimChar"/>
     <w:rPr>
-      <w:color w:val="60a0b0"/>
       <w:b/>
       <w:i/>
+      <w:color w:val="60a0b0"/>
     </w:rPr>
   </w:style>
   <w:style w:type="character" w:customStyle="1" w:styleId="AlertTok">
     <w:name w:val="AlertTok"/>
     <w:basedOn w:val="VerbatimChar"/>
     <w:rPr>
+      <w:b/>
       <w:color w:val="ff0000"/>
-      <w:b/>
     </w:rPr>
   </w:style>
   <w:style w:type="character" w:customStyle="1" w:styleId="ErrorTok">
     <w:name w:val="ErrorTok"/>
     <w:basedOn w:val="VerbatimChar"/>
     <w:rPr>
+      <w:b/>
       <w:color w:val="ff0000"/>
-      <w:b/>
     </w:rPr>
   </w:style>
   <w:style w:type="character" w:customStyle="1" w:styleId="NormalTok">

</xml_diff>

<commit_message>
docs: refine referral decision guide labels and download layout
</commit_message>
<xml_diff>
--- a/packages/docs/static/decision-guides/referrals.docx
+++ b/packages/docs/static/decision-guides/referrals.docx
@@ -1802,8 +1802,8 @@
         <w:tblLook w:firstRow="1" w:lastRow="0" w:firstColumn="0" w:lastColumn="0" w:noHBand="0" w:noVBand="0" w:val="0020"/>
       </w:tblPr>
       <w:tblGrid>
-        <w:gridCol w:w="4128"/>
-        <w:gridCol w:w="5232"/>
+        <w:gridCol w:w="3702"/>
+        <w:gridCol w:w="5658"/>
       </w:tblGrid>
       <w:tr>
         <w:trPr>
@@ -1985,7 +1985,7 @@
               <w:jc w:val="left"/>
             </w:pPr>
             <w:r>
-              <w:t xml:space="preserve">Default – signed at send</w:t>
+              <w:t xml:space="preserve">Released order</w:t>
             </w:r>
           </w:p>
         </w:tc>
@@ -2044,7 +2044,7 @@
               <w:jc w:val="left"/>
             </w:pPr>
             <w:r>
-              <w:t xml:space="preserve">Draft before release (less common)</w:t>
+              <w:t xml:space="preserve">Draft before release</w:t>
             </w:r>
           </w:p>
         </w:tc>
@@ -3762,8 +3762,8 @@
         <w:tblLook w:firstRow="1" w:lastRow="0" w:firstColumn="0" w:lastColumn="0" w:noHBand="0" w:noVBand="0" w:val="0020"/>
       </w:tblPr>
       <w:tblGrid>
-        <w:gridCol w:w="1754"/>
-        <w:gridCol w:w="7606"/>
+        <w:gridCol w:w="4317"/>
+        <w:gridCol w:w="5043"/>
       </w:tblGrid>
       <w:tr>
         <w:trPr>
@@ -3976,13 +3976,13 @@
               <w:rPr>
                 <w:rStyle w:val="VerbatimChar"/>
               </w:rPr>
-              <w:t xml:space="preserve">CoverageEligibilityResponse.insurance.item.authorizationRequired</w:t>
-            </w:r>
-            <w:r>
-              <w:t xml:space="preserve"> </w:t>
-            </w:r>
-            <w:r>
-              <w:t xml:space="preserve">and supporting requirements under the payer contract.</w:t>
+              <w:t xml:space="preserve">authorizationRequired</w:t>
+            </w:r>
+            <w:r>
+              <w:t xml:space="preserve"> </w:t>
+            </w:r>
+            <w:r>
+              <w:t xml:space="preserve">in the response’s insurance items and supporting requirements under the payer contract.</w:t>
             </w:r>
           </w:p>
         </w:tc>
@@ -4043,7 +4043,7 @@
               <w:jc w:val="left"/>
             </w:pPr>
             <w:r>
-              <w:t xml:space="preserve">Gate scheduling on authorization</w:t>
+              <w:t xml:space="preserve">Authorization gate</w:t>
             </w:r>
           </w:p>
         </w:tc>

</xml_diff>

<commit_message>
docs: cover referral scheduling outcomes and billing handoffs
Signed-off-by: Everett Williams <everett@medplum.com>
</commit_message>
<xml_diff>
--- a/packages/docs/static/decision-guides/referrals.docx
+++ b/packages/docs/static/decision-guides/referrals.docx
@@ -11,18 +11,18 @@
           <wp:inline>
             <wp:extent cx="5943600" cy="1289649"/>
             <wp:effectExtent b="0" l="0" r="0" t="0"/>
-            <wp:docPr descr="Medplum" title="" id="21" name="Picture"/>
+            <wp:docPr descr="Medplum" title="" id="10" name="Picture"/>
             <a:graphic>
               <a:graphicData uri="http://schemas.openxmlformats.org/drawingml/2006/picture">
                 <pic:pic>
                   <pic:nvPicPr>
-                    <pic:cNvPr descr="medplum-wordmark-grape.png" id="22" name="Picture"/>
+                    <pic:cNvPr descr="medplum-wordmark-grape.png" id="11" name="Picture"/>
                     <pic:cNvPicPr>
                       <a:picLocks noChangeArrowheads="1" noChangeAspect="1"/>
                     </pic:cNvPicPr>
                   </pic:nvPicPr>
                   <pic:blipFill>
-                    <a:blip r:embed="rId20"/>
+                    <a:blip r:embed="rId9"/>
                     <a:stretch>
                       <a:fillRect/>
                     </a:stretch>
@@ -49,7 +49,7 @@
         </w:drawing>
       </w:r>
     </w:p>
-    <w:bookmarkStart w:id="50" w:name="referrals-decision-guide"/>
+    <w:bookmarkStart w:id="42" w:name="referrals-decision-guide"/>
     <w:p>
       <w:pPr>
         <w:pStyle w:val="Heading1"/>
@@ -64,39 +64,39 @@
       </w:pPr>
       <w:r>
         <w:rPr>
+          <w:i/>
           <w:iCs/>
-          <w:i/>
         </w:rPr>
         <w:t xml:space="preserve">Companion to the</w:t>
       </w:r>
       <w:r>
         <w:rPr>
+          <w:i/>
           <w:iCs/>
-          <w:i/>
         </w:rPr>
         <w:t xml:space="preserve"> </w:t>
       </w:r>
-      <w:hyperlink r:id="rId23">
+      <w:hyperlink r:id="rId12">
         <w:r>
           <w:rPr>
             <w:rStyle w:val="Hyperlink"/>
+            <w:i/>
             <w:iCs/>
-            <w:i/>
           </w:rPr>
           <w:t xml:space="preserve">Referrals</w:t>
         </w:r>
       </w:hyperlink>
       <w:r>
         <w:rPr>
+          <w:i/>
           <w:iCs/>
-          <w:i/>
         </w:rPr>
         <w:t xml:space="preserve"> </w:t>
       </w:r>
       <w:r>
         <w:rPr>
+          <w:i/>
           <w:iCs/>
-          <w:i/>
         </w:rPr>
         <w:t xml:space="preserve">docs.</w:t>
       </w:r>
@@ -109,7 +109,7 @@
         <w:t xml:space="preserve">A referral needs more than a send button. Use this guide with your clinical and operations teams to decide who owns each step, what the receiving team needs, and how you will know the loop is closed.</w:t>
       </w:r>
     </w:p>
-    <w:bookmarkStart w:id="24" w:name="section-1-use-case-participants"/>
+    <w:bookmarkStart w:id="14" w:name="section-1-use-case-participants"/>
     <w:p>
       <w:pPr>
         <w:pStyle w:val="Heading2"/>
@@ -124,43 +124,43 @@
       </w:pPr>
       <w:r>
         <w:rPr>
+          <w:b/>
           <w:bCs/>
-          <w:b/>
         </w:rPr>
         <w:t xml:space="preserve">1.1 Which side(s) of the referral lifecycle do you build for?</w:t>
       </w:r>
     </w:p>
     <w:p>
       <w:pPr>
+        <w:pStyle w:val="Compact"/>
         <w:numPr>
           <w:ilvl w:val="0"/>
           <w:numId w:val="1001"/>
         </w:numPr>
+      </w:pPr>
+      <w:r>
+        <w:t xml:space="preserve">Outbound only – you originate referrals to others</w:t>
+      </w:r>
+    </w:p>
+    <w:p>
+      <w:pPr>
         <w:pStyle w:val="Compact"/>
-      </w:pPr>
-      <w:r>
-        <w:t xml:space="preserve">Outbound only – you originate referrals to others</w:t>
-      </w:r>
-    </w:p>
-    <w:p>
-      <w:pPr>
         <w:numPr>
           <w:ilvl w:val="0"/>
           <w:numId w:val="1001"/>
         </w:numPr>
+      </w:pPr>
+      <w:r>
+        <w:t xml:space="preserve">Inbound only – you receive referrals from others</w:t>
+      </w:r>
+    </w:p>
+    <w:p>
+      <w:pPr>
         <w:pStyle w:val="Compact"/>
-      </w:pPr>
-      <w:r>
-        <w:t xml:space="preserve">Inbound only – you receive referrals from others</w:t>
-      </w:r>
-    </w:p>
-    <w:p>
-      <w:pPr>
         <w:numPr>
           <w:ilvl w:val="0"/>
           <w:numId w:val="1001"/>
         </w:numPr>
-        <w:pStyle w:val="Compact"/>
       </w:pPr>
       <w:r>
         <w:t xml:space="preserve">Both</w:t>
@@ -172,8 +172,8 @@
       </w:pPr>
       <w:r>
         <w:rPr>
+          <w:i/>
           <w:iCs/>
-          <w:i/>
         </w:rPr>
         <w:t xml:space="preserve">Why: determines which Section 3 deep dives apply.</w:t>
       </w:r>
@@ -184,43 +184,43 @@
       </w:pPr>
       <w:r>
         <w:rPr>
+          <w:b/>
           <w:bCs/>
-          <w:b/>
         </w:rPr>
         <w:t xml:space="preserve">1.2 Who interacts with referrals, and is the patient part of the workflow?</w:t>
       </w:r>
     </w:p>
     <w:p>
       <w:pPr>
+        <w:pStyle w:val="Compact"/>
         <w:numPr>
           <w:ilvl w:val="0"/>
           <w:numId w:val="1002"/>
         </w:numPr>
+      </w:pPr>
+      <w:r>
+        <w:t xml:space="preserve">Sending side: which roles author, edit, and send referrals (clinicians, MAs, coordinators, intake staff)?</w:t>
+      </w:r>
+    </w:p>
+    <w:p>
+      <w:pPr>
         <w:pStyle w:val="Compact"/>
-      </w:pPr>
-      <w:r>
-        <w:t xml:space="preserve">Sending side: which roles author, edit, and send referrals (clinicians, MAs, coordinators, intake staff)?</w:t>
-      </w:r>
-    </w:p>
-    <w:p>
-      <w:pPr>
         <w:numPr>
           <w:ilvl w:val="0"/>
           <w:numId w:val="1002"/>
         </w:numPr>
+      </w:pPr>
+      <w:r>
+        <w:t xml:space="preserve">Receiving side: which roles triage, accept, and work referrals on intake?</w:t>
+      </w:r>
+    </w:p>
+    <w:p>
+      <w:pPr>
         <w:pStyle w:val="Compact"/>
-      </w:pPr>
-      <w:r>
-        <w:t xml:space="preserve">Receiving side: which roles triage, accept, and work referrals on intake?</w:t>
-      </w:r>
-    </w:p>
-    <w:p>
-      <w:pPr>
         <w:numPr>
           <w:ilvl w:val="0"/>
           <w:numId w:val="1002"/>
         </w:numPr>
-        <w:pStyle w:val="Compact"/>
       </w:pPr>
       <w:r>
         <w:t xml:space="preserve">Patient: do patients see referrals, get notified, or take action (e.g. view in portal, self-schedule, decline)?</w:t>
@@ -232,8 +232,8 @@
       </w:pPr>
       <w:r>
         <w:rPr>
+          <w:i/>
           <w:iCs/>
-          <w:i/>
         </w:rPr>
         <w:t xml:space="preserve">Why: drives how forms are designed (3.2), who notes are written for (3.4), who owns the work (3.7), and whether patient-facing content is in scope.</w:t>
       </w:r>
@@ -244,55 +244,55 @@
       </w:pPr>
       <w:r>
         <w:rPr>
+          <w:b/>
           <w:bCs/>
-          <w:b/>
         </w:rPr>
         <w:t xml:space="preserve">1.3 Where do receiving providers live relative to your tenant?</w:t>
       </w:r>
     </w:p>
     <w:p>
       <w:pPr>
+        <w:pStyle w:val="Compact"/>
         <w:numPr>
           <w:ilvl w:val="0"/>
           <w:numId w:val="1003"/>
         </w:numPr>
+      </w:pPr>
+      <w:r>
+        <w:t xml:space="preserve">Inside your tenant only</w:t>
+      </w:r>
+    </w:p>
+    <w:p>
+      <w:pPr>
         <w:pStyle w:val="Compact"/>
-      </w:pPr>
-      <w:r>
-        <w:t xml:space="preserve">Inside your tenant only</w:t>
-      </w:r>
-    </w:p>
-    <w:p>
-      <w:pPr>
         <w:numPr>
           <w:ilvl w:val="0"/>
           <w:numId w:val="1003"/>
         </w:numPr>
+      </w:pPr>
+      <w:r>
+        <w:t xml:space="preserve">Partner tenants or organizations</w:t>
+      </w:r>
+    </w:p>
+    <w:p>
+      <w:pPr>
         <w:pStyle w:val="Compact"/>
-      </w:pPr>
-      <w:r>
-        <w:t xml:space="preserve">Partner tenants or organizations</w:t>
-      </w:r>
-    </w:p>
-    <w:p>
-      <w:pPr>
         <w:numPr>
           <w:ilvl w:val="0"/>
           <w:numId w:val="1003"/>
         </w:numPr>
+      </w:pPr>
+      <w:r>
+        <w:t xml:space="preserve">External organizations without FHIR connectivity</w:t>
+      </w:r>
+    </w:p>
+    <w:p>
+      <w:pPr>
         <w:pStyle w:val="Compact"/>
-      </w:pPr>
-      <w:r>
-        <w:t xml:space="preserve">External organizations without FHIR connectivity</w:t>
-      </w:r>
-    </w:p>
-    <w:p>
-      <w:pPr>
         <w:numPr>
           <w:ilvl w:val="0"/>
           <w:numId w:val="1003"/>
         </w:numPr>
-        <w:pStyle w:val="Compact"/>
       </w:pPr>
       <w:r>
         <w:t xml:space="preserve">Some combination</w:t>
@@ -304,8 +304,8 @@
       </w:pPr>
       <w:r>
         <w:rPr>
+          <w:i/>
           <w:iCs/>
-          <w:i/>
         </w:rPr>
         <w:t xml:space="preserve">Why: drives how recipients are stored and selected (3.3), and which outbound channels you support (3.5).</w:t>
       </w:r>
@@ -315,44 +315,66 @@
         <w:pStyle w:val="BodyText"/>
       </w:pPr>
       <w:r>
+        <w:t xml:space="preserve">For teams sharing one project, create receiving work against the shared ServiceRequest directly. Add transmission and identifier reconciliation when records cross systems. See</w:t>
+      </w:r>
+      <w:r>
+        <w:t xml:space="preserve"> </w:t>
+      </w:r>
+      <w:hyperlink r:id="rId13">
+        <w:r>
+          <w:rPr>
+            <w:rStyle w:val="Hyperlink"/>
+          </w:rPr>
+          <w:t xml:space="preserve">internal and external referrals</w:t>
+        </w:r>
+      </w:hyperlink>
+      <w:r>
+        <w:t xml:space="preserve">.</w:t>
+      </w:r>
+    </w:p>
+    <w:p>
+      <w:pPr>
+        <w:pStyle w:val="BodyText"/>
+      </w:pPr>
+      <w:r>
         <w:rPr>
+          <w:b/>
           <w:bCs/>
-          <w:b/>
         </w:rPr>
         <w:t xml:space="preserve">1.4 Is this a new build or replacing/extending something, and what other systems must it work with?</w:t>
       </w:r>
     </w:p>
     <w:p>
       <w:pPr>
+        <w:pStyle w:val="Compact"/>
         <w:numPr>
           <w:ilvl w:val="0"/>
           <w:numId w:val="1004"/>
         </w:numPr>
+      </w:pPr>
+      <w:r>
+        <w:t xml:space="preserve">If replacing: what system or workflow, and what gaps drove the change?</w:t>
+      </w:r>
+    </w:p>
+    <w:p>
+      <w:pPr>
         <w:pStyle w:val="Compact"/>
-      </w:pPr>
-      <w:r>
-        <w:t xml:space="preserve">If replacing: what system or workflow, and what gaps drove the change?</w:t>
-      </w:r>
-    </w:p>
-    <w:p>
-      <w:pPr>
         <w:numPr>
           <w:ilvl w:val="0"/>
           <w:numId w:val="1004"/>
         </w:numPr>
+      </w:pPr>
+      <w:r>
+        <w:t xml:space="preserve">If new: is referrals central to the product or additive?</w:t>
+      </w:r>
+    </w:p>
+    <w:p>
+      <w:pPr>
         <w:pStyle w:val="Compact"/>
-      </w:pPr>
-      <w:r>
-        <w:t xml:space="preserve">If new: is referrals central to the product or additive?</w:t>
-      </w:r>
-    </w:p>
-    <w:p>
-      <w:pPr>
         <w:numPr>
           <w:ilvl w:val="0"/>
           <w:numId w:val="1004"/>
         </w:numPr>
-        <w:pStyle w:val="Compact"/>
       </w:pPr>
       <w:r>
         <w:t xml:space="preserve">What other systems will referrals flow to or from (source EHR, downstream EHRs at receivers, billing, HIE, payer portals, include DirectMessage)?</w:t>
@@ -364,8 +386,8 @@
       </w:pPr>
       <w:r>
         <w:rPr>
+          <w:i/>
           <w:iCs/>
-          <w:i/>
         </w:rPr>
         <w:t xml:space="preserve">Why: surfaces migration needs and integration boundaries that affect outbound channels (3.5), inbound intake (3.6), and matching of patient and provider records across systems.</w:t>
       </w:r>
@@ -377,8 +399,8 @@
         </w:pict>
       </w:r>
     </w:p>
-    <w:bookmarkEnd w:id="24"/>
-    <w:bookmarkStart w:id="25" w:name="section-2-feature-scoping"/>
+    <w:bookmarkEnd w:id="14"/>
+    <w:bookmarkStart w:id="15" w:name="section-2-feature-scoping"/>
     <w:p>
       <w:pPr>
         <w:pStyle w:val="Heading2"/>
@@ -393,8 +415,8 @@
       </w:pPr>
       <w:r>
         <w:rPr>
+          <w:i/>
           <w:iCs/>
-          <w:i/>
         </w:rPr>
         <w:t xml:space="preserve">Go through each row together. For each cell under Yes / No / Nice-to-have / Not sure, mark the customer’s answer. The</w:t>
       </w:r>
@@ -403,8 +425,8 @@
       </w:r>
       <w:r>
         <w:rPr>
+          <w:b/>
           <w:bCs/>
-          <w:b/>
         </w:rPr>
         <w:t xml:space="preserve">§</w:t>
       </w:r>
@@ -413,8 +435,8 @@
       </w:r>
       <w:r>
         <w:rPr>
+          <w:i/>
           <w:iCs/>
-          <w:i/>
         </w:rPr>
         <w:t xml:space="preserve">column points to the deep-dive subsection that covers each feature.</w:t>
       </w:r>
@@ -423,9 +445,8 @@
       <w:tblPr>
         <w:tblStyle w:val="Table"/>
         <w:tblW w:w="9360" w:type="dxa"/>
+        <w:tblLayout w:type="fixed"/>
         <w:tblLook w:firstRow="1" w:lastRow="0" w:firstColumn="0" w:lastColumn="0" w:noHBand="0" w:noVBand="0" w:val="0020"/>
-        <w:jc w:val="start"/>
-        <w:tblLayout w:type="fixed"/>
       </w:tblPr>
       <w:tblGrid>
         <w:gridCol w:w="600"/>
@@ -439,7 +460,7 @@
       <w:tr>
         <w:trPr>
           <w:cantSplit/>
-          <w:tblHeader w:val="true"/>
+          <w:tblHeader w:val="on"/>
         </w:trPr>
         <w:tc>
           <w:tcPr/>
@@ -1410,8 +1431,8 @@
         </w:pict>
       </w:r>
     </w:p>
-    <w:bookmarkEnd w:id="25"/>
-    <w:bookmarkStart w:id="40" w:name="section-3-feature-deep-dives"/>
+    <w:bookmarkEnd w:id="15"/>
+    <w:bookmarkStart w:id="32" w:name="section-3-feature-deep-dives"/>
     <w:p>
       <w:pPr>
         <w:pStyle w:val="Heading2"/>
@@ -1426,8 +1447,8 @@
       </w:pPr>
       <w:r>
         <w:rPr>
+          <w:i/>
           <w:iCs/>
-          <w:i/>
         </w:rPr>
         <w:t xml:space="preserve">Cover each feature flagged Yes or Nice-to-have in Section 2. The goal is to land on a clear recommended approach by the end of each section.</w:t>
       </w:r>
@@ -1444,9 +1465,8 @@
       <w:tblPr>
         <w:tblStyle w:val="Table"/>
         <w:tblW w:w="9360" w:type="dxa"/>
+        <w:tblLayout w:type="fixed"/>
         <w:tblLook w:firstRow="1" w:lastRow="0" w:firstColumn="0" w:lastColumn="0" w:noHBand="0" w:noVBand="0" w:val="0020"/>
-        <w:jc w:val="start"/>
-        <w:tblLayout w:type="fixed"/>
       </w:tblPr>
       <w:tblGrid>
         <w:gridCol w:w="2949"/>
@@ -1456,7 +1476,7 @@
       <w:tr>
         <w:trPr>
           <w:cantSplit/>
-          <w:tblHeader w:val="true"/>
+          <w:tblHeader w:val="on"/>
         </w:trPr>
         <w:tc>
           <w:tcPr/>
@@ -1508,8 +1528,8 @@
             </w:pPr>
             <w:r>
               <w:rPr>
+                <w:b/>
                 <w:bCs/>
-                <w:b/>
               </w:rPr>
               <w:t xml:space="preserve">Referral Resource</w:t>
             </w:r>
@@ -1553,8 +1573,8 @@
             </w:pPr>
             <w:r>
               <w:rPr>
+                <w:b/>
                 <w:bCs/>
-                <w:b/>
               </w:rPr>
               <w:t xml:space="preserve">Sending Referrals</w:t>
             </w:r>
@@ -1598,8 +1618,8 @@
             </w:pPr>
             <w:r>
               <w:rPr>
+                <w:b/>
                 <w:bCs/>
-                <w:b/>
               </w:rPr>
               <w:t xml:space="preserve">Receiving Referrals</w:t>
             </w:r>
@@ -1643,8 +1663,8 @@
             </w:pPr>
             <w:r>
               <w:rPr>
+                <w:b/>
                 <w:bCs/>
-                <w:b/>
               </w:rPr>
               <w:t xml:space="preserve">Lifecycle &amp; Processing</w:t>
             </w:r>
@@ -1683,7 +1703,7 @@
         </w:pict>
       </w:r>
     </w:p>
-    <w:bookmarkStart w:id="27" w:name="referral-resource"/>
+    <w:bookmarkStart w:id="17" w:name="referral-resource"/>
     <w:p>
       <w:pPr>
         <w:pStyle w:val="Heading3"/>
@@ -1692,7 +1712,7 @@
         <w:t xml:space="preserve">Referral Resource</w:t>
       </w:r>
     </w:p>
-    <w:bookmarkStart w:id="26" w:name="Xb0bdbd08579c1f967880fdff649612da87f6791"/>
+    <w:bookmarkStart w:id="16" w:name="Xb0bdbd08579c1f967880fdff649612da87f6791"/>
     <w:p>
       <w:pPr>
         <w:pStyle w:val="Heading4"/>
@@ -1742,55 +1762,55 @@
       </w:pPr>
       <w:r>
         <w:rPr>
+          <w:b/>
           <w:bCs/>
-          <w:b/>
         </w:rPr>
         <w:t xml:space="preserve">Questions:</w:t>
       </w:r>
     </w:p>
     <w:p>
       <w:pPr>
+        <w:pStyle w:val="Compact"/>
         <w:numPr>
           <w:ilvl w:val="0"/>
           <w:numId w:val="1005"/>
         </w:numPr>
+      </w:pPr>
+      <w:r>
+        <w:t xml:space="preserve">How do you classify referrals (specialty, service, program), using standard codes, your own list, or both?</w:t>
+      </w:r>
+    </w:p>
+    <w:p>
+      <w:pPr>
         <w:pStyle w:val="Compact"/>
-      </w:pPr>
-      <w:r>
-        <w:t xml:space="preserve">How do you classify referrals (specialty, service, program), using standard codes, your own list, or both?</w:t>
-      </w:r>
-    </w:p>
-    <w:p>
-      <w:pPr>
         <w:numPr>
           <w:ilvl w:val="0"/>
           <w:numId w:val="1005"/>
         </w:numPr>
+      </w:pPr>
+      <w:r>
+        <w:t xml:space="preserve">What urgency options do users pick, and should they match triage and reporting?</w:t>
+      </w:r>
+    </w:p>
+    <w:p>
+      <w:pPr>
         <w:pStyle w:val="Compact"/>
-      </w:pPr>
-      <w:r>
-        <w:t xml:space="preserve">What urgency options do users pick, and should they match triage and reporting?</w:t>
-      </w:r>
-    </w:p>
-    <w:p>
-      <w:pPr>
         <w:numPr>
           <w:ilvl w:val="0"/>
           <w:numId w:val="1005"/>
         </w:numPr>
+      </w:pPr>
+      <w:r>
+        <w:t xml:space="preserve">Do you show a referral number or reference beyond the system id?</w:t>
+      </w:r>
+    </w:p>
+    <w:p>
+      <w:pPr>
         <w:pStyle w:val="Compact"/>
-      </w:pPr>
-      <w:r>
-        <w:t xml:space="preserve">Do you show a referral number or reference beyond the system id?</w:t>
-      </w:r>
-    </w:p>
-    <w:p>
-      <w:pPr>
         <w:numPr>
           <w:ilvl w:val="0"/>
           <w:numId w:val="1005"/>
         </w:numPr>
-        <w:pStyle w:val="Compact"/>
       </w:pPr>
       <w:r>
         <w:t xml:space="preserve">Is the referral final at send/commit, or do you need a draft first?</w:t>
@@ -1800,9 +1820,8 @@
       <w:tblPr>
         <w:tblStyle w:val="Table"/>
         <w:tblW w:w="9360" w:type="dxa"/>
+        <w:tblLayout w:type="fixed"/>
         <w:tblLook w:firstRow="1" w:lastRow="0" w:firstColumn="0" w:lastColumn="0" w:noHBand="0" w:noVBand="0" w:val="0020"/>
-        <w:jc w:val="start"/>
-        <w:tblLayout w:type="fixed"/>
       </w:tblPr>
       <w:tblGrid>
         <w:gridCol w:w="3702"/>
@@ -1811,7 +1830,7 @@
       <w:tr>
         <w:trPr>
           <w:cantSplit/>
-          <w:tblHeader w:val="true"/>
+          <w:tblHeader w:val="on"/>
         </w:trPr>
         <w:tc>
           <w:tcPr/>
@@ -2117,9 +2136,9 @@
         </w:pict>
       </w:r>
     </w:p>
-    <w:bookmarkEnd w:id="26"/>
-    <w:bookmarkEnd w:id="27"/>
-    <w:bookmarkStart w:id="32" w:name="sending-referrals"/>
+    <w:bookmarkEnd w:id="16"/>
+    <w:bookmarkEnd w:id="17"/>
+    <w:bookmarkStart w:id="22" w:name="sending-referrals"/>
     <w:p>
       <w:pPr>
         <w:pStyle w:val="Heading3"/>
@@ -2128,7 +2147,7 @@
         <w:t xml:space="preserve">Sending Referrals</w:t>
       </w:r>
     </w:p>
-    <w:bookmarkStart w:id="28" w:name="X65c95a5af791f3aa643664800650da6ad6cf96b"/>
+    <w:bookmarkStart w:id="18" w:name="X65c95a5af791f3aa643664800650da6ad6cf96b"/>
     <w:p>
       <w:pPr>
         <w:pStyle w:val="Heading4"/>
@@ -2151,43 +2170,43 @@
       </w:pPr>
       <w:r>
         <w:rPr>
+          <w:b/>
           <w:bCs/>
-          <w:b/>
         </w:rPr>
         <w:t xml:space="preserve">Questions:</w:t>
       </w:r>
     </w:p>
     <w:p>
       <w:pPr>
+        <w:pStyle w:val="Compact"/>
         <w:numPr>
           <w:ilvl w:val="0"/>
           <w:numId w:val="1006"/>
         </w:numPr>
+      </w:pPr>
+      <w:r>
+        <w:t xml:space="preserve">Do you use one referral intake flow for everyone, or different flows by specialty, service, or program?</w:t>
+      </w:r>
+    </w:p>
+    <w:p>
+      <w:pPr>
         <w:pStyle w:val="Compact"/>
-      </w:pPr>
-      <w:r>
-        <w:t xml:space="preserve">Do you use one referral intake flow for everyone, or different flows by specialty, service, or program?</w:t>
-      </w:r>
-    </w:p>
-    <w:p>
-      <w:pPr>
         <w:numPr>
           <w:ilvl w:val="0"/>
           <w:numId w:val="1006"/>
         </w:numPr>
+      </w:pPr>
+      <w:r>
+        <w:t xml:space="preserve">Which fields must be chosen from lists or structured inputs (e.g. specialty, recipient, urgency), which allow free text, and what is required before the referral can be sent?</w:t>
+      </w:r>
+    </w:p>
+    <w:p>
+      <w:pPr>
         <w:pStyle w:val="Compact"/>
-      </w:pPr>
-      <w:r>
-        <w:t xml:space="preserve">Which fields must be chosen from lists or structured inputs (e.g. specialty, recipient, urgency), which allow free text, and what is required before the referral can be sent?</w:t>
-      </w:r>
-    </w:p>
-    <w:p>
-      <w:pPr>
         <w:numPr>
           <w:ilvl w:val="0"/>
           <w:numId w:val="1006"/>
         </w:numPr>
-        <w:pStyle w:val="Compact"/>
       </w:pPr>
       <w:r>
         <w:t xml:space="preserve">Must every referral tie to the visit where it was created, or can referrals start without a linked visit (e.g. intake, triage, outreach)?</w:t>
@@ -2197,9 +2216,8 @@
       <w:tblPr>
         <w:tblStyle w:val="Table"/>
         <w:tblW w:w="9360" w:type="dxa"/>
+        <w:tblLayout w:type="fixed"/>
         <w:tblLook w:firstRow="1" w:lastRow="0" w:firstColumn="0" w:lastColumn="0" w:noHBand="0" w:noVBand="0" w:val="0020"/>
-        <w:jc w:val="start"/>
-        <w:tblLayout w:type="fixed"/>
       </w:tblPr>
       <w:tblGrid>
         <w:gridCol w:w="4433"/>
@@ -2208,7 +2226,7 @@
       <w:tr>
         <w:trPr>
           <w:cantSplit/>
-          <w:tblHeader w:val="true"/>
+          <w:tblHeader w:val="on"/>
         </w:trPr>
         <w:tc>
           <w:tcPr/>
@@ -2416,8 +2434,8 @@
         </w:pict>
       </w:r>
     </w:p>
-    <w:bookmarkEnd w:id="28"/>
-    <w:bookmarkStart w:id="29" w:name="recipient-directory-model"/>
+    <w:bookmarkEnd w:id="18"/>
+    <w:bookmarkStart w:id="19" w:name="recipient-directory-model"/>
     <w:p>
       <w:pPr>
         <w:pStyle w:val="Heading4"/>
@@ -2438,8 +2456,8 @@
       </w:r>
       <w:r>
         <w:rPr>
+          <w:i/>
           <w:iCs/>
-          <w:i/>
         </w:rPr>
         <w:t xml:space="preserve">to</w:t>
       </w:r>
@@ -2456,8 +2474,8 @@
       </w:pPr>
       <w:r>
         <w:rPr>
+          <w:b/>
           <w:bCs/>
-          <w:b/>
         </w:rPr>
         <w:t xml:space="preserve">⚠ One-way door:</w:t>
       </w:r>
@@ -2474,43 +2492,43 @@
       </w:pPr>
       <w:r>
         <w:rPr>
+          <w:b/>
           <w:bCs/>
-          <w:b/>
         </w:rPr>
         <w:t xml:space="preserve">Questions:</w:t>
       </w:r>
     </w:p>
     <w:p>
       <w:pPr>
+        <w:pStyle w:val="Compact"/>
         <w:numPr>
           <w:ilvl w:val="0"/>
           <w:numId w:val="1007"/>
         </w:numPr>
+      </w:pPr>
+      <w:r>
+        <w:t xml:space="preserve">Can a referral go to a specific clinician, to a site, department, or queue, or either, depending on referral type?</w:t>
+      </w:r>
+    </w:p>
+    <w:p>
+      <w:pPr>
         <w:pStyle w:val="Compact"/>
-      </w:pPr>
-      <w:r>
-        <w:t xml:space="preserve">Can a referral go to a specific clinician, to a site, department, or queue, or either, depending on referral type?</w:t>
-      </w:r>
-    </w:p>
-    <w:p>
-      <w:pPr>
         <w:numPr>
           <w:ilvl w:val="0"/>
           <w:numId w:val="1007"/>
         </w:numPr>
+      </w:pPr>
+      <w:r>
+        <w:t xml:space="preserve">Is your recipient directory edited and stored in Medplum, synced from another system, or mixed?</w:t>
+      </w:r>
+    </w:p>
+    <w:p>
+      <w:pPr>
         <w:pStyle w:val="Compact"/>
-      </w:pPr>
-      <w:r>
-        <w:t xml:space="preserve">Is your recipient directory edited and stored in Medplum, synced from another system, or mixed?</w:t>
-      </w:r>
-    </w:p>
-    <w:p>
-      <w:pPr>
         <w:numPr>
           <w:ilvl w:val="0"/>
           <w:numId w:val="1007"/>
         </w:numPr>
-        <w:pStyle w:val="Compact"/>
       </w:pPr>
       <w:r>
         <w:t xml:space="preserve">Should the recipient picker show or filter by in-network status for the patient’s coverage – and where does that network status come from (synced payer provider directory, internal preferred-provider list, or payer-specific eligibility evidence)?</w:t>
@@ -2520,9 +2538,8 @@
       <w:tblPr>
         <w:tblStyle w:val="Table"/>
         <w:tblW w:w="9360" w:type="dxa"/>
+        <w:tblLayout w:type="fixed"/>
         <w:tblLook w:firstRow="1" w:lastRow="0" w:firstColumn="0" w:lastColumn="0" w:noHBand="0" w:noVBand="0" w:val="0020"/>
-        <w:jc w:val="start"/>
-        <w:tblLayout w:type="fixed"/>
       </w:tblPr>
       <w:tblGrid>
         <w:gridCol w:w="3289"/>
@@ -2531,7 +2548,7 @@
       <w:tr>
         <w:trPr>
           <w:cantSplit/>
-          <w:tblHeader w:val="true"/>
+          <w:tblHeader w:val="on"/>
         </w:trPr>
         <w:tc>
           <w:tcPr/>
@@ -2726,8 +2743,8 @@
         </w:pict>
       </w:r>
     </w:p>
-    <w:bookmarkEnd w:id="29"/>
-    <w:bookmarkStart w:id="30" w:name="X46f28c5ff97a158951ae0082988a3c4fcc387b3"/>
+    <w:bookmarkEnd w:id="19"/>
+    <w:bookmarkStart w:id="20" w:name="X46f28c5ff97a158951ae0082988a3c4fcc387b3"/>
     <w:p>
       <w:pPr>
         <w:pStyle w:val="Heading4"/>
@@ -2750,31 +2767,31 @@
       </w:pPr>
       <w:r>
         <w:rPr>
+          <w:b/>
           <w:bCs/>
-          <w:b/>
         </w:rPr>
         <w:t xml:space="preserve">Questions:</w:t>
       </w:r>
     </w:p>
     <w:p>
       <w:pPr>
+        <w:pStyle w:val="Compact"/>
         <w:numPr>
           <w:ilvl w:val="0"/>
           <w:numId w:val="1008"/>
         </w:numPr>
+      </w:pPr>
+      <w:r>
+        <w:t xml:space="preserve">What clinical material must travel with the referral (reason for referral, problems or diagnoses, key meds and allergies, recent labs or imaging, coverage), and what should be filled in automatically versus selected or edited by the sender before send?</w:t>
+      </w:r>
+    </w:p>
+    <w:p>
+      <w:pPr>
         <w:pStyle w:val="Compact"/>
-      </w:pPr>
-      <w:r>
-        <w:t xml:space="preserve">What clinical material must travel with the referral (reason for referral, problems or diagnoses, key meds and allergies, recent labs or imaging, coverage), and what should be filled in automatically versus selected or edited by the sender before send?</w:t>
-      </w:r>
-    </w:p>
-    <w:p>
-      <w:pPr>
         <w:numPr>
           <w:ilvl w:val="0"/>
           <w:numId w:val="1008"/>
         </w:numPr>
-        <w:pStyle w:val="Compact"/>
       </w:pPr>
       <w:r>
         <w:t xml:space="preserve">Should internal staff-only notes appear on the referral, or only content intended for the receiving provider and the patient?</w:t>
@@ -2784,9 +2801,8 @@
       <w:tblPr>
         <w:tblStyle w:val="Table"/>
         <w:tblW w:w="9360" w:type="dxa"/>
+        <w:tblLayout w:type="fixed"/>
         <w:tblLook w:firstRow="1" w:lastRow="0" w:firstColumn="0" w:lastColumn="0" w:noHBand="0" w:noVBand="0" w:val="0020"/>
-        <w:jc w:val="start"/>
-        <w:tblLayout w:type="fixed"/>
       </w:tblPr>
       <w:tblGrid>
         <w:gridCol w:w="3935"/>
@@ -2795,7 +2811,7 @@
       <w:tr>
         <w:trPr>
           <w:cantSplit/>
-          <w:tblHeader w:val="true"/>
+          <w:tblHeader w:val="on"/>
         </w:trPr>
         <w:tc>
           <w:tcPr/>
@@ -2989,8 +3005,8 @@
         </w:pict>
       </w:r>
     </w:p>
-    <w:bookmarkEnd w:id="30"/>
-    <w:bookmarkStart w:id="31" w:name="Xf9322d90849e80499a5638125a4467cb3581eda"/>
+    <w:bookmarkEnd w:id="20"/>
+    <w:bookmarkStart w:id="21" w:name="Xf9322d90849e80499a5638125a4467cb3581eda"/>
     <w:p>
       <w:pPr>
         <w:pStyle w:val="Heading4"/>
@@ -3013,67 +3029,67 @@
       </w:pPr>
       <w:r>
         <w:rPr>
+          <w:b/>
           <w:bCs/>
-          <w:b/>
         </w:rPr>
         <w:t xml:space="preserve">Questions:</w:t>
       </w:r>
     </w:p>
     <w:p>
       <w:pPr>
+        <w:pStyle w:val="Compact"/>
         <w:numPr>
           <w:ilvl w:val="0"/>
           <w:numId w:val="1009"/>
         </w:numPr>
+      </w:pPr>
+      <w:r>
+        <w:t xml:space="preserve">Do any recipients accept referrals through structured exchange with your system, or only as documents (e.g. PDF or care-summary packages)?</w:t>
+      </w:r>
+    </w:p>
+    <w:p>
+      <w:pPr>
         <w:pStyle w:val="Compact"/>
-      </w:pPr>
-      <w:r>
-        <w:t xml:space="preserve">Do any recipients accept referrals through structured exchange with your system, or only as documents (e.g. PDF or care-summary packages)?</w:t>
-      </w:r>
-    </w:p>
-    <w:p>
-      <w:pPr>
         <w:numPr>
           <w:ilvl w:val="0"/>
           <w:numId w:val="1009"/>
         </w:numPr>
+      </w:pPr>
+      <w:r>
+        <w:t xml:space="preserve">What outbound channels do you plan to use? (e.g., secure email, fax, API?)</w:t>
+      </w:r>
+    </w:p>
+    <w:p>
+      <w:pPr>
         <w:pStyle w:val="Compact"/>
-      </w:pPr>
-      <w:r>
-        <w:t xml:space="preserve">What outbound channels do you plan to use? (e.g., secure email, fax, API?)</w:t>
-      </w:r>
-    </w:p>
-    <w:p>
-      <w:pPr>
         <w:numPr>
           <w:ilvl w:val="0"/>
           <w:numId w:val="1009"/>
         </w:numPr>
+      </w:pPr>
+      <w:r>
+        <w:t xml:space="preserve">For each outbound channel you plan to use, what do you actually send or generate – structured data export, PDF, care-summary document, or a mix?</w:t>
+      </w:r>
+    </w:p>
+    <w:p>
+      <w:pPr>
         <w:pStyle w:val="Compact"/>
-      </w:pPr>
-      <w:r>
-        <w:t xml:space="preserve">For each outbound channel you plan to use, what do you actually send or generate – structured data export, PDF, care-summary document, or a mix?</w:t>
-      </w:r>
-    </w:p>
-    <w:p>
-      <w:pPr>
         <w:numPr>
           <w:ilvl w:val="0"/>
           <w:numId w:val="1009"/>
         </w:numPr>
+      </w:pPr>
+      <w:r>
+        <w:t xml:space="preserve">Is the outbound channel the same for every recipient (e.g. always fax) or does it vary per recipient – and if it varies, where does that preference live (recipient directory, referral type, picked at send time)?</w:t>
+      </w:r>
+    </w:p>
+    <w:p>
+      <w:pPr>
         <w:pStyle w:val="Compact"/>
-      </w:pPr>
-      <w:r>
-        <w:t xml:space="preserve">Is the outbound channel the same for every recipient (e.g. always fax) or does it vary per recipient – and if it varies, where does that preference live (recipient directory, referral type, picked at send time)?</w:t>
-      </w:r>
-    </w:p>
-    <w:p>
-      <w:pPr>
         <w:numPr>
           <w:ilvl w:val="0"/>
           <w:numId w:val="1009"/>
         </w:numPr>
-        <w:pStyle w:val="Compact"/>
       </w:pPr>
       <w:r>
         <w:t xml:space="preserve">For each channel, do you need to confirm delivery, retry on failure, and show send history to staff – and what counts as</w:t>
@@ -3082,13 +3098,7 @@
         <w:t xml:space="preserve"> </w:t>
       </w:r>
       <w:r>
-        <w:t xml:space="preserve">“</w:t>
-      </w:r>
-      <w:r>
-        <w:t xml:space="preserve">successfully sent</w:t>
-      </w:r>
-      <w:r>
-        <w:t xml:space="preserve">”</w:t>
+        <w:t xml:space="preserve">“successfully sent”</w:t>
       </w:r>
       <w:r>
         <w:t xml:space="preserve">?</w:t>
@@ -3098,9 +3108,8 @@
       <w:tblPr>
         <w:tblStyle w:val="Table"/>
         <w:tblW w:w="9360" w:type="dxa"/>
+        <w:tblLayout w:type="fixed"/>
         <w:tblLook w:firstRow="1" w:lastRow="0" w:firstColumn="0" w:lastColumn="0" w:noHBand="0" w:noVBand="0" w:val="0020"/>
-        <w:jc w:val="start"/>
-        <w:tblLayout w:type="fixed"/>
       </w:tblPr>
       <w:tblGrid>
         <w:gridCol w:w="4369"/>
@@ -3109,7 +3118,7 @@
       <w:tr>
         <w:trPr>
           <w:cantSplit/>
-          <w:tblHeader w:val="true"/>
+          <w:tblHeader w:val="on"/>
         </w:trPr>
         <w:tc>
           <w:tcPr/>
@@ -3276,9 +3285,9 @@
         </w:pict>
       </w:r>
     </w:p>
-    <w:bookmarkEnd w:id="31"/>
-    <w:bookmarkEnd w:id="32"/>
-    <w:bookmarkStart w:id="34" w:name="receiving-referrals"/>
+    <w:bookmarkEnd w:id="21"/>
+    <w:bookmarkEnd w:id="22"/>
+    <w:bookmarkStart w:id="24" w:name="receiving-referrals"/>
     <w:p>
       <w:pPr>
         <w:pStyle w:val="Heading3"/>
@@ -3287,7 +3296,7 @@
         <w:t xml:space="preserve">Receiving Referrals</w:t>
       </w:r>
     </w:p>
-    <w:bookmarkStart w:id="33" w:name="inbound-intake-channels-ingestion"/>
+    <w:bookmarkStart w:id="23" w:name="inbound-intake-channels-ingestion"/>
     <w:p>
       <w:pPr>
         <w:pStyle w:val="Heading4"/>
@@ -3310,67 +3319,67 @@
       </w:pPr>
       <w:r>
         <w:rPr>
+          <w:b/>
           <w:bCs/>
-          <w:b/>
         </w:rPr>
         <w:t xml:space="preserve">Questions:</w:t>
       </w:r>
     </w:p>
     <w:p>
       <w:pPr>
+        <w:pStyle w:val="Compact"/>
         <w:numPr>
           <w:ilvl w:val="0"/>
           <w:numId w:val="1010"/>
         </w:numPr>
+      </w:pPr>
+      <w:r>
+        <w:t xml:space="preserve">Which channels feed referrals into your product (e.g. automated exchange with a partner, fax or scanned documents, imported files or care-summary packages, typed in by staff)?</w:t>
+      </w:r>
+    </w:p>
+    <w:p>
+      <w:pPr>
         <w:pStyle w:val="Compact"/>
-      </w:pPr>
-      <w:r>
-        <w:t xml:space="preserve">Which channels feed referrals into your product (e.g. automated exchange with a partner, fax or scanned documents, imported files or care-summary packages, typed in by staff)?</w:t>
-      </w:r>
-    </w:p>
-    <w:p>
-      <w:pPr>
         <w:numPr>
           <w:ilvl w:val="0"/>
           <w:numId w:val="1010"/>
         </w:numPr>
+      </w:pPr>
+      <w:r>
+        <w:t xml:space="preserve">For each channel, does a referral become active in your system automatically, or only after staff review or cleanup?</w:t>
+      </w:r>
+    </w:p>
+    <w:p>
+      <w:pPr>
         <w:pStyle w:val="Compact"/>
-      </w:pPr>
-      <w:r>
-        <w:t xml:space="preserve">For each channel, does a referral become active in your system automatically, or only after staff review or cleanup?</w:t>
-      </w:r>
-    </w:p>
-    <w:p>
-      <w:pPr>
         <w:numPr>
           <w:ilvl w:val="0"/>
           <w:numId w:val="1010"/>
         </w:numPr>
+      </w:pPr>
+      <w:r>
+        <w:t xml:space="preserve">When inbound patient information is incomplete or inconsistent, how do you find or confirm the correct patient record?</w:t>
+      </w:r>
+    </w:p>
+    <w:p>
+      <w:pPr>
         <w:pStyle w:val="Compact"/>
-      </w:pPr>
-      <w:r>
-        <w:t xml:space="preserve">When inbound patient information is incomplete or inconsistent, how do you find or confirm the correct patient record?</w:t>
-      </w:r>
-    </w:p>
-    <w:p>
-      <w:pPr>
         <w:numPr>
           <w:ilvl w:val="0"/>
           <w:numId w:val="1010"/>
         </w:numPr>
+      </w:pPr>
+      <w:r>
+        <w:t xml:space="preserve">After accepting (or declining) a new inbound referral, do you need to send an acknowledgment or response back to the originator – and through what path?</w:t>
+      </w:r>
+    </w:p>
+    <w:p>
+      <w:pPr>
         <w:pStyle w:val="Compact"/>
-      </w:pPr>
-      <w:r>
-        <w:t xml:space="preserve">After accepting (or declining) a new inbound referral, do you need to send an acknowledgment or response back to the originator – and through what path?</w:t>
-      </w:r>
-    </w:p>
-    <w:p>
-      <w:pPr>
         <w:numPr>
           <w:ilvl w:val="0"/>
           <w:numId w:val="1010"/>
         </w:numPr>
-        <w:pStyle w:val="Compact"/>
       </w:pPr>
       <w:r>
         <w:t xml:space="preserve">When the same referral arrives more than once (e.g. fax + secure inbox), how do you detect and handle duplicates?</w:t>
@@ -3380,9 +3389,8 @@
       <w:tblPr>
         <w:tblStyle w:val="Table"/>
         <w:tblW w:w="9360" w:type="dxa"/>
+        <w:tblLayout w:type="fixed"/>
         <w:tblLook w:firstRow="1" w:lastRow="0" w:firstColumn="0" w:lastColumn="0" w:noHBand="0" w:noVBand="0" w:val="0020"/>
-        <w:jc w:val="start"/>
-        <w:tblLayout w:type="fixed"/>
       </w:tblPr>
       <w:tblGrid>
         <w:gridCol w:w="4506"/>
@@ -3391,7 +3399,7 @@
       <w:tr>
         <w:trPr>
           <w:cantSplit/>
-          <w:tblHeader w:val="true"/>
+          <w:tblHeader w:val="on"/>
         </w:trPr>
         <w:tc>
           <w:tcPr/>
@@ -3478,8 +3486,8 @@
             </w:r>
             <w:r>
               <w:rPr>
+                <w:b/>
                 <w:bCs/>
-                <w:b/>
               </w:rPr>
               <w:t xml:space="preserve">parses</w:t>
             </w:r>
@@ -3494,8 +3502,8 @@
             </w:r>
             <w:r>
               <w:rPr>
+                <w:b/>
                 <w:bCs/>
-                <w:b/>
               </w:rPr>
               <w:t xml:space="preserve">maps</w:t>
             </w:r>
@@ -3552,8 +3560,8 @@
             </w:r>
             <w:r>
               <w:rPr>
+                <w:b/>
                 <w:bCs/>
-                <w:b/>
               </w:rPr>
               <w:t xml:space="preserve">not</w:t>
             </w:r>
@@ -3632,9 +3640,9 @@
         </w:pict>
       </w:r>
     </w:p>
-    <w:bookmarkEnd w:id="33"/>
-    <w:bookmarkEnd w:id="34"/>
-    <w:bookmarkStart w:id="39" w:name="lifecycle-processing"/>
+    <w:bookmarkEnd w:id="23"/>
+    <w:bookmarkEnd w:id="24"/>
+    <w:bookmarkStart w:id="31" w:name="lifecycle-processing"/>
     <w:p>
       <w:pPr>
         <w:pStyle w:val="Heading3"/>
@@ -3643,7 +3651,7 @@
         <w:t xml:space="preserve">Lifecycle &amp; Processing</w:t>
       </w:r>
     </w:p>
-    <w:bookmarkStart w:id="36" w:name="X631cc1c4d2323319b81d9dad87cfb8959152316"/>
+    <w:bookmarkStart w:id="28" w:name="X631cc1c4d2323319b81d9dad87cfb8959152316"/>
     <w:p>
       <w:pPr>
         <w:pStyle w:val="Heading4"/>
@@ -3666,32 +3674,32 @@
       </w:pPr>
       <w:r>
         <w:rPr>
+          <w:i/>
           <w:iCs/>
-          <w:i/>
         </w:rPr>
         <w:t xml:space="preserve">Note: Scheduling is covered in the</w:t>
       </w:r>
       <w:r>
         <w:rPr>
+          <w:i/>
           <w:iCs/>
-          <w:i/>
         </w:rPr>
         <w:t xml:space="preserve"> </w:t>
       </w:r>
-      <w:hyperlink r:id="rId35">
+      <w:hyperlink r:id="rId25">
         <w:r>
           <w:rPr>
             <w:rStyle w:val="Hyperlink"/>
+            <w:i/>
             <w:iCs/>
-            <w:i/>
           </w:rPr>
           <w:t xml:space="preserve">Scheduling Decision Guide</w:t>
         </w:r>
       </w:hyperlink>
       <w:r>
         <w:rPr>
+          <w:i/>
           <w:iCs/>
-          <w:i/>
         </w:rPr>
         <w:t xml:space="preserve">. This section stays at the level needed to align scheduling and authorization steps with the referral lifecycle.</w:t>
       </w:r>
@@ -3702,79 +3710,102 @@
       </w:pPr>
       <w:r>
         <w:rPr>
+          <w:b/>
           <w:bCs/>
-          <w:b/>
         </w:rPr>
         <w:t xml:space="preserve">Questions:</w:t>
       </w:r>
     </w:p>
     <w:p>
       <w:pPr>
+        <w:pStyle w:val="Compact"/>
         <w:numPr>
           <w:ilvl w:val="0"/>
           <w:numId w:val="1011"/>
         </w:numPr>
+      </w:pPr>
+      <w:r>
+        <w:t xml:space="preserve">Who picks up a new referral first – an intake pool, a department queue, or an assigned coordinator (+ how does assignment logic work) – and how is ownership tracked and reassigned over time?</w:t>
+      </w:r>
+    </w:p>
+    <w:p>
+      <w:pPr>
         <w:pStyle w:val="Compact"/>
-      </w:pPr>
-      <w:r>
-        <w:t xml:space="preserve">Who picks up a new referral first – an intake pool, a department queue, or an assigned coordinator (+ how does assignment logic work) – and how is ownership tracked and reassigned over time?</w:t>
-      </w:r>
-    </w:p>
-    <w:p>
-      <w:pPr>
         <w:numPr>
           <w:ilvl w:val="0"/>
           <w:numId w:val="1011"/>
         </w:numPr>
+      </w:pPr>
+      <w:r>
+        <w:t xml:space="preserve">Does the referral need to confirm in-network status or covered benefits for the patient’s plan before scheduling – and is that check separate from prior auth, or rolled into the same eligibility request?</w:t>
+      </w:r>
+    </w:p>
+    <w:p>
+      <w:pPr>
         <w:pStyle w:val="Compact"/>
-      </w:pPr>
-      <w:r>
-        <w:t xml:space="preserve">Does the referral need to confirm in-network status or covered benefits for the patient’s plan before scheduling – and is that check separate from prior auth, or rolled into the same eligibility request?</w:t>
-      </w:r>
-    </w:p>
-    <w:p>
-      <w:pPr>
         <w:numPr>
           <w:ilvl w:val="0"/>
           <w:numId w:val="1011"/>
         </w:numPr>
+      </w:pPr>
+      <w:r>
+        <w:t xml:space="preserve">Does the referral need to clear an authorization or coverage check before scheduling, and how do you track that authorization through to approval or denial?</w:t>
+      </w:r>
+    </w:p>
+    <w:p>
+      <w:pPr>
         <w:pStyle w:val="Compact"/>
-      </w:pPr>
-      <w:r>
-        <w:t xml:space="preserve">Does the referral need to clear an authorization or coverage check before scheduling, and how do you track that authorization through to approval or denial?</w:t>
-      </w:r>
-    </w:p>
-    <w:p>
-      <w:pPr>
         <w:numPr>
           <w:ilvl w:val="0"/>
           <w:numId w:val="1011"/>
         </w:numPr>
+      </w:pPr>
+      <w:r>
+        <w:t xml:space="preserve">When the referral becomes an actual visit (appointment, procedure, completed encounter), how do you tie that visit back to the originating referral?</w:t>
+      </w:r>
+    </w:p>
+    <w:p>
+      <w:pPr>
         <w:pStyle w:val="Compact"/>
-      </w:pPr>
-      <w:r>
-        <w:t xml:space="preserve">When the referral becomes an actual visit (appointment, procedure, completed encounter), how do you tie that visit back to the originating referral?</w:t>
-      </w:r>
-    </w:p>
-    <w:p>
-      <w:pPr>
         <w:numPr>
           <w:ilvl w:val="0"/>
           <w:numId w:val="1011"/>
         </w:numPr>
+      </w:pPr>
+      <w:r>
+        <w:t xml:space="preserve">Do you track aging or service-level expectations on open referrals (e.g. days since received, days pending an action), and how do staff find work that is overdue?</w:t>
+      </w:r>
+    </w:p>
+    <w:p>
+      <w:pPr>
         <w:pStyle w:val="Compact"/>
-      </w:pPr>
-      <w:r>
-        <w:t xml:space="preserve">Do you track aging or service-level expectations on open referrals (e.g. days since received, days pending an action), and how do staff find work that is overdue?</w:t>
+        <w:numPr>
+          <w:ilvl w:val="0"/>
+          <w:numId w:val="1011"/>
+        </w:numPr>
+      </w:pPr>
+      <w:r>
+        <w:t xml:space="preserve">What happens after unsuccessful outreach, a patient decline, a no-show, or expiration? Who can stop attempts, and how is the referrer informed?</w:t>
+      </w:r>
+    </w:p>
+    <w:p>
+      <w:pPr>
+        <w:pStyle w:val="Compact"/>
+        <w:numPr>
+          <w:ilvl w:val="0"/>
+          <w:numId w:val="1011"/>
+        </w:numPr>
+      </w:pPr>
+      <w:r>
+        <w:t xml:space="preserve">Which referral and authorization details must be available to billing, including effective dates and visit or unit limits?</w:t>
       </w:r>
     </w:p>
     <w:tbl>
       <w:tblPr>
         <w:tblStyle w:val="Table"/>
         <w:tblW w:w="9360" w:type="dxa"/>
+        <w:tblLayout w:type="fixed"/>
         <w:tblLook w:firstRow="1" w:lastRow="0" w:firstColumn="0" w:lastColumn="0" w:noHBand="0" w:noVBand="0" w:val="0020"/>
-        <w:jc w:val="start"/>
-        <w:tblLayout w:type="fixed"/>
       </w:tblPr>
       <w:tblGrid>
         <w:gridCol w:w="4317"/>
@@ -3783,7 +3814,7 @@
       <w:tr>
         <w:trPr>
           <w:cantSplit/>
-          <w:tblHeader w:val="true"/>
+          <w:tblHeader w:val="on"/>
         </w:trPr>
         <w:tc>
           <w:tcPr/>
@@ -4119,7 +4150,7 @@
             <w:r>
               <w:t xml:space="preserve"> </w:t>
             </w:r>
-            <w:hyperlink r:id="rId35">
+            <w:hyperlink r:id="rId25">
               <w:r>
                 <w:rPr>
                   <w:rStyle w:val="Hyperlink"/>
@@ -4145,6 +4176,108 @@
               <w:jc w:val="left"/>
             </w:pPr>
             <w:r>
+              <w:t xml:space="preserve">Unsuccessful scheduling</w:t>
+            </w:r>
+          </w:p>
+        </w:tc>
+        <w:tc>
+          <w:tcPr/>
+          <w:p>
+            <w:pPr>
+              <w:pStyle w:val="Compact"/>
+              <w:jc w:val="left"/>
+            </w:pPr>
+            <w:r>
+              <w:t xml:space="preserve">Record outreach against the referral, assign retry/stop decisions, and close each work item according to its scope. Report the disposition to the referring team; see</w:t>
+            </w:r>
+            <w:r>
+              <w:t xml:space="preserve"> </w:t>
+            </w:r>
+            <w:hyperlink r:id="rId26">
+              <w:r>
+                <w:rPr>
+                  <w:rStyle w:val="Hyperlink"/>
+                </w:rPr>
+                <w:t xml:space="preserve">unsuccessful scheduling</w:t>
+              </w:r>
+            </w:hyperlink>
+            <w:r>
+              <w:t xml:space="preserve">.</w:t>
+            </w:r>
+          </w:p>
+        </w:tc>
+      </w:tr>
+      <w:tr>
+        <w:trPr>
+          <w:cantSplit/>
+        </w:trPr>
+        <w:tc>
+          <w:tcPr/>
+          <w:p>
+            <w:pPr>
+              <w:pStyle w:val="Compact"/>
+              <w:jc w:val="left"/>
+            </w:pPr>
+            <w:r>
+              <w:t xml:space="preserve">Billing handoff</w:t>
+            </w:r>
+          </w:p>
+        </w:tc>
+        <w:tc>
+          <w:tcPr/>
+          <w:p>
+            <w:pPr>
+              <w:pStyle w:val="Compact"/>
+              <w:jc w:val="left"/>
+            </w:pPr>
+            <w:r>
+              <w:t xml:space="preserve">When required, use</w:t>
+            </w:r>
+            <w:r>
+              <w:t xml:space="preserve"> </w:t>
+            </w:r>
+            <w:r>
+              <w:rPr>
+                <w:rStyle w:val="VerbatimChar"/>
+              </w:rPr>
+              <w:t xml:space="preserve">Claim.referral</w:t>
+            </w:r>
+            <w:r>
+              <w:t xml:space="preserve"> </w:t>
+            </w:r>
+            <w:r>
+              <w:t xml:space="preserve">for the ServiceRequest and</w:t>
+            </w:r>
+            <w:r>
+              <w:t xml:space="preserve"> </w:t>
+            </w:r>
+            <w:r>
+              <w:rPr>
+                <w:rStyle w:val="VerbatimChar"/>
+              </w:rPr>
+              <w:t xml:space="preserve">Claim.insurance.preAuthRef</w:t>
+            </w:r>
+            <w:r>
+              <w:t xml:space="preserve"> </w:t>
+            </w:r>
+            <w:r>
+              <w:t xml:space="preserve">for the authorization number. Preserve payer-specific validity and service limits.</w:t>
+            </w:r>
+          </w:p>
+        </w:tc>
+      </w:tr>
+      <w:tr>
+        <w:trPr>
+          <w:cantSplit/>
+        </w:trPr>
+        <w:tc>
+          <w:tcPr/>
+          <w:p>
+            <w:pPr>
+              <w:pStyle w:val="Compact"/>
+              <w:jc w:val="left"/>
+            </w:pPr>
+            <w:r>
               <w:t xml:space="preserve">Aging and SLA</w:t>
             </w:r>
           </w:p>
@@ -4172,22 +4305,21 @@
               <w:t xml:space="preserve"> </w:t>
             </w:r>
             <w:r>
-              <w:t xml:space="preserve">may reflect unrelated edits. Use the Medplum</w:t>
-            </w:r>
-            <w:r>
-              <w:t xml:space="preserve"> </w:t>
-            </w:r>
-            <w:r>
-              <w:rPr>
-                <w:rStyle w:val="VerbatimChar"/>
-              </w:rPr>
-              <w:t xml:space="preserve">restriction.period</w:t>
-            </w:r>
-            <w:r>
-              <w:t xml:space="preserve"> </w:t>
-            </w:r>
-            <w:r>
-              <w:t xml:space="preserve">planned-date convention for deadlines, with range-aware search and a defined pause policy.</w:t>
+              <w:t xml:space="preserve">may reflect unrelated edits. Follow the</w:t>
+            </w:r>
+            <w:r>
+              <w:t xml:space="preserve"> </w:t>
+            </w:r>
+            <w:hyperlink r:id="rId27">
+              <w:r>
+                <w:rPr>
+                  <w:rStyle w:val="Hyperlink"/>
+                </w:rPr>
+                <w:t xml:space="preserve">Task planned-date convention</w:t>
+              </w:r>
+            </w:hyperlink>
+            <w:r>
+              <w:t xml:space="preserve">, range-aware search, and a defined pause policy.</w:t>
             </w:r>
           </w:p>
         </w:tc>
@@ -4200,8 +4332,8 @@
         </w:pict>
       </w:r>
     </w:p>
-    <w:bookmarkEnd w:id="36"/>
-    <w:bookmarkStart w:id="37" w:name="lifecycle-businessstatus-codesystem"/>
+    <w:bookmarkEnd w:id="28"/>
+    <w:bookmarkStart w:id="29" w:name="lifecycle-businessstatus-codesystem"/>
     <w:p>
       <w:pPr>
         <w:pStyle w:val="Heading4"/>
@@ -4224,43 +4356,43 @@
       </w:pPr>
       <w:r>
         <w:rPr>
+          <w:b/>
           <w:bCs/>
-          <w:b/>
         </w:rPr>
         <w:t xml:space="preserve">Questions:</w:t>
       </w:r>
     </w:p>
     <w:p>
       <w:pPr>
+        <w:pStyle w:val="Compact"/>
         <w:numPr>
           <w:ilvl w:val="0"/>
           <w:numId w:val="1012"/>
         </w:numPr>
+      </w:pPr>
+      <w:r>
+        <w:t xml:space="preserve">Which milestones matter enough to show and operate on (e.g. sent, accepted, scheduled, declined, unable to schedule, completed, cancelled)? Which updates must reach the referrer?</w:t>
+      </w:r>
+    </w:p>
+    <w:p>
+      <w:pPr>
         <w:pStyle w:val="Compact"/>
-      </w:pPr>
-      <w:r>
-        <w:t xml:space="preserve">Which milestones matter enough to show and operate on (e.g. sent, accepted, scheduled, completed, cancelled)?</w:t>
-      </w:r>
-    </w:p>
-    <w:p>
-      <w:pPr>
         <w:numPr>
           <w:ilvl w:val="0"/>
           <w:numId w:val="1012"/>
         </w:numPr>
+      </w:pPr>
+      <w:r>
+        <w:t xml:space="preserve">How do you standardize labels for those milestones so reports, queues, and integrations all use the same meanings?</w:t>
+      </w:r>
+    </w:p>
+    <w:p>
+      <w:pPr>
         <w:pStyle w:val="Compact"/>
-      </w:pPr>
-      <w:r>
-        <w:t xml:space="preserve">How do you standardize labels for those milestones so reports, queues, and integrations all use the same meanings?</w:t>
-      </w:r>
-    </w:p>
-    <w:p>
-      <w:pPr>
         <w:numPr>
           <w:ilvl w:val="0"/>
           <w:numId w:val="1012"/>
         </w:numPr>
-        <w:pStyle w:val="Compact"/>
       </w:pPr>
       <w:r>
         <w:t xml:space="preserve">If a referral is cancelled or the recipient changes, do you revise the existing referral or create a new one?</w:t>
@@ -4270,9 +4402,8 @@
       <w:tblPr>
         <w:tblStyle w:val="Table"/>
         <w:tblW w:w="9360" w:type="dxa"/>
+        <w:tblLayout w:type="fixed"/>
         <w:tblLook w:firstRow="1" w:lastRow="0" w:firstColumn="0" w:lastColumn="0" w:noHBand="0" w:noVBand="0" w:val="0020"/>
-        <w:jc w:val="start"/>
-        <w:tblLayout w:type="fixed"/>
       </w:tblPr>
       <w:tblGrid>
         <w:gridCol w:w="2987"/>
@@ -4281,7 +4412,7 @@
       <w:tr>
         <w:trPr>
           <w:cantSplit/>
-          <w:tblHeader w:val="true"/>
+          <w:tblHeader w:val="on"/>
         </w:trPr>
         <w:tc>
           <w:tcPr/>
@@ -4463,8 +4594,8 @@
         </w:pict>
       </w:r>
     </w:p>
-    <w:bookmarkEnd w:id="37"/>
-    <w:bookmarkStart w:id="38" w:name="results-closure-round-trip"/>
+    <w:bookmarkEnd w:id="29"/>
+    <w:bookmarkStart w:id="30" w:name="results-closure-round-trip"/>
     <w:p>
       <w:pPr>
         <w:pStyle w:val="Heading4"/>
@@ -4487,43 +4618,43 @@
       </w:pPr>
       <w:r>
         <w:rPr>
+          <w:b/>
           <w:bCs/>
-          <w:b/>
         </w:rPr>
         <w:t xml:space="preserve">Questions:</w:t>
       </w:r>
     </w:p>
     <w:p>
       <w:pPr>
+        <w:pStyle w:val="Compact"/>
         <w:numPr>
           <w:ilvl w:val="0"/>
           <w:numId w:val="1013"/>
         </w:numPr>
+      </w:pPr>
+      <w:r>
+        <w:t xml:space="preserve">After the referral goes out, what do you expect back – structured results (e.g. labs or imaging), a consult or visit summary, documents or letters, several of those, or nothing beyond tracking the referral itself?</w:t>
+      </w:r>
+    </w:p>
+    <w:p>
+      <w:pPr>
         <w:pStyle w:val="Compact"/>
-      </w:pPr>
-      <w:r>
-        <w:t xml:space="preserve">After the referral goes out, what do you expect back – structured results (e.g. labs or imaging), a consult or visit summary, documents or letters, several of those, or nothing beyond tracking the referral itself?</w:t>
-      </w:r>
-    </w:p>
-    <w:p>
-      <w:pPr>
         <w:numPr>
           <w:ilvl w:val="0"/>
           <w:numId w:val="1013"/>
         </w:numPr>
+      </w:pPr>
+      <w:r>
+        <w:t xml:space="preserve">When results or documents arrive, how do you attach them to the correct referral – including when human confirmation is needed?</w:t>
+      </w:r>
+    </w:p>
+    <w:p>
+      <w:pPr>
         <w:pStyle w:val="Compact"/>
-      </w:pPr>
-      <w:r>
-        <w:t xml:space="preserve">When results or documents arrive, how do you attach them to the correct referral – including when human confirmation is needed?</w:t>
-      </w:r>
-    </w:p>
-    <w:p>
-      <w:pPr>
         <w:numPr>
           <w:ilvl w:val="0"/>
           <w:numId w:val="1013"/>
         </w:numPr>
-        <w:pStyle w:val="Compact"/>
       </w:pPr>
       <w:r>
         <w:t xml:space="preserve">What marks the referral complete for your operations – the referring organization, the receiving one, both, or different definitions for each?</w:t>
@@ -4533,9 +4664,8 @@
       <w:tblPr>
         <w:tblStyle w:val="Table"/>
         <w:tblW w:w="9360" w:type="dxa"/>
+        <w:tblLayout w:type="fixed"/>
         <w:tblLook w:firstRow="1" w:lastRow="0" w:firstColumn="0" w:lastColumn="0" w:noHBand="0" w:noVBand="0" w:val="0020"/>
-        <w:jc w:val="start"/>
-        <w:tblLayout w:type="fixed"/>
       </w:tblPr>
       <w:tblGrid>
         <w:gridCol w:w="3696"/>
@@ -4544,7 +4674,7 @@
       <w:tr>
         <w:trPr>
           <w:cantSplit/>
-          <w:tblHeader w:val="true"/>
+          <w:tblHeader w:val="on"/>
         </w:trPr>
         <w:tc>
           <w:tcPr/>
@@ -4837,10 +4967,10 @@
         </w:tc>
       </w:tr>
     </w:tbl>
-    <w:bookmarkEnd w:id="38"/>
-    <w:bookmarkEnd w:id="39"/>
-    <w:bookmarkEnd w:id="40"/>
-    <w:bookmarkStart w:id="49" w:name="implementation-guides"/>
+    <w:bookmarkEnd w:id="30"/>
+    <w:bookmarkEnd w:id="31"/>
+    <w:bookmarkEnd w:id="32"/>
+    <w:bookmarkStart w:id="41" w:name="implementation-guides"/>
     <w:p>
       <w:pPr>
         <w:pStyle w:val="Heading2"/>
@@ -4859,13 +4989,13 @@
     </w:p>
     <w:p>
       <w:pPr>
+        <w:pStyle w:val="Compact"/>
         <w:numPr>
           <w:ilvl w:val="0"/>
           <w:numId w:val="1014"/>
         </w:numPr>
-        <w:pStyle w:val="Compact"/>
-      </w:pPr>
-      <w:hyperlink r:id="rId41">
+      </w:pPr>
+      <w:hyperlink r:id="rId33">
         <w:r>
           <w:rPr>
             <w:rStyle w:val="Hyperlink"/>
@@ -4876,13 +5006,13 @@
     </w:p>
     <w:p>
       <w:pPr>
+        <w:pStyle w:val="Compact"/>
         <w:numPr>
           <w:ilvl w:val="0"/>
           <w:numId w:val="1014"/>
         </w:numPr>
-        <w:pStyle w:val="Compact"/>
-      </w:pPr>
-      <w:hyperlink r:id="rId42">
+      </w:pPr>
+      <w:hyperlink r:id="rId34">
         <w:r>
           <w:rPr>
             <w:rStyle w:val="Hyperlink"/>
@@ -4893,13 +5023,13 @@
     </w:p>
     <w:p>
       <w:pPr>
+        <w:pStyle w:val="Compact"/>
         <w:numPr>
           <w:ilvl w:val="0"/>
           <w:numId w:val="1014"/>
         </w:numPr>
-        <w:pStyle w:val="Compact"/>
-      </w:pPr>
-      <w:hyperlink r:id="rId43">
+      </w:pPr>
+      <w:hyperlink r:id="rId35">
         <w:r>
           <w:rPr>
             <w:rStyle w:val="Hyperlink"/>
@@ -4910,13 +5040,13 @@
     </w:p>
     <w:p>
       <w:pPr>
+        <w:pStyle w:val="Compact"/>
         <w:numPr>
           <w:ilvl w:val="0"/>
           <w:numId w:val="1014"/>
         </w:numPr>
-        <w:pStyle w:val="Compact"/>
-      </w:pPr>
-      <w:hyperlink r:id="rId44">
+      </w:pPr>
+      <w:hyperlink r:id="rId36">
         <w:r>
           <w:rPr>
             <w:rStyle w:val="Hyperlink"/>
@@ -4927,13 +5057,13 @@
     </w:p>
     <w:p>
       <w:pPr>
+        <w:pStyle w:val="Compact"/>
         <w:numPr>
           <w:ilvl w:val="0"/>
           <w:numId w:val="1014"/>
         </w:numPr>
-        <w:pStyle w:val="Compact"/>
-      </w:pPr>
-      <w:hyperlink r:id="rId45">
+      </w:pPr>
+      <w:hyperlink r:id="rId37">
         <w:r>
           <w:rPr>
             <w:rStyle w:val="Hyperlink"/>
@@ -4944,13 +5074,13 @@
     </w:p>
     <w:p>
       <w:pPr>
+        <w:pStyle w:val="Compact"/>
         <w:numPr>
           <w:ilvl w:val="0"/>
           <w:numId w:val="1014"/>
         </w:numPr>
-        <w:pStyle w:val="Compact"/>
-      </w:pPr>
-      <w:hyperlink r:id="rId46">
+      </w:pPr>
+      <w:hyperlink r:id="rId38">
         <w:r>
           <w:rPr>
             <w:rStyle w:val="Hyperlink"/>
@@ -4961,13 +5091,13 @@
     </w:p>
     <w:p>
       <w:pPr>
+        <w:pStyle w:val="Compact"/>
         <w:numPr>
           <w:ilvl w:val="0"/>
           <w:numId w:val="1014"/>
         </w:numPr>
-        <w:pStyle w:val="Compact"/>
-      </w:pPr>
-      <w:hyperlink r:id="rId47">
+      </w:pPr>
+      <w:hyperlink r:id="rId39">
         <w:r>
           <w:rPr>
             <w:rStyle w:val="Hyperlink"/>
@@ -4986,7 +5116,7 @@
       <w:r>
         <w:t xml:space="preserve"> </w:t>
       </w:r>
-      <w:hyperlink r:id="rId48">
+      <w:hyperlink r:id="rId40">
         <w:r>
           <w:rPr>
             <w:rStyle w:val="Hyperlink"/>
@@ -4998,8 +5128,8 @@
         <w:t xml:space="preserve">.</w:t>
       </w:r>
     </w:p>
-    <w:bookmarkEnd w:id="49"/>
-    <w:bookmarkEnd w:id="50"/>
+    <w:bookmarkEnd w:id="41"/>
+    <w:bookmarkEnd w:id="42"/>
     <w:sectPr>
       <w:pgSz w:h="15840" w:w="12240"/>
       <w:pgMar w:bottom="1440" w:footer="720" w:gutter="0" w:header="720" w:left="1440" w:right="1440" w:top="1440"/>
@@ -5037,14 +5167,14 @@
 <file path=word/numbering.xml><?xml version="1.0" encoding="utf-8"?>
 <w:numbering xmlns:w="http://schemas.openxmlformats.org/wordprocessingml/2006/main">
   <w:abstractNum w:abstractNumId="990">
-    <w:nsid w:val="A990"/>
+    <w:nsid w:val="0000A990"/>
     <w:multiLevelType w:val="multilevel"/>
     <w:lvl w:ilvl="0">
       <w:numFmt w:val="bullet"/>
       <w:lvlText w:val=" "/>
       <w:lvlJc w:val="left"/>
       <w:pPr>
-        <w:ind w:left="720" w:hanging="480"/>
+        <w:ind w:left="720" w:hanging="360"/>
       </w:pPr>
     </w:lvl>
     <w:lvl w:ilvl="1">
@@ -5052,7 +5182,7 @@
       <w:lvlText w:val=" "/>
       <w:lvlJc w:val="left"/>
       <w:pPr>
-        <w:ind w:left="1440" w:hanging="480"/>
+        <w:ind w:left="1440" w:hanging="360"/>
       </w:pPr>
     </w:lvl>
     <w:lvl w:ilvl="2">
@@ -5060,7 +5190,7 @@
       <w:lvlText w:val=" "/>
       <w:lvlJc w:val="left"/>
       <w:pPr>
-        <w:ind w:left="2160" w:hanging="480"/>
+        <w:ind w:left="2160" w:hanging="360"/>
       </w:pPr>
     </w:lvl>
     <w:lvl w:ilvl="3">
@@ -5068,7 +5198,7 @@
       <w:lvlText w:val=" "/>
       <w:lvlJc w:val="left"/>
       <w:pPr>
-        <w:ind w:left="2880" w:hanging="480"/>
+        <w:ind w:left="2880" w:hanging="360"/>
       </w:pPr>
     </w:lvl>
     <w:lvl w:ilvl="4">
@@ -5076,7 +5206,7 @@
       <w:lvlText w:val=" "/>
       <w:lvlJc w:val="left"/>
       <w:pPr>
-        <w:ind w:left="3600" w:hanging="480"/>
+        <w:ind w:left="3600" w:hanging="360"/>
       </w:pPr>
     </w:lvl>
     <w:lvl w:ilvl="5">
@@ -5084,7 +5214,7 @@
       <w:lvlText w:val=" "/>
       <w:lvlJc w:val="left"/>
       <w:pPr>
-        <w:ind w:left="4320" w:hanging="480"/>
+        <w:ind w:left="4320" w:hanging="360"/>
       </w:pPr>
     </w:lvl>
     <w:lvl w:ilvl="6">
@@ -5092,7 +5222,7 @@
       <w:lvlText w:val=" "/>
       <w:lvlJc w:val="left"/>
       <w:pPr>
-        <w:ind w:left="5040" w:hanging="480"/>
+        <w:ind w:left="5040" w:hanging="360"/>
       </w:pPr>
     </w:lvl>
     <w:lvl w:ilvl="7">
@@ -5100,7 +5230,7 @@
       <w:lvlText w:val=" "/>
       <w:lvlJc w:val="left"/>
       <w:pPr>
-        <w:ind w:left="5760" w:hanging="480"/>
+        <w:ind w:left="5760" w:hanging="360"/>
       </w:pPr>
     </w:lvl>
     <w:lvl w:ilvl="8">
@@ -5108,84 +5238,111 @@
       <w:lvlText w:val=" "/>
       <w:lvlJc w:val="left"/>
       <w:pPr>
-        <w:ind w:left="6480" w:hanging="480"/>
+        <w:ind w:left="6480" w:hanging="360"/>
       </w:pPr>
     </w:lvl>
   </w:abstractNum>
   <w:abstractNum w:abstractNumId="991">
-    <w:nsid w:val="A991"/>
+    <w:nsid w:val="0000A991"/>
     <w:multiLevelType w:val="multilevel"/>
     <w:lvl w:ilvl="0">
       <w:numFmt w:val="bullet"/>
-      <w:lvlText w:val="•"/>
+      <w:lvlText w:val=""/>
       <w:lvlJc w:val="left"/>
       <w:pPr>
-        <w:ind w:left="720" w:hanging="480"/>
-      </w:pPr>
+        <w:ind w:left="720" w:hanging="360"/>
+      </w:pPr>
+      <w:rPr>
+        <w:rFonts w:ascii="Symbol" w:hAnsi="Symbol" w:cs="Symbol" w:hint="default"/>
+      </w:rPr>
     </w:lvl>
     <w:lvl w:ilvl="1">
       <w:numFmt w:val="bullet"/>
-      <w:lvlText w:val="–"/>
+      <w:lvlText w:val="o"/>
       <w:lvlJc w:val="left"/>
       <w:pPr>
-        <w:ind w:left="1440" w:hanging="480"/>
-      </w:pPr>
+        <w:ind w:left="1440" w:hanging="360"/>
+      </w:pPr>
+      <w:rPr>
+        <w:rFonts w:ascii="Courier New" w:hAnsi="Courier New" w:cs="Courier New" w:hint="default"/>
+      </w:rPr>
     </w:lvl>
     <w:lvl w:ilvl="2">
       <w:numFmt w:val="bullet"/>
-      <w:lvlText w:val="•"/>
+      <w:lvlText w:val=""/>
       <w:lvlJc w:val="left"/>
       <w:pPr>
-        <w:ind w:left="2160" w:hanging="480"/>
-      </w:pPr>
+        <w:ind w:left="2160" w:hanging="360"/>
+      </w:pPr>
+      <w:rPr>
+        <w:rFonts w:ascii="Wingdings" w:hAnsi="Wingdings" w:cs="Wingdings" w:hint="default"/>
+      </w:rPr>
     </w:lvl>
     <w:lvl w:ilvl="3">
       <w:numFmt w:val="bullet"/>
-      <w:lvlText w:val="–"/>
+      <w:lvlText w:val=""/>
       <w:lvlJc w:val="left"/>
       <w:pPr>
-        <w:ind w:left="2880" w:hanging="480"/>
-      </w:pPr>
+        <w:ind w:left="2880" w:hanging="360"/>
+      </w:pPr>
+      <w:rPr>
+        <w:rFonts w:ascii="Symbol" w:hAnsi="Symbol" w:cs="Symbol" w:hint="default"/>
+      </w:rPr>
     </w:lvl>
     <w:lvl w:ilvl="4">
       <w:numFmt w:val="bullet"/>
-      <w:lvlText w:val="•"/>
+      <w:lvlText w:val="o"/>
       <w:lvlJc w:val="left"/>
       <w:pPr>
-        <w:ind w:left="3600" w:hanging="480"/>
-      </w:pPr>
+        <w:ind w:left="3600" w:hanging="360"/>
+      </w:pPr>
+      <w:rPr>
+        <w:rFonts w:ascii="Courier New" w:hAnsi="Courier New" w:cs="Courier New" w:hint="default"/>
+      </w:rPr>
     </w:lvl>
     <w:lvl w:ilvl="5">
       <w:numFmt w:val="bullet"/>
-      <w:lvlText w:val="–"/>
+      <w:lvlText w:val=""/>
       <w:lvlJc w:val="left"/>
       <w:pPr>
-        <w:ind w:left="4320" w:hanging="480"/>
-      </w:pPr>
+        <w:ind w:left="4320" w:hanging="360"/>
+      </w:pPr>
+      <w:rPr>
+        <w:rFonts w:ascii="Wingdings" w:hAnsi="Wingdings" w:cs="Wingdings" w:hint="default"/>
+      </w:rPr>
     </w:lvl>
     <w:lvl w:ilvl="6">
       <w:numFmt w:val="bullet"/>
-      <w:lvlText w:val="•"/>
+      <w:lvlText w:val=""/>
       <w:lvlJc w:val="left"/>
       <w:pPr>
-        <w:ind w:left="5040" w:hanging="480"/>
-      </w:pPr>
+        <w:ind w:left="5040" w:hanging="360"/>
+      </w:pPr>
+      <w:rPr>
+        <w:rFonts w:ascii="Symbol" w:hAnsi="Symbol" w:cs="Symbol" w:hint="default"/>
+      </w:rPr>
     </w:lvl>
     <w:lvl w:ilvl="7">
       <w:numFmt w:val="bullet"/>
-      <w:lvlText w:val="–"/>
+      <w:lvlText w:val="o"/>
       <w:lvlJc w:val="left"/>
       <w:pPr>
-        <w:ind w:left="5760" w:hanging="480"/>
-      </w:pPr>
+        <w:ind w:left="5760" w:hanging="360"/>
+      </w:pPr>
+      <w:rPr>
+        <w:rFonts w:ascii="Courier New" w:hAnsi="Courier New" w:cs="Courier New" w:hint="default"/>
+      </w:rPr>
     </w:lvl>
     <w:lvl w:ilvl="8">
       <w:numFmt w:val="bullet"/>
-      <w:lvlText w:val="•"/>
+      <w:lvlText w:val=""/>
       <w:lvlJc w:val="left"/>
       <w:pPr>
-        <w:ind w:left="6480" w:hanging="480"/>
-      </w:pPr>
+        <w:ind w:left="6480" w:hanging="360"/>
+      </w:pPr>
+      <w:rPr>
+        <w:rFonts w:ascii="Wingdings" w:hAnsi="Wingdings" w:cs="Wingdings" w:hint="default"/>
+      </w:rPr>
     </w:lvl>
   </w:abstractNum>
   <w:num w:numId="1000">
@@ -5912,8 +6069,8 @@
     <w:name w:val="KeywordTok"/>
     <w:basedOn w:val="VerbatimChar"/>
     <w:rPr>
+      <w:b/>
       <w:color w:val="007020"/>
-      <w:b/>
     </w:rPr>
   </w:style>
   <w:style w:type="character" w:customStyle="1" w:styleId="DataTypeTok">
@@ -5990,42 +6147,42 @@
     <w:name w:val="ImportTok"/>
     <w:basedOn w:val="VerbatimChar"/>
     <w:rPr>
+      <w:b/>
       <w:color w:val="008000"/>
-      <w:b/>
     </w:rPr>
   </w:style>
   <w:style w:type="character" w:customStyle="1" w:styleId="CommentTok">
     <w:name w:val="CommentTok"/>
     <w:basedOn w:val="VerbatimChar"/>
     <w:rPr>
+      <w:i/>
       <w:color w:val="60a0b0"/>
-      <w:i/>
     </w:rPr>
   </w:style>
   <w:style w:type="character" w:customStyle="1" w:styleId="DocumentationTok">
     <w:name w:val="DocumentationTok"/>
     <w:basedOn w:val="VerbatimChar"/>
     <w:rPr>
+      <w:i/>
       <w:color w:val="ba2121"/>
-      <w:i/>
     </w:rPr>
   </w:style>
   <w:style w:type="character" w:customStyle="1" w:styleId="AnnotationTok">
     <w:name w:val="AnnotationTok"/>
     <w:basedOn w:val="VerbatimChar"/>
     <w:rPr>
-      <w:color w:val="60a0b0"/>
       <w:b/>
       <w:i/>
+      <w:color w:val="60a0b0"/>
     </w:rPr>
   </w:style>
   <w:style w:type="character" w:customStyle="1" w:styleId="CommentVarTok">
     <w:name w:val="CommentVarTok"/>
     <w:basedOn w:val="VerbatimChar"/>
     <w:rPr>
-      <w:color w:val="60a0b0"/>
       <w:b/>
       <w:i/>
+      <w:color w:val="60a0b0"/>
     </w:rPr>
   </w:style>
   <w:style w:type="character" w:customStyle="1" w:styleId="OtherTok">
@@ -6053,8 +6210,8 @@
     <w:name w:val="ControlFlowTok"/>
     <w:basedOn w:val="VerbatimChar"/>
     <w:rPr>
+      <w:b/>
       <w:color w:val="007020"/>
-      <w:b/>
     </w:rPr>
   </w:style>
   <w:style w:type="character" w:customStyle="1" w:styleId="OperatorTok">
@@ -6099,34 +6256,34 @@
     <w:name w:val="InformationTok"/>
     <w:basedOn w:val="VerbatimChar"/>
     <w:rPr>
-      <w:color w:val="60a0b0"/>
       <w:b/>
       <w:i/>
+      <w:color w:val="60a0b0"/>
     </w:rPr>
   </w:style>
   <w:style w:type="character" w:customStyle="1" w:styleId="WarningTok">
     <w:name w:val="WarningTok"/>
     <w:basedOn w:val="VerbatimChar"/>
     <w:rPr>
-      <w:color w:val="60a0b0"/>
       <w:b/>
       <w:i/>
+      <w:color w:val="60a0b0"/>
     </w:rPr>
   </w:style>
   <w:style w:type="character" w:customStyle="1" w:styleId="AlertTok">
     <w:name w:val="AlertTok"/>
     <w:basedOn w:val="VerbatimChar"/>
     <w:rPr>
+      <w:b/>
       <w:color w:val="ff0000"/>
-      <w:b/>
     </w:rPr>
   </w:style>
   <w:style w:type="character" w:customStyle="1" w:styleId="ErrorTok">
     <w:name w:val="ErrorTok"/>
     <w:basedOn w:val="VerbatimChar"/>
     <w:rPr>
+      <w:b/>
       <w:color w:val="ff0000"/>
-      <w:b/>
     </w:rPr>
   </w:style>
   <w:style w:type="character" w:customStyle="1" w:styleId="NormalTok">

</xml_diff>